<commit_message>
fix: close E0 gaps G-LG-2 (split parity) and G-PF-3 (iOS handler leak)
- web split.ts: non-last members now use floor division, matching the
  native remainder-to-last algorithm exactly; verified 11 odd-amount
  batches produce per-member-identical shares vs the native algorithm
  (esbuild-compiled real split.ts), totals conserved, nets sum to zero
- iOS MeshBus: single handler per kind + tag-keyed peer observers,
  replacing append-accumulation; matches Android MeshBus.kt semantics
- requirements docs: erratum for G-LG-2/KI-3 (totals were never off by
  1 cent — the divergence was per-member rounding only), statuses
  updated, affected .docx regenerated and re-validated
</commit_message>
<xml_diff>
--- a/docs/requirements/TrailMate-Gap分析与演进规划-v1.0.docx
+++ b/docs/requirements/TrailMate-Gap分析与演进规划-v1.0.docx
@@ -2765,10 +2765,10 @@
         </w:tblBorders>
       </w:tblPr>
       <w:tblGrid>
-        <w:gridCol w:w="778"/>
-        <w:gridCol w:w="1854"/>
-        <w:gridCol w:w="5082"/>
-        <w:gridCol w:w="898"/>
+        <w:gridCol w:w="748"/>
+        <w:gridCol w:w="2948"/>
+        <w:gridCol w:w="4168"/>
+        <w:gridCol w:w="748"/>
         <w:gridCol w:w="748"/>
       </w:tblGrid>
       <w:tr>
@@ -2777,7 +2777,7 @@
         </w:trPr>
         <w:tc>
           <w:tcPr>
-            <w:tcW w:type="dxa" w:w="778"/>
+            <w:tcW w:type="dxa" w:w="748"/>
             <w:tcBorders>
               <w:top w:val="single" w:color="BBBBBB" w:sz="1"/>
               <w:left w:val="single" w:color="BBBBBB" w:sz="1"/>
@@ -2804,7 +2804,7 @@
         </w:tc>
         <w:tc>
           <w:tcPr>
-            <w:tcW w:type="dxa" w:w="1854"/>
+            <w:tcW w:type="dxa" w:w="2948"/>
             <w:tcBorders>
               <w:top w:val="single" w:color="BBBBBB" w:sz="1"/>
               <w:left w:val="single" w:color="BBBBBB" w:sz="1"/>
@@ -2831,7 +2831,7 @@
         </w:tc>
         <w:tc>
           <w:tcPr>
-            <w:tcW w:type="dxa" w:w="5082"/>
+            <w:tcW w:type="dxa" w:w="4168"/>
             <w:tcBorders>
               <w:top w:val="single" w:color="BBBBBB" w:sz="1"/>
               <w:left w:val="single" w:color="BBBBBB" w:sz="1"/>
@@ -2858,7 +2858,7 @@
         </w:tc>
         <w:tc>
           <w:tcPr>
-            <w:tcW w:type="dxa" w:w="898"/>
+            <w:tcW w:type="dxa" w:w="748"/>
             <w:tcBorders>
               <w:top w:val="single" w:color="BBBBBB" w:sz="1"/>
               <w:left w:val="single" w:color="BBBBBB" w:sz="1"/>
@@ -2917,7 +2917,7 @@
         </w:trPr>
         <w:tc>
           <w:tcPr>
-            <w:tcW w:type="dxa" w:w="778"/>
+            <w:tcW w:type="dxa" w:w="748"/>
             <w:tcBorders>
               <w:top w:val="single" w:color="BBBBBB" w:sz="1"/>
               <w:left w:val="single" w:color="BBBBBB" w:sz="1"/>
@@ -2939,7 +2939,7 @@
         </w:tc>
         <w:tc>
           <w:tcPr>
-            <w:tcW w:type="dxa" w:w="1854"/>
+            <w:tcW w:type="dxa" w:w="2948"/>
             <w:tcBorders>
               <w:top w:val="single" w:color="BBBBBB" w:sz="1"/>
               <w:left w:val="single" w:color="BBBBBB" w:sz="1"/>
@@ -2961,7 +2961,7 @@
         </w:tc>
         <w:tc>
           <w:tcPr>
-            <w:tcW w:type="dxa" w:w="5082"/>
+            <w:tcW w:type="dxa" w:w="4168"/>
             <w:tcBorders>
               <w:top w:val="single" w:color="BBBBBB" w:sz="1"/>
               <w:left w:val="single" w:color="BBBBBB" w:sz="1"/>
@@ -2983,7 +2983,7 @@
         </w:tc>
         <w:tc>
           <w:tcPr>
-            <w:tcW w:type="dxa" w:w="898"/>
+            <w:tcW w:type="dxa" w:w="748"/>
             <w:tcBorders>
               <w:top w:val="single" w:color="BBBBBB" w:sz="1"/>
               <w:left w:val="single" w:color="BBBBBB" w:sz="1"/>
@@ -3032,7 +3032,7 @@
         </w:trPr>
         <w:tc>
           <w:tcPr>
-            <w:tcW w:type="dxa" w:w="778"/>
+            <w:tcW w:type="dxa" w:w="748"/>
             <w:tcBorders>
               <w:top w:val="single" w:color="BBBBBB" w:sz="1"/>
               <w:left w:val="single" w:color="BBBBBB" w:sz="1"/>
@@ -3054,51 +3054,51 @@
         </w:tc>
         <w:tc>
           <w:tcPr>
-            <w:tcW w:type="dxa" w:w="1854"/>
-            <w:tcBorders>
-              <w:top w:val="single" w:color="BBBBBB" w:sz="1"/>
-              <w:left w:val="single" w:color="BBBBBB" w:sz="1"/>
-              <w:bottom w:val="single" w:color="BBBBBB" w:sz="1"/>
-              <w:right w:val="single" w:color="BBBBBB" w:sz="1"/>
-            </w:tcBorders>
-            <w:tcMar>
-              <w:top w:type="dxa" w:w="60"/>
-              <w:left w:type="dxa" w:w="100"/>
-              <w:bottom w:type="dxa" w:w="60"/>
-              <w:right w:type="dxa" w:w="100"/>
-            </w:tcMar>
-          </w:tcPr>
-          <w:p>
-            <w:r>
-              <w:t xml:space="preserve">Web 摊分与原生差 1 分</w:t>
-            </w:r>
-          </w:p>
-        </w:tc>
-        <w:tc>
-          <w:tcPr>
-            <w:tcW w:type="dxa" w:w="5082"/>
-            <w:tcBorders>
-              <w:top w:val="single" w:color="BBBBBB" w:sz="1"/>
-              <w:left w:val="single" w:color="BBBBBB" w:sz="1"/>
-              <w:bottom w:val="single" w:color="BBBBBB" w:sz="1"/>
-              <w:right w:val="single" w:color="BBBBBB" w:sz="1"/>
-            </w:tcBorders>
-            <w:tcMar>
-              <w:top w:type="dxa" w:w="60"/>
-              <w:left w:type="dxa" w:w="100"/>
-              <w:bottom w:type="dxa" w:w="60"/>
-              <w:right w:type="dxa" w:w="100"/>
-            </w:tcMar>
-          </w:tcPr>
-          <w:p>
-            <w:r>
-              <w:t xml:space="preserve">split.ts:38 逐人 Math.round（①FR-4.4，附录 B #3）</w:t>
-            </w:r>
-          </w:p>
-        </w:tc>
-        <w:tc>
-          <w:tcPr>
-            <w:tcW w:type="dxa" w:w="898"/>
+            <w:tcW w:type="dxa" w:w="2948"/>
+            <w:tcBorders>
+              <w:top w:val="single" w:color="BBBBBB" w:sz="1"/>
+              <w:left w:val="single" w:color="BBBBBB" w:sz="1"/>
+              <w:bottom w:val="single" w:color="BBBBBB" w:sz="1"/>
+              <w:right w:val="single" w:color="BBBBBB" w:sz="1"/>
+            </w:tcBorders>
+            <w:tcMar>
+              <w:top w:type="dxa" w:w="60"/>
+              <w:left w:type="dxa" w:w="100"/>
+              <w:bottom w:type="dxa" w:w="60"/>
+              <w:right w:type="dxa" w:w="100"/>
+            </w:tcMar>
+          </w:tcPr>
+          <w:p>
+            <w:r>
+              <w:t xml:space="preserve">Web 摊分逐人金额与原生不一致（勘误：总额守恒，差异仅在非末位取整）</w:t>
+            </w:r>
+          </w:p>
+        </w:tc>
+        <w:tc>
+          <w:tcPr>
+            <w:tcW w:type="dxa" w:w="4168"/>
+            <w:tcBorders>
+              <w:top w:val="single" w:color="BBBBBB" w:sz="1"/>
+              <w:left w:val="single" w:color="BBBBBB" w:sz="1"/>
+              <w:bottom w:val="single" w:color="BBBBBB" w:sz="1"/>
+              <w:right w:val="single" w:color="BBBBBB" w:sz="1"/>
+            </w:tcBorders>
+            <w:tcMar>
+              <w:top w:type="dxa" w:w="60"/>
+              <w:left w:type="dxa" w:w="100"/>
+              <w:bottom w:type="dxa" w:w="60"/>
+              <w:right w:type="dxa" w:w="100"/>
+            </w:tcMar>
+          </w:tcPr>
+          <w:p>
+            <w:r>
+              <w:t xml:space="preserve">split.ts 非末位曾用 Math.round，原生整除（①FR-4.4，附录 B #3 勘误）</w:t>
+            </w:r>
+          </w:p>
+        </w:tc>
+        <w:tc>
+          <w:tcPr>
+            <w:tcW w:type="dxa" w:w="748"/>
             <w:tcBorders>
               <w:top w:val="single" w:color="BBBBBB" w:sz="1"/>
               <w:left w:val="single" w:color="BBBBBB" w:sz="1"/>
@@ -3147,7 +3147,7 @@
         </w:trPr>
         <w:tc>
           <w:tcPr>
-            <w:tcW w:type="dxa" w:w="778"/>
+            <w:tcW w:type="dxa" w:w="748"/>
             <w:tcBorders>
               <w:top w:val="single" w:color="BBBBBB" w:sz="1"/>
               <w:left w:val="single" w:color="BBBBBB" w:sz="1"/>
@@ -3169,7 +3169,7 @@
         </w:tc>
         <w:tc>
           <w:tcPr>
-            <w:tcW w:type="dxa" w:w="1854"/>
+            <w:tcW w:type="dxa" w:w="2948"/>
             <w:tcBorders>
               <w:top w:val="single" w:color="BBBBBB" w:sz="1"/>
               <w:left w:val="single" w:color="BBBBBB" w:sz="1"/>
@@ -3191,7 +3191,7 @@
         </w:tc>
         <w:tc>
           <w:tcPr>
-            <w:tcW w:type="dxa" w:w="5082"/>
+            <w:tcW w:type="dxa" w:w="4168"/>
             <w:tcBorders>
               <w:top w:val="single" w:color="BBBBBB" w:sz="1"/>
               <w:left w:val="single" w:color="BBBBBB" w:sz="1"/>
@@ -3213,7 +3213,7 @@
         </w:tc>
         <w:tc>
           <w:tcPr>
-            <w:tcW w:type="dxa" w:w="898"/>
+            <w:tcW w:type="dxa" w:w="748"/>
             <w:tcBorders>
               <w:top w:val="single" w:color="BBBBBB" w:sz="1"/>
               <w:left w:val="single" w:color="BBBBBB" w:sz="1"/>
@@ -8529,12 +8529,12 @@
         </w:tblBorders>
       </w:tblPr>
       <w:tblGrid>
-        <w:gridCol w:w="1464"/>
+        <w:gridCol w:w="1138"/>
         <w:gridCol w:w="748"/>
-        <w:gridCol w:w="2067"/>
-        <w:gridCol w:w="2067"/>
-        <w:gridCol w:w="2266"/>
-        <w:gridCol w:w="748"/>
+        <w:gridCol w:w="1600"/>
+        <w:gridCol w:w="1600"/>
+        <w:gridCol w:w="1754"/>
+        <w:gridCol w:w="2520"/>
       </w:tblGrid>
       <w:tr>
         <w:trPr>
@@ -8542,7 +8542,7 @@
         </w:trPr>
         <w:tc>
           <w:tcPr>
-            <w:tcW w:type="dxa" w:w="1464"/>
+            <w:tcW w:type="dxa" w:w="1138"/>
             <w:tcBorders>
               <w:top w:val="single" w:color="BBBBBB" w:sz="1"/>
               <w:left w:val="single" w:color="BBBBBB" w:sz="1"/>
@@ -8596,7 +8596,7 @@
         </w:tc>
         <w:tc>
           <w:tcPr>
-            <w:tcW w:type="dxa" w:w="2067"/>
+            <w:tcW w:type="dxa" w:w="1600"/>
             <w:tcBorders>
               <w:top w:val="single" w:color="BBBBBB" w:sz="1"/>
               <w:left w:val="single" w:color="BBBBBB" w:sz="1"/>
@@ -8623,7 +8623,7 @@
         </w:tc>
         <w:tc>
           <w:tcPr>
-            <w:tcW w:type="dxa" w:w="2067"/>
+            <w:tcW w:type="dxa" w:w="1600"/>
             <w:tcBorders>
               <w:top w:val="single" w:color="BBBBBB" w:sz="1"/>
               <w:left w:val="single" w:color="BBBBBB" w:sz="1"/>
@@ -8650,7 +8650,7 @@
         </w:tc>
         <w:tc>
           <w:tcPr>
-            <w:tcW w:type="dxa" w:w="2266"/>
+            <w:tcW w:type="dxa" w:w="1754"/>
             <w:tcBorders>
               <w:top w:val="single" w:color="BBBBBB" w:sz="1"/>
               <w:left w:val="single" w:color="BBBBBB" w:sz="1"/>
@@ -8677,7 +8677,7 @@
         </w:tc>
         <w:tc>
           <w:tcPr>
-            <w:tcW w:type="dxa" w:w="748"/>
+            <w:tcW w:type="dxa" w:w="2520"/>
             <w:tcBorders>
               <w:top w:val="single" w:color="BBBBBB" w:sz="1"/>
               <w:left w:val="single" w:color="BBBBBB" w:sz="1"/>
@@ -8709,7 +8709,7 @@
         </w:trPr>
         <w:tc>
           <w:tcPr>
-            <w:tcW w:type="dxa" w:w="1464"/>
+            <w:tcW w:type="dxa" w:w="1138"/>
             <w:tcBorders>
               <w:top w:val="single" w:color="BBBBBB" w:sz="1"/>
               <w:left w:val="single" w:color="BBBBBB" w:sz="1"/>
@@ -8753,7 +8753,7 @@
         </w:tc>
         <w:tc>
           <w:tcPr>
-            <w:tcW w:type="dxa" w:w="2067"/>
+            <w:tcW w:type="dxa" w:w="1600"/>
             <w:tcBorders>
               <w:top w:val="single" w:color="BBBBBB" w:sz="1"/>
               <w:left w:val="single" w:color="BBBBBB" w:sz="1"/>
@@ -8775,7 +8775,7 @@
         </w:tc>
         <w:tc>
           <w:tcPr>
-            <w:tcW w:type="dxa" w:w="2067"/>
+            <w:tcW w:type="dxa" w:w="1600"/>
             <w:tcBorders>
               <w:top w:val="single" w:color="BBBBBB" w:sz="1"/>
               <w:left w:val="single" w:color="BBBBBB" w:sz="1"/>
@@ -8797,7 +8797,7 @@
         </w:tc>
         <w:tc>
           <w:tcPr>
-            <w:tcW w:type="dxa" w:w="2266"/>
+            <w:tcW w:type="dxa" w:w="1754"/>
             <w:tcBorders>
               <w:top w:val="single" w:color="BBBBBB" w:sz="1"/>
               <w:left w:val="single" w:color="BBBBBB" w:sz="1"/>
@@ -8819,7 +8819,7 @@
         </w:tc>
         <w:tc>
           <w:tcPr>
-            <w:tcW w:type="dxa" w:w="748"/>
+            <w:tcW w:type="dxa" w:w="2520"/>
             <w:tcBorders>
               <w:top w:val="single" w:color="BBBBBB" w:sz="1"/>
               <w:left w:val="single" w:color="BBBBBB" w:sz="1"/>
@@ -8846,7 +8846,7 @@
         </w:trPr>
         <w:tc>
           <w:tcPr>
-            <w:tcW w:type="dxa" w:w="1464"/>
+            <w:tcW w:type="dxa" w:w="1138"/>
             <w:tcBorders>
               <w:top w:val="single" w:color="BBBBBB" w:sz="1"/>
               <w:left w:val="single" w:color="BBBBBB" w:sz="1"/>
@@ -8890,7 +8890,7 @@
         </w:tc>
         <w:tc>
           <w:tcPr>
-            <w:tcW w:type="dxa" w:w="2067"/>
+            <w:tcW w:type="dxa" w:w="1600"/>
             <w:tcBorders>
               <w:top w:val="single" w:color="BBBBBB" w:sz="1"/>
               <w:left w:val="single" w:color="BBBBBB" w:sz="1"/>
@@ -8912,7 +8912,7 @@
         </w:tc>
         <w:tc>
           <w:tcPr>
-            <w:tcW w:type="dxa" w:w="2067"/>
+            <w:tcW w:type="dxa" w:w="1600"/>
             <w:tcBorders>
               <w:top w:val="single" w:color="BBBBBB" w:sz="1"/>
               <w:left w:val="single" w:color="BBBBBB" w:sz="1"/>
@@ -8934,7 +8934,7 @@
         </w:tc>
         <w:tc>
           <w:tcPr>
-            <w:tcW w:type="dxa" w:w="2266"/>
+            <w:tcW w:type="dxa" w:w="1754"/>
             <w:tcBorders>
               <w:top w:val="single" w:color="BBBBBB" w:sz="1"/>
               <w:left w:val="single" w:color="BBBBBB" w:sz="1"/>
@@ -8956,7 +8956,7 @@
         </w:tc>
         <w:tc>
           <w:tcPr>
-            <w:tcW w:type="dxa" w:w="748"/>
+            <w:tcW w:type="dxa" w:w="2520"/>
             <w:tcBorders>
               <w:top w:val="single" w:color="BBBBBB" w:sz="1"/>
               <w:left w:val="single" w:color="BBBBBB" w:sz="1"/>
@@ -8983,7 +8983,7 @@
         </w:trPr>
         <w:tc>
           <w:tcPr>
-            <w:tcW w:type="dxa" w:w="1464"/>
+            <w:tcW w:type="dxa" w:w="1138"/>
             <w:tcBorders>
               <w:top w:val="single" w:color="BBBBBB" w:sz="1"/>
               <w:left w:val="single" w:color="BBBBBB" w:sz="1"/>
@@ -9027,7 +9027,7 @@
         </w:tc>
         <w:tc>
           <w:tcPr>
-            <w:tcW w:type="dxa" w:w="2067"/>
+            <w:tcW w:type="dxa" w:w="1600"/>
             <w:tcBorders>
               <w:top w:val="single" w:color="BBBBBB" w:sz="1"/>
               <w:left w:val="single" w:color="BBBBBB" w:sz="1"/>
@@ -9049,7 +9049,7 @@
         </w:tc>
         <w:tc>
           <w:tcPr>
-            <w:tcW w:type="dxa" w:w="2067"/>
+            <w:tcW w:type="dxa" w:w="1600"/>
             <w:tcBorders>
               <w:top w:val="single" w:color="BBBBBB" w:sz="1"/>
               <w:left w:val="single" w:color="BBBBBB" w:sz="1"/>
@@ -9071,7 +9071,7 @@
         </w:tc>
         <w:tc>
           <w:tcPr>
-            <w:tcW w:type="dxa" w:w="2266"/>
+            <w:tcW w:type="dxa" w:w="1754"/>
             <w:tcBorders>
               <w:top w:val="single" w:color="BBBBBB" w:sz="1"/>
               <w:left w:val="single" w:color="BBBBBB" w:sz="1"/>
@@ -9093,7 +9093,7 @@
         </w:tc>
         <w:tc>
           <w:tcPr>
-            <w:tcW w:type="dxa" w:w="748"/>
+            <w:tcW w:type="dxa" w:w="2520"/>
             <w:tcBorders>
               <w:top w:val="single" w:color="BBBBBB" w:sz="1"/>
               <w:left w:val="single" w:color="BBBBBB" w:sz="1"/>
@@ -9120,7 +9120,7 @@
         </w:trPr>
         <w:tc>
           <w:tcPr>
-            <w:tcW w:type="dxa" w:w="1464"/>
+            <w:tcW w:type="dxa" w:w="1138"/>
             <w:tcBorders>
               <w:top w:val="single" w:color="BBBBBB" w:sz="1"/>
               <w:left w:val="single" w:color="BBBBBB" w:sz="1"/>
@@ -9164,7 +9164,7 @@
         </w:tc>
         <w:tc>
           <w:tcPr>
-            <w:tcW w:type="dxa" w:w="2067"/>
+            <w:tcW w:type="dxa" w:w="1600"/>
             <w:tcBorders>
               <w:top w:val="single" w:color="BBBBBB" w:sz="1"/>
               <w:left w:val="single" w:color="BBBBBB" w:sz="1"/>
@@ -9186,7 +9186,7 @@
         </w:tc>
         <w:tc>
           <w:tcPr>
-            <w:tcW w:type="dxa" w:w="2067"/>
+            <w:tcW w:type="dxa" w:w="1600"/>
             <w:tcBorders>
               <w:top w:val="single" w:color="BBBBBB" w:sz="1"/>
               <w:left w:val="single" w:color="BBBBBB" w:sz="1"/>
@@ -9208,7 +9208,7 @@
         </w:tc>
         <w:tc>
           <w:tcPr>
-            <w:tcW w:type="dxa" w:w="2266"/>
+            <w:tcW w:type="dxa" w:w="1754"/>
             <w:tcBorders>
               <w:top w:val="single" w:color="BBBBBB" w:sz="1"/>
               <w:left w:val="single" w:color="BBBBBB" w:sz="1"/>
@@ -9230,7 +9230,7 @@
         </w:tc>
         <w:tc>
           <w:tcPr>
-            <w:tcW w:type="dxa" w:w="748"/>
+            <w:tcW w:type="dxa" w:w="2520"/>
             <w:tcBorders>
               <w:top w:val="single" w:color="BBBBBB" w:sz="1"/>
               <w:left w:val="single" w:color="BBBBBB" w:sz="1"/>
@@ -9257,7 +9257,7 @@
         </w:trPr>
         <w:tc>
           <w:tcPr>
-            <w:tcW w:type="dxa" w:w="1464"/>
+            <w:tcW w:type="dxa" w:w="1138"/>
             <w:tcBorders>
               <w:top w:val="single" w:color="BBBBBB" w:sz="1"/>
               <w:left w:val="single" w:color="BBBBBB" w:sz="1"/>
@@ -9301,7 +9301,7 @@
         </w:tc>
         <w:tc>
           <w:tcPr>
-            <w:tcW w:type="dxa" w:w="2067"/>
+            <w:tcW w:type="dxa" w:w="1600"/>
             <w:tcBorders>
               <w:top w:val="single" w:color="BBBBBB" w:sz="1"/>
               <w:left w:val="single" w:color="BBBBBB" w:sz="1"/>
@@ -9323,7 +9323,7 @@
         </w:tc>
         <w:tc>
           <w:tcPr>
-            <w:tcW w:type="dxa" w:w="2067"/>
+            <w:tcW w:type="dxa" w:w="1600"/>
             <w:tcBorders>
               <w:top w:val="single" w:color="BBBBBB" w:sz="1"/>
               <w:left w:val="single" w:color="BBBBBB" w:sz="1"/>
@@ -9345,7 +9345,7 @@
         </w:tc>
         <w:tc>
           <w:tcPr>
-            <w:tcW w:type="dxa" w:w="2266"/>
+            <w:tcW w:type="dxa" w:w="1754"/>
             <w:tcBorders>
               <w:top w:val="single" w:color="BBBBBB" w:sz="1"/>
               <w:left w:val="single" w:color="BBBBBB" w:sz="1"/>
@@ -9367,7 +9367,7 @@
         </w:tc>
         <w:tc>
           <w:tcPr>
-            <w:tcW w:type="dxa" w:w="748"/>
+            <w:tcW w:type="dxa" w:w="2520"/>
             <w:tcBorders>
               <w:top w:val="single" w:color="BBBBBB" w:sz="1"/>
               <w:left w:val="single" w:color="BBBBBB" w:sz="1"/>
@@ -9394,7 +9394,7 @@
         </w:trPr>
         <w:tc>
           <w:tcPr>
-            <w:tcW w:type="dxa" w:w="1464"/>
+            <w:tcW w:type="dxa" w:w="1138"/>
             <w:tcBorders>
               <w:top w:val="single" w:color="BBBBBB" w:sz="1"/>
               <w:left w:val="single" w:color="BBBBBB" w:sz="1"/>
@@ -9438,7 +9438,7 @@
         </w:tc>
         <w:tc>
           <w:tcPr>
-            <w:tcW w:type="dxa" w:w="2067"/>
+            <w:tcW w:type="dxa" w:w="1600"/>
             <w:tcBorders>
               <w:top w:val="single" w:color="BBBBBB" w:sz="1"/>
               <w:left w:val="single" w:color="BBBBBB" w:sz="1"/>
@@ -9460,7 +9460,7 @@
         </w:tc>
         <w:tc>
           <w:tcPr>
-            <w:tcW w:type="dxa" w:w="2067"/>
+            <w:tcW w:type="dxa" w:w="1600"/>
             <w:tcBorders>
               <w:top w:val="single" w:color="BBBBBB" w:sz="1"/>
               <w:left w:val="single" w:color="BBBBBB" w:sz="1"/>
@@ -9482,7 +9482,7 @@
         </w:tc>
         <w:tc>
           <w:tcPr>
-            <w:tcW w:type="dxa" w:w="2266"/>
+            <w:tcW w:type="dxa" w:w="1754"/>
             <w:tcBorders>
               <w:top w:val="single" w:color="BBBBBB" w:sz="1"/>
               <w:left w:val="single" w:color="BBBBBB" w:sz="1"/>
@@ -9504,7 +9504,7 @@
         </w:tc>
         <w:tc>
           <w:tcPr>
-            <w:tcW w:type="dxa" w:w="748"/>
+            <w:tcW w:type="dxa" w:w="2520"/>
             <w:tcBorders>
               <w:top w:val="single" w:color="BBBBBB" w:sz="1"/>
               <w:left w:val="single" w:color="BBBBBB" w:sz="1"/>
@@ -9531,7 +9531,7 @@
         </w:trPr>
         <w:tc>
           <w:tcPr>
-            <w:tcW w:type="dxa" w:w="1464"/>
+            <w:tcW w:type="dxa" w:w="1138"/>
             <w:tcBorders>
               <w:top w:val="single" w:color="BBBBBB" w:sz="1"/>
               <w:left w:val="single" w:color="BBBBBB" w:sz="1"/>
@@ -9575,7 +9575,7 @@
         </w:tc>
         <w:tc>
           <w:tcPr>
-            <w:tcW w:type="dxa" w:w="2067"/>
+            <w:tcW w:type="dxa" w:w="1600"/>
             <w:tcBorders>
               <w:top w:val="single" w:color="BBBBBB" w:sz="1"/>
               <w:left w:val="single" w:color="BBBBBB" w:sz="1"/>
@@ -9597,7 +9597,7 @@
         </w:tc>
         <w:tc>
           <w:tcPr>
-            <w:tcW w:type="dxa" w:w="2067"/>
+            <w:tcW w:type="dxa" w:w="1600"/>
             <w:tcBorders>
               <w:top w:val="single" w:color="BBBBBB" w:sz="1"/>
               <w:left w:val="single" w:color="BBBBBB" w:sz="1"/>
@@ -9619,7 +9619,7 @@
         </w:tc>
         <w:tc>
           <w:tcPr>
-            <w:tcW w:type="dxa" w:w="2266"/>
+            <w:tcW w:type="dxa" w:w="1754"/>
             <w:tcBorders>
               <w:top w:val="single" w:color="BBBBBB" w:sz="1"/>
               <w:left w:val="single" w:color="BBBBBB" w:sz="1"/>
@@ -9641,7 +9641,7 @@
         </w:tc>
         <w:tc>
           <w:tcPr>
-            <w:tcW w:type="dxa" w:w="748"/>
+            <w:tcW w:type="dxa" w:w="2520"/>
             <w:tcBorders>
               <w:top w:val="single" w:color="BBBBBB" w:sz="1"/>
               <w:left w:val="single" w:color="BBBBBB" w:sz="1"/>
@@ -9668,7 +9668,7 @@
         </w:trPr>
         <w:tc>
           <w:tcPr>
-            <w:tcW w:type="dxa" w:w="1464"/>
+            <w:tcW w:type="dxa" w:w="1138"/>
             <w:tcBorders>
               <w:top w:val="single" w:color="BBBBBB" w:sz="1"/>
               <w:left w:val="single" w:color="BBBBBB" w:sz="1"/>
@@ -9712,7 +9712,7 @@
         </w:tc>
         <w:tc>
           <w:tcPr>
-            <w:tcW w:type="dxa" w:w="2067"/>
+            <w:tcW w:type="dxa" w:w="1600"/>
             <w:tcBorders>
               <w:top w:val="single" w:color="BBBBBB" w:sz="1"/>
               <w:left w:val="single" w:color="BBBBBB" w:sz="1"/>
@@ -9734,7 +9734,7 @@
         </w:tc>
         <w:tc>
           <w:tcPr>
-            <w:tcW w:type="dxa" w:w="2067"/>
+            <w:tcW w:type="dxa" w:w="1600"/>
             <w:tcBorders>
               <w:top w:val="single" w:color="BBBBBB" w:sz="1"/>
               <w:left w:val="single" w:color="BBBBBB" w:sz="1"/>
@@ -9756,7 +9756,7 @@
         </w:tc>
         <w:tc>
           <w:tcPr>
-            <w:tcW w:type="dxa" w:w="2266"/>
+            <w:tcW w:type="dxa" w:w="1754"/>
             <w:tcBorders>
               <w:top w:val="single" w:color="BBBBBB" w:sz="1"/>
               <w:left w:val="single" w:color="BBBBBB" w:sz="1"/>
@@ -9778,23 +9778,23 @@
         </w:tc>
         <w:tc>
           <w:tcPr>
-            <w:tcW w:type="dxa" w:w="748"/>
-            <w:tcBorders>
-              <w:top w:val="single" w:color="BBBBBB" w:sz="1"/>
-              <w:left w:val="single" w:color="BBBBBB" w:sz="1"/>
-              <w:bottom w:val="single" w:color="BBBBBB" w:sz="1"/>
-              <w:right w:val="single" w:color="BBBBBB" w:sz="1"/>
-            </w:tcBorders>
-            <w:tcMar>
-              <w:top w:type="dxa" w:w="60"/>
-              <w:left w:type="dxa" w:w="100"/>
-              <w:bottom w:type="dxa" w:w="60"/>
-              <w:right w:type="dxa" w:w="100"/>
-            </w:tcMar>
-          </w:tcPr>
-          <w:p>
-            <w:r>
-              <w:t xml:space="preserve">未启动</w:t>
+            <w:tcW w:type="dxa" w:w="2520"/>
+            <w:tcBorders>
+              <w:top w:val="single" w:color="BBBBBB" w:sz="1"/>
+              <w:left w:val="single" w:color="BBBBBB" w:sz="1"/>
+              <w:bottom w:val="single" w:color="BBBBBB" w:sz="1"/>
+              <w:right w:val="single" w:color="BBBBBB" w:sz="1"/>
+            </w:tcBorders>
+            <w:tcMar>
+              <w:top w:type="dxa" w:w="60"/>
+              <w:left w:type="dxa" w:w="100"/>
+              <w:bottom w:type="dxa" w:w="60"/>
+              <w:right w:type="dxa" w:w="100"/>
+            </w:tcMar>
+          </w:tcPr>
+          <w:p>
+            <w:r>
+              <w:t xml:space="preserve">已关闭（验收通过）</w:t>
             </w:r>
           </w:p>
         </w:tc>
@@ -9805,7 +9805,7 @@
         </w:trPr>
         <w:tc>
           <w:tcPr>
-            <w:tcW w:type="dxa" w:w="1464"/>
+            <w:tcW w:type="dxa" w:w="1138"/>
             <w:tcBorders>
               <w:top w:val="single" w:color="BBBBBB" w:sz="1"/>
               <w:left w:val="single" w:color="BBBBBB" w:sz="1"/>
@@ -9849,7 +9849,7 @@
         </w:tc>
         <w:tc>
           <w:tcPr>
-            <w:tcW w:type="dxa" w:w="2067"/>
+            <w:tcW w:type="dxa" w:w="1600"/>
             <w:tcBorders>
               <w:top w:val="single" w:color="BBBBBB" w:sz="1"/>
               <w:left w:val="single" w:color="BBBBBB" w:sz="1"/>
@@ -9871,7 +9871,7 @@
         </w:tc>
         <w:tc>
           <w:tcPr>
-            <w:tcW w:type="dxa" w:w="2067"/>
+            <w:tcW w:type="dxa" w:w="1600"/>
             <w:tcBorders>
               <w:top w:val="single" w:color="BBBBBB" w:sz="1"/>
               <w:left w:val="single" w:color="BBBBBB" w:sz="1"/>
@@ -9893,7 +9893,7 @@
         </w:tc>
         <w:tc>
           <w:tcPr>
-            <w:tcW w:type="dxa" w:w="2266"/>
+            <w:tcW w:type="dxa" w:w="1754"/>
             <w:tcBorders>
               <w:top w:val="single" w:color="BBBBBB" w:sz="1"/>
               <w:left w:val="single" w:color="BBBBBB" w:sz="1"/>
@@ -9915,7 +9915,7 @@
         </w:tc>
         <w:tc>
           <w:tcPr>
-            <w:tcW w:type="dxa" w:w="748"/>
+            <w:tcW w:type="dxa" w:w="2520"/>
             <w:tcBorders>
               <w:top w:val="single" w:color="BBBBBB" w:sz="1"/>
               <w:left w:val="single" w:color="BBBBBB" w:sz="1"/>
@@ -9942,7 +9942,7 @@
         </w:trPr>
         <w:tc>
           <w:tcPr>
-            <w:tcW w:type="dxa" w:w="1464"/>
+            <w:tcW w:type="dxa" w:w="1138"/>
             <w:tcBorders>
               <w:top w:val="single" w:color="BBBBBB" w:sz="1"/>
               <w:left w:val="single" w:color="BBBBBB" w:sz="1"/>
@@ -9986,7 +9986,7 @@
         </w:tc>
         <w:tc>
           <w:tcPr>
-            <w:tcW w:type="dxa" w:w="2067"/>
+            <w:tcW w:type="dxa" w:w="1600"/>
             <w:tcBorders>
               <w:top w:val="single" w:color="BBBBBB" w:sz="1"/>
               <w:left w:val="single" w:color="BBBBBB" w:sz="1"/>
@@ -10008,7 +10008,7 @@
         </w:tc>
         <w:tc>
           <w:tcPr>
-            <w:tcW w:type="dxa" w:w="2067"/>
+            <w:tcW w:type="dxa" w:w="1600"/>
             <w:tcBorders>
               <w:top w:val="single" w:color="BBBBBB" w:sz="1"/>
               <w:left w:val="single" w:color="BBBBBB" w:sz="1"/>
@@ -10030,7 +10030,7 @@
         </w:tc>
         <w:tc>
           <w:tcPr>
-            <w:tcW w:type="dxa" w:w="2266"/>
+            <w:tcW w:type="dxa" w:w="1754"/>
             <w:tcBorders>
               <w:top w:val="single" w:color="BBBBBB" w:sz="1"/>
               <w:left w:val="single" w:color="BBBBBB" w:sz="1"/>
@@ -10052,7 +10052,7 @@
         </w:tc>
         <w:tc>
           <w:tcPr>
-            <w:tcW w:type="dxa" w:w="748"/>
+            <w:tcW w:type="dxa" w:w="2520"/>
             <w:tcBorders>
               <w:top w:val="single" w:color="BBBBBB" w:sz="1"/>
               <w:left w:val="single" w:color="BBBBBB" w:sz="1"/>
@@ -10079,7 +10079,7 @@
         </w:trPr>
         <w:tc>
           <w:tcPr>
-            <w:tcW w:type="dxa" w:w="1464"/>
+            <w:tcW w:type="dxa" w:w="1138"/>
             <w:tcBorders>
               <w:top w:val="single" w:color="BBBBBB" w:sz="1"/>
               <w:left w:val="single" w:color="BBBBBB" w:sz="1"/>
@@ -10123,7 +10123,7 @@
         </w:tc>
         <w:tc>
           <w:tcPr>
-            <w:tcW w:type="dxa" w:w="2067"/>
+            <w:tcW w:type="dxa" w:w="1600"/>
             <w:tcBorders>
               <w:top w:val="single" w:color="BBBBBB" w:sz="1"/>
               <w:left w:val="single" w:color="BBBBBB" w:sz="1"/>
@@ -10145,7 +10145,7 @@
         </w:tc>
         <w:tc>
           <w:tcPr>
-            <w:tcW w:type="dxa" w:w="2067"/>
+            <w:tcW w:type="dxa" w:w="1600"/>
             <w:tcBorders>
               <w:top w:val="single" w:color="BBBBBB" w:sz="1"/>
               <w:left w:val="single" w:color="BBBBBB" w:sz="1"/>
@@ -10167,7 +10167,7 @@
         </w:tc>
         <w:tc>
           <w:tcPr>
-            <w:tcW w:type="dxa" w:w="2266"/>
+            <w:tcW w:type="dxa" w:w="1754"/>
             <w:tcBorders>
               <w:top w:val="single" w:color="BBBBBB" w:sz="1"/>
               <w:left w:val="single" w:color="BBBBBB" w:sz="1"/>
@@ -10189,7 +10189,7 @@
         </w:tc>
         <w:tc>
           <w:tcPr>
-            <w:tcW w:type="dxa" w:w="748"/>
+            <w:tcW w:type="dxa" w:w="2520"/>
             <w:tcBorders>
               <w:top w:val="single" w:color="BBBBBB" w:sz="1"/>
               <w:left w:val="single" w:color="BBBBBB" w:sz="1"/>
@@ -10216,7 +10216,7 @@
         </w:trPr>
         <w:tc>
           <w:tcPr>
-            <w:tcW w:type="dxa" w:w="1464"/>
+            <w:tcW w:type="dxa" w:w="1138"/>
             <w:tcBorders>
               <w:top w:val="single" w:color="BBBBBB" w:sz="1"/>
               <w:left w:val="single" w:color="BBBBBB" w:sz="1"/>
@@ -10260,7 +10260,7 @@
         </w:tc>
         <w:tc>
           <w:tcPr>
-            <w:tcW w:type="dxa" w:w="2067"/>
+            <w:tcW w:type="dxa" w:w="1600"/>
             <w:tcBorders>
               <w:top w:val="single" w:color="BBBBBB" w:sz="1"/>
               <w:left w:val="single" w:color="BBBBBB" w:sz="1"/>
@@ -10282,7 +10282,7 @@
         </w:tc>
         <w:tc>
           <w:tcPr>
-            <w:tcW w:type="dxa" w:w="2067"/>
+            <w:tcW w:type="dxa" w:w="1600"/>
             <w:tcBorders>
               <w:top w:val="single" w:color="BBBBBB" w:sz="1"/>
               <w:left w:val="single" w:color="BBBBBB" w:sz="1"/>
@@ -10304,7 +10304,7 @@
         </w:tc>
         <w:tc>
           <w:tcPr>
-            <w:tcW w:type="dxa" w:w="2266"/>
+            <w:tcW w:type="dxa" w:w="1754"/>
             <w:tcBorders>
               <w:top w:val="single" w:color="BBBBBB" w:sz="1"/>
               <w:left w:val="single" w:color="BBBBBB" w:sz="1"/>
@@ -10326,7 +10326,7 @@
         </w:tc>
         <w:tc>
           <w:tcPr>
-            <w:tcW w:type="dxa" w:w="748"/>
+            <w:tcW w:type="dxa" w:w="2520"/>
             <w:tcBorders>
               <w:top w:val="single" w:color="BBBBBB" w:sz="1"/>
               <w:left w:val="single" w:color="BBBBBB" w:sz="1"/>
@@ -10353,7 +10353,7 @@
         </w:trPr>
         <w:tc>
           <w:tcPr>
-            <w:tcW w:type="dxa" w:w="1464"/>
+            <w:tcW w:type="dxa" w:w="1138"/>
             <w:tcBorders>
               <w:top w:val="single" w:color="BBBBBB" w:sz="1"/>
               <w:left w:val="single" w:color="BBBBBB" w:sz="1"/>
@@ -10397,7 +10397,7 @@
         </w:tc>
         <w:tc>
           <w:tcPr>
-            <w:tcW w:type="dxa" w:w="2067"/>
+            <w:tcW w:type="dxa" w:w="1600"/>
             <w:tcBorders>
               <w:top w:val="single" w:color="BBBBBB" w:sz="1"/>
               <w:left w:val="single" w:color="BBBBBB" w:sz="1"/>
@@ -10419,7 +10419,7 @@
         </w:tc>
         <w:tc>
           <w:tcPr>
-            <w:tcW w:type="dxa" w:w="2067"/>
+            <w:tcW w:type="dxa" w:w="1600"/>
             <w:tcBorders>
               <w:top w:val="single" w:color="BBBBBB" w:sz="1"/>
               <w:left w:val="single" w:color="BBBBBB" w:sz="1"/>
@@ -10441,7 +10441,7 @@
         </w:tc>
         <w:tc>
           <w:tcPr>
-            <w:tcW w:type="dxa" w:w="2266"/>
+            <w:tcW w:type="dxa" w:w="1754"/>
             <w:tcBorders>
               <w:top w:val="single" w:color="BBBBBB" w:sz="1"/>
               <w:left w:val="single" w:color="BBBBBB" w:sz="1"/>
@@ -10463,7 +10463,7 @@
         </w:tc>
         <w:tc>
           <w:tcPr>
-            <w:tcW w:type="dxa" w:w="748"/>
+            <w:tcW w:type="dxa" w:w="2520"/>
             <w:tcBorders>
               <w:top w:val="single" w:color="BBBBBB" w:sz="1"/>
               <w:left w:val="single" w:color="BBBBBB" w:sz="1"/>
@@ -10490,7 +10490,7 @@
         </w:trPr>
         <w:tc>
           <w:tcPr>
-            <w:tcW w:type="dxa" w:w="1464"/>
+            <w:tcW w:type="dxa" w:w="1138"/>
             <w:tcBorders>
               <w:top w:val="single" w:color="BBBBBB" w:sz="1"/>
               <w:left w:val="single" w:color="BBBBBB" w:sz="1"/>
@@ -10534,7 +10534,7 @@
         </w:tc>
         <w:tc>
           <w:tcPr>
-            <w:tcW w:type="dxa" w:w="2067"/>
+            <w:tcW w:type="dxa" w:w="1600"/>
             <w:tcBorders>
               <w:top w:val="single" w:color="BBBBBB" w:sz="1"/>
               <w:left w:val="single" w:color="BBBBBB" w:sz="1"/>
@@ -10556,7 +10556,7 @@
         </w:tc>
         <w:tc>
           <w:tcPr>
-            <w:tcW w:type="dxa" w:w="2067"/>
+            <w:tcW w:type="dxa" w:w="1600"/>
             <w:tcBorders>
               <w:top w:val="single" w:color="BBBBBB" w:sz="1"/>
               <w:left w:val="single" w:color="BBBBBB" w:sz="1"/>
@@ -10578,7 +10578,7 @@
         </w:tc>
         <w:tc>
           <w:tcPr>
-            <w:tcW w:type="dxa" w:w="2266"/>
+            <w:tcW w:type="dxa" w:w="1754"/>
             <w:tcBorders>
               <w:top w:val="single" w:color="BBBBBB" w:sz="1"/>
               <w:left w:val="single" w:color="BBBBBB" w:sz="1"/>
@@ -10600,7 +10600,7 @@
         </w:tc>
         <w:tc>
           <w:tcPr>
-            <w:tcW w:type="dxa" w:w="748"/>
+            <w:tcW w:type="dxa" w:w="2520"/>
             <w:tcBorders>
               <w:top w:val="single" w:color="BBBBBB" w:sz="1"/>
               <w:left w:val="single" w:color="BBBBBB" w:sz="1"/>
@@ -10627,7 +10627,7 @@
         </w:trPr>
         <w:tc>
           <w:tcPr>
-            <w:tcW w:type="dxa" w:w="1464"/>
+            <w:tcW w:type="dxa" w:w="1138"/>
             <w:tcBorders>
               <w:top w:val="single" w:color="BBBBBB" w:sz="1"/>
               <w:left w:val="single" w:color="BBBBBB" w:sz="1"/>
@@ -10671,7 +10671,7 @@
         </w:tc>
         <w:tc>
           <w:tcPr>
-            <w:tcW w:type="dxa" w:w="2067"/>
+            <w:tcW w:type="dxa" w:w="1600"/>
             <w:tcBorders>
               <w:top w:val="single" w:color="BBBBBB" w:sz="1"/>
               <w:left w:val="single" w:color="BBBBBB" w:sz="1"/>
@@ -10693,7 +10693,7 @@
         </w:tc>
         <w:tc>
           <w:tcPr>
-            <w:tcW w:type="dxa" w:w="2067"/>
+            <w:tcW w:type="dxa" w:w="1600"/>
             <w:tcBorders>
               <w:top w:val="single" w:color="BBBBBB" w:sz="1"/>
               <w:left w:val="single" w:color="BBBBBB" w:sz="1"/>
@@ -10715,7 +10715,7 @@
         </w:tc>
         <w:tc>
           <w:tcPr>
-            <w:tcW w:type="dxa" w:w="2266"/>
+            <w:tcW w:type="dxa" w:w="1754"/>
             <w:tcBorders>
               <w:top w:val="single" w:color="BBBBBB" w:sz="1"/>
               <w:left w:val="single" w:color="BBBBBB" w:sz="1"/>
@@ -10737,23 +10737,23 @@
         </w:tc>
         <w:tc>
           <w:tcPr>
-            <w:tcW w:type="dxa" w:w="748"/>
-            <w:tcBorders>
-              <w:top w:val="single" w:color="BBBBBB" w:sz="1"/>
-              <w:left w:val="single" w:color="BBBBBB" w:sz="1"/>
-              <w:bottom w:val="single" w:color="BBBBBB" w:sz="1"/>
-              <w:right w:val="single" w:color="BBBBBB" w:sz="1"/>
-            </w:tcBorders>
-            <w:tcMar>
-              <w:top w:type="dxa" w:w="60"/>
-              <w:left w:type="dxa" w:w="100"/>
-              <w:bottom w:type="dxa" w:w="60"/>
-              <w:right w:type="dxa" w:w="100"/>
-            </w:tcMar>
-          </w:tcPr>
-          <w:p>
-            <w:r>
-              <w:t xml:space="preserve">未启动</w:t>
+            <w:tcW w:type="dxa" w:w="2520"/>
+            <w:tcBorders>
+              <w:top w:val="single" w:color="BBBBBB" w:sz="1"/>
+              <w:left w:val="single" w:color="BBBBBB" w:sz="1"/>
+              <w:bottom w:val="single" w:color="BBBBBB" w:sz="1"/>
+              <w:right w:val="single" w:color="BBBBBB" w:sz="1"/>
+            </w:tcBorders>
+            <w:tcMar>
+              <w:top w:type="dxa" w:w="60"/>
+              <w:left w:type="dxa" w:w="100"/>
+              <w:bottom w:type="dxa" w:w="60"/>
+              <w:right w:type="dxa" w:w="100"/>
+            </w:tcMar>
+          </w:tcPr>
+          <w:p>
+            <w:r>
+              <w:t xml:space="preserve">已修复（待 100 次切页验收）</w:t>
             </w:r>
           </w:p>
         </w:tc>
@@ -10764,7 +10764,7 @@
         </w:trPr>
         <w:tc>
           <w:tcPr>
-            <w:tcW w:type="dxa" w:w="1464"/>
+            <w:tcW w:type="dxa" w:w="1138"/>
             <w:tcBorders>
               <w:top w:val="single" w:color="BBBBBB" w:sz="1"/>
               <w:left w:val="single" w:color="BBBBBB" w:sz="1"/>
@@ -10808,7 +10808,7 @@
         </w:tc>
         <w:tc>
           <w:tcPr>
-            <w:tcW w:type="dxa" w:w="2067"/>
+            <w:tcW w:type="dxa" w:w="1600"/>
             <w:tcBorders>
               <w:top w:val="single" w:color="BBBBBB" w:sz="1"/>
               <w:left w:val="single" w:color="BBBBBB" w:sz="1"/>
@@ -10830,7 +10830,7 @@
         </w:tc>
         <w:tc>
           <w:tcPr>
-            <w:tcW w:type="dxa" w:w="2067"/>
+            <w:tcW w:type="dxa" w:w="1600"/>
             <w:tcBorders>
               <w:top w:val="single" w:color="BBBBBB" w:sz="1"/>
               <w:left w:val="single" w:color="BBBBBB" w:sz="1"/>
@@ -10852,7 +10852,7 @@
         </w:tc>
         <w:tc>
           <w:tcPr>
-            <w:tcW w:type="dxa" w:w="2266"/>
+            <w:tcW w:type="dxa" w:w="1754"/>
             <w:tcBorders>
               <w:top w:val="single" w:color="BBBBBB" w:sz="1"/>
               <w:left w:val="single" w:color="BBBBBB" w:sz="1"/>
@@ -10874,7 +10874,7 @@
         </w:tc>
         <w:tc>
           <w:tcPr>
-            <w:tcW w:type="dxa" w:w="748"/>
+            <w:tcW w:type="dxa" w:w="2520"/>
             <w:tcBorders>
               <w:top w:val="single" w:color="BBBBBB" w:sz="1"/>
               <w:left w:val="single" w:color="BBBBBB" w:sz="1"/>
@@ -10901,7 +10901,7 @@
         </w:trPr>
         <w:tc>
           <w:tcPr>
-            <w:tcW w:type="dxa" w:w="1464"/>
+            <w:tcW w:type="dxa" w:w="1138"/>
             <w:tcBorders>
               <w:top w:val="single" w:color="BBBBBB" w:sz="1"/>
               <w:left w:val="single" w:color="BBBBBB" w:sz="1"/>
@@ -10945,7 +10945,7 @@
         </w:tc>
         <w:tc>
           <w:tcPr>
-            <w:tcW w:type="dxa" w:w="2067"/>
+            <w:tcW w:type="dxa" w:w="1600"/>
             <w:tcBorders>
               <w:top w:val="single" w:color="BBBBBB" w:sz="1"/>
               <w:left w:val="single" w:color="BBBBBB" w:sz="1"/>
@@ -10967,7 +10967,7 @@
         </w:tc>
         <w:tc>
           <w:tcPr>
-            <w:tcW w:type="dxa" w:w="2067"/>
+            <w:tcW w:type="dxa" w:w="1600"/>
             <w:tcBorders>
               <w:top w:val="single" w:color="BBBBBB" w:sz="1"/>
               <w:left w:val="single" w:color="BBBBBB" w:sz="1"/>
@@ -10989,7 +10989,7 @@
         </w:tc>
         <w:tc>
           <w:tcPr>
-            <w:tcW w:type="dxa" w:w="2266"/>
+            <w:tcW w:type="dxa" w:w="1754"/>
             <w:tcBorders>
               <w:top w:val="single" w:color="BBBBBB" w:sz="1"/>
               <w:left w:val="single" w:color="BBBBBB" w:sz="1"/>
@@ -11011,7 +11011,7 @@
         </w:tc>
         <w:tc>
           <w:tcPr>
-            <w:tcW w:type="dxa" w:w="748"/>
+            <w:tcW w:type="dxa" w:w="2520"/>
             <w:tcBorders>
               <w:top w:val="single" w:color="BBBBBB" w:sz="1"/>
               <w:left w:val="single" w:color="BBBBBB" w:sz="1"/>
@@ -11038,7 +11038,7 @@
         </w:trPr>
         <w:tc>
           <w:tcPr>
-            <w:tcW w:type="dxa" w:w="1464"/>
+            <w:tcW w:type="dxa" w:w="1138"/>
             <w:tcBorders>
               <w:top w:val="single" w:color="BBBBBB" w:sz="1"/>
               <w:left w:val="single" w:color="BBBBBB" w:sz="1"/>
@@ -11082,7 +11082,7 @@
         </w:tc>
         <w:tc>
           <w:tcPr>
-            <w:tcW w:type="dxa" w:w="2067"/>
+            <w:tcW w:type="dxa" w:w="1600"/>
             <w:tcBorders>
               <w:top w:val="single" w:color="BBBBBB" w:sz="1"/>
               <w:left w:val="single" w:color="BBBBBB" w:sz="1"/>
@@ -11104,7 +11104,7 @@
         </w:tc>
         <w:tc>
           <w:tcPr>
-            <w:tcW w:type="dxa" w:w="2067"/>
+            <w:tcW w:type="dxa" w:w="1600"/>
             <w:tcBorders>
               <w:top w:val="single" w:color="BBBBBB" w:sz="1"/>
               <w:left w:val="single" w:color="BBBBBB" w:sz="1"/>
@@ -11126,7 +11126,7 @@
         </w:tc>
         <w:tc>
           <w:tcPr>
-            <w:tcW w:type="dxa" w:w="2266"/>
+            <w:tcW w:type="dxa" w:w="1754"/>
             <w:tcBorders>
               <w:top w:val="single" w:color="BBBBBB" w:sz="1"/>
               <w:left w:val="single" w:color="BBBBBB" w:sz="1"/>
@@ -11148,7 +11148,7 @@
         </w:tc>
         <w:tc>
           <w:tcPr>
-            <w:tcW w:type="dxa" w:w="748"/>
+            <w:tcW w:type="dxa" w:w="2520"/>
             <w:tcBorders>
               <w:top w:val="single" w:color="BBBBBB" w:sz="1"/>
               <w:left w:val="single" w:color="BBBBBB" w:sz="1"/>
@@ -11175,7 +11175,7 @@
         </w:trPr>
         <w:tc>
           <w:tcPr>
-            <w:tcW w:type="dxa" w:w="1464"/>
+            <w:tcW w:type="dxa" w:w="1138"/>
             <w:tcBorders>
               <w:top w:val="single" w:color="BBBBBB" w:sz="1"/>
               <w:left w:val="single" w:color="BBBBBB" w:sz="1"/>
@@ -11219,7 +11219,7 @@
         </w:tc>
         <w:tc>
           <w:tcPr>
-            <w:tcW w:type="dxa" w:w="2067"/>
+            <w:tcW w:type="dxa" w:w="1600"/>
             <w:tcBorders>
               <w:top w:val="single" w:color="BBBBBB" w:sz="1"/>
               <w:left w:val="single" w:color="BBBBBB" w:sz="1"/>
@@ -11241,7 +11241,7 @@
         </w:tc>
         <w:tc>
           <w:tcPr>
-            <w:tcW w:type="dxa" w:w="2067"/>
+            <w:tcW w:type="dxa" w:w="1600"/>
             <w:tcBorders>
               <w:top w:val="single" w:color="BBBBBB" w:sz="1"/>
               <w:left w:val="single" w:color="BBBBBB" w:sz="1"/>
@@ -11263,7 +11263,7 @@
         </w:tc>
         <w:tc>
           <w:tcPr>
-            <w:tcW w:type="dxa" w:w="2266"/>
+            <w:tcW w:type="dxa" w:w="1754"/>
             <w:tcBorders>
               <w:top w:val="single" w:color="BBBBBB" w:sz="1"/>
               <w:left w:val="single" w:color="BBBBBB" w:sz="1"/>
@@ -11285,7 +11285,7 @@
         </w:tc>
         <w:tc>
           <w:tcPr>
-            <w:tcW w:type="dxa" w:w="748"/>
+            <w:tcW w:type="dxa" w:w="2520"/>
             <w:tcBorders>
               <w:top w:val="single" w:color="BBBBBB" w:sz="1"/>
               <w:left w:val="single" w:color="BBBBBB" w:sz="1"/>
@@ -11312,7 +11312,7 @@
         </w:trPr>
         <w:tc>
           <w:tcPr>
-            <w:tcW w:type="dxa" w:w="1464"/>
+            <w:tcW w:type="dxa" w:w="1138"/>
             <w:tcBorders>
               <w:top w:val="single" w:color="BBBBBB" w:sz="1"/>
               <w:left w:val="single" w:color="BBBBBB" w:sz="1"/>
@@ -11356,7 +11356,7 @@
         </w:tc>
         <w:tc>
           <w:tcPr>
-            <w:tcW w:type="dxa" w:w="2067"/>
+            <w:tcW w:type="dxa" w:w="1600"/>
             <w:tcBorders>
               <w:top w:val="single" w:color="BBBBBB" w:sz="1"/>
               <w:left w:val="single" w:color="BBBBBB" w:sz="1"/>
@@ -11378,7 +11378,7 @@
         </w:tc>
         <w:tc>
           <w:tcPr>
-            <w:tcW w:type="dxa" w:w="2067"/>
+            <w:tcW w:type="dxa" w:w="1600"/>
             <w:tcBorders>
               <w:top w:val="single" w:color="BBBBBB" w:sz="1"/>
               <w:left w:val="single" w:color="BBBBBB" w:sz="1"/>
@@ -11400,7 +11400,7 @@
         </w:tc>
         <w:tc>
           <w:tcPr>
-            <w:tcW w:type="dxa" w:w="2266"/>
+            <w:tcW w:type="dxa" w:w="1754"/>
             <w:tcBorders>
               <w:top w:val="single" w:color="BBBBBB" w:sz="1"/>
               <w:left w:val="single" w:color="BBBBBB" w:sz="1"/>
@@ -11422,7 +11422,7 @@
         </w:tc>
         <w:tc>
           <w:tcPr>
-            <w:tcW w:type="dxa" w:w="748"/>
+            <w:tcW w:type="dxa" w:w="2520"/>
             <w:tcBorders>
               <w:top w:val="single" w:color="BBBBBB" w:sz="1"/>
               <w:left w:val="single" w:color="BBBBBB" w:sz="1"/>
@@ -11744,7 +11744,7 @@
           </w:tcPr>
           <w:p>
             <w:r>
-              <w:t xml:space="preserve">Web 摊分逐人取整</w:t>
+              <w:t xml:space="preserve">Web 摊分逐人取整（勘误）</w:t>
             </w:r>
           </w:p>
         </w:tc>
@@ -11766,7 +11766,17 @@
           </w:tcPr>
           <w:p>
             <w:r>
-              <w:t xml:space="preserve">读 `split.ts:38` `Math.round(amount*w/totalW)` 逐人四舍五入；原生 `LedgerModel.swift:34` 注释"余数给最后一人"。结论：Web 合计可能差 1 分</w:t>
+              <w:t xml:space="preserve">初稿仅 grep 到 `split.ts:38` 的 `Math.round` 即下结论"合计差 1 分"——复核全函数发现 `split.ts:35-36` 本有"最后一人吸收余数"，</w:t>
+            </w:r>
+            <w:r>
+              <w:rPr>
+                <w:b/>
+                <w:bCs/>
+              </w:rPr>
+              <w:t xml:space="preserve">总额恒守恒</w:t>
+            </w:r>
+            <w:r>
+              <w:t xml:space="preserve">；真实差异是非末位成员 Math.round vs 原生整除导致逐人金额可不同（50÷4 案例）。已改 Web 为 Math.floor，esbuild 编译真实 split.ts 与原生算法 11 组除不尽金额逐人比对全等</w:t>
             </w:r>
           </w:p>
         </w:tc>

</xml_diff>

<commit_message>
test: add in-memory mesh regression fixture + CI (closes G-ENG-1)
tests/mesh-fixture/ is a byte-faithful port of the BLE flood protocol
(13B header, 180B chunks, MAX_TTL=4, dedup-on-complete, ttl>1 relay)
plus an adjacency-based radio simulator. 15 assertions cover:
fragmentation/reassembly, diamond-topology dedup, 4-hop reach and
5-hop TTL exhaustion, MeshBus team filtering/truncation, real split.ts
per-member parity vs native algorithm, optimal-settlement amounts, and
protocol-constant drift checks against BleMesh.swift/BleMesh.kt.
New mesh-fixture.yml workflow runs it on every protocol/web change.
</commit_message>
<xml_diff>
--- a/docs/requirements/TrailMate-Gap分析与演进规划-v1.0.docx
+++ b/docs/requirements/TrailMate-Gap分析与演进规划-v1.0.docx
@@ -8529,12 +8529,12 @@
         </w:tblBorders>
       </w:tblPr>
       <w:tblGrid>
-        <w:gridCol w:w="1138"/>
+        <w:gridCol w:w="1031"/>
         <w:gridCol w:w="748"/>
-        <w:gridCol w:w="1600"/>
-        <w:gridCol w:w="1600"/>
-        <w:gridCol w:w="1754"/>
-        <w:gridCol w:w="2520"/>
+        <w:gridCol w:w="1446"/>
+        <w:gridCol w:w="1446"/>
+        <w:gridCol w:w="1584"/>
+        <w:gridCol w:w="3105"/>
       </w:tblGrid>
       <w:tr>
         <w:trPr>
@@ -8542,7 +8542,7 @@
         </w:trPr>
         <w:tc>
           <w:tcPr>
-            <w:tcW w:type="dxa" w:w="1138"/>
+            <w:tcW w:type="dxa" w:w="1031"/>
             <w:tcBorders>
               <w:top w:val="single" w:color="BBBBBB" w:sz="1"/>
               <w:left w:val="single" w:color="BBBBBB" w:sz="1"/>
@@ -8596,7 +8596,7 @@
         </w:tc>
         <w:tc>
           <w:tcPr>
-            <w:tcW w:type="dxa" w:w="1600"/>
+            <w:tcW w:type="dxa" w:w="1446"/>
             <w:tcBorders>
               <w:top w:val="single" w:color="BBBBBB" w:sz="1"/>
               <w:left w:val="single" w:color="BBBBBB" w:sz="1"/>
@@ -8623,7 +8623,7 @@
         </w:tc>
         <w:tc>
           <w:tcPr>
-            <w:tcW w:type="dxa" w:w="1600"/>
+            <w:tcW w:type="dxa" w:w="1446"/>
             <w:tcBorders>
               <w:top w:val="single" w:color="BBBBBB" w:sz="1"/>
               <w:left w:val="single" w:color="BBBBBB" w:sz="1"/>
@@ -8650,7 +8650,7 @@
         </w:tc>
         <w:tc>
           <w:tcPr>
-            <w:tcW w:type="dxa" w:w="1754"/>
+            <w:tcW w:type="dxa" w:w="1584"/>
             <w:tcBorders>
               <w:top w:val="single" w:color="BBBBBB" w:sz="1"/>
               <w:left w:val="single" w:color="BBBBBB" w:sz="1"/>
@@ -8677,7 +8677,7 @@
         </w:tc>
         <w:tc>
           <w:tcPr>
-            <w:tcW w:type="dxa" w:w="2520"/>
+            <w:tcW w:type="dxa" w:w="3105"/>
             <w:tcBorders>
               <w:top w:val="single" w:color="BBBBBB" w:sz="1"/>
               <w:left w:val="single" w:color="BBBBBB" w:sz="1"/>
@@ -8709,7 +8709,7 @@
         </w:trPr>
         <w:tc>
           <w:tcPr>
-            <w:tcW w:type="dxa" w:w="1138"/>
+            <w:tcW w:type="dxa" w:w="1031"/>
             <w:tcBorders>
               <w:top w:val="single" w:color="BBBBBB" w:sz="1"/>
               <w:left w:val="single" w:color="BBBBBB" w:sz="1"/>
@@ -8753,7 +8753,7 @@
         </w:tc>
         <w:tc>
           <w:tcPr>
-            <w:tcW w:type="dxa" w:w="1600"/>
+            <w:tcW w:type="dxa" w:w="1446"/>
             <w:tcBorders>
               <w:top w:val="single" w:color="BBBBBB" w:sz="1"/>
               <w:left w:val="single" w:color="BBBBBB" w:sz="1"/>
@@ -8775,7 +8775,7 @@
         </w:tc>
         <w:tc>
           <w:tcPr>
-            <w:tcW w:type="dxa" w:w="1600"/>
+            <w:tcW w:type="dxa" w:w="1446"/>
             <w:tcBorders>
               <w:top w:val="single" w:color="BBBBBB" w:sz="1"/>
               <w:left w:val="single" w:color="BBBBBB" w:sz="1"/>
@@ -8797,7 +8797,7 @@
         </w:tc>
         <w:tc>
           <w:tcPr>
-            <w:tcW w:type="dxa" w:w="1754"/>
+            <w:tcW w:type="dxa" w:w="1584"/>
             <w:tcBorders>
               <w:top w:val="single" w:color="BBBBBB" w:sz="1"/>
               <w:left w:val="single" w:color="BBBBBB" w:sz="1"/>
@@ -8819,7 +8819,7 @@
         </w:tc>
         <w:tc>
           <w:tcPr>
-            <w:tcW w:type="dxa" w:w="2520"/>
+            <w:tcW w:type="dxa" w:w="3105"/>
             <w:tcBorders>
               <w:top w:val="single" w:color="BBBBBB" w:sz="1"/>
               <w:left w:val="single" w:color="BBBBBB" w:sz="1"/>
@@ -8846,7 +8846,7 @@
         </w:trPr>
         <w:tc>
           <w:tcPr>
-            <w:tcW w:type="dxa" w:w="1138"/>
+            <w:tcW w:type="dxa" w:w="1031"/>
             <w:tcBorders>
               <w:top w:val="single" w:color="BBBBBB" w:sz="1"/>
               <w:left w:val="single" w:color="BBBBBB" w:sz="1"/>
@@ -8890,7 +8890,7 @@
         </w:tc>
         <w:tc>
           <w:tcPr>
-            <w:tcW w:type="dxa" w:w="1600"/>
+            <w:tcW w:type="dxa" w:w="1446"/>
             <w:tcBorders>
               <w:top w:val="single" w:color="BBBBBB" w:sz="1"/>
               <w:left w:val="single" w:color="BBBBBB" w:sz="1"/>
@@ -8912,7 +8912,7 @@
         </w:tc>
         <w:tc>
           <w:tcPr>
-            <w:tcW w:type="dxa" w:w="1600"/>
+            <w:tcW w:type="dxa" w:w="1446"/>
             <w:tcBorders>
               <w:top w:val="single" w:color="BBBBBB" w:sz="1"/>
               <w:left w:val="single" w:color="BBBBBB" w:sz="1"/>
@@ -8934,7 +8934,7 @@
         </w:tc>
         <w:tc>
           <w:tcPr>
-            <w:tcW w:type="dxa" w:w="1754"/>
+            <w:tcW w:type="dxa" w:w="1584"/>
             <w:tcBorders>
               <w:top w:val="single" w:color="BBBBBB" w:sz="1"/>
               <w:left w:val="single" w:color="BBBBBB" w:sz="1"/>
@@ -8956,7 +8956,7 @@
         </w:tc>
         <w:tc>
           <w:tcPr>
-            <w:tcW w:type="dxa" w:w="2520"/>
+            <w:tcW w:type="dxa" w:w="3105"/>
             <w:tcBorders>
               <w:top w:val="single" w:color="BBBBBB" w:sz="1"/>
               <w:left w:val="single" w:color="BBBBBB" w:sz="1"/>
@@ -8983,7 +8983,7 @@
         </w:trPr>
         <w:tc>
           <w:tcPr>
-            <w:tcW w:type="dxa" w:w="1138"/>
+            <w:tcW w:type="dxa" w:w="1031"/>
             <w:tcBorders>
               <w:top w:val="single" w:color="BBBBBB" w:sz="1"/>
               <w:left w:val="single" w:color="BBBBBB" w:sz="1"/>
@@ -9027,7 +9027,7 @@
         </w:tc>
         <w:tc>
           <w:tcPr>
-            <w:tcW w:type="dxa" w:w="1600"/>
+            <w:tcW w:type="dxa" w:w="1446"/>
             <w:tcBorders>
               <w:top w:val="single" w:color="BBBBBB" w:sz="1"/>
               <w:left w:val="single" w:color="BBBBBB" w:sz="1"/>
@@ -9049,7 +9049,7 @@
         </w:tc>
         <w:tc>
           <w:tcPr>
-            <w:tcW w:type="dxa" w:w="1600"/>
+            <w:tcW w:type="dxa" w:w="1446"/>
             <w:tcBorders>
               <w:top w:val="single" w:color="BBBBBB" w:sz="1"/>
               <w:left w:val="single" w:color="BBBBBB" w:sz="1"/>
@@ -9071,7 +9071,7 @@
         </w:tc>
         <w:tc>
           <w:tcPr>
-            <w:tcW w:type="dxa" w:w="1754"/>
+            <w:tcW w:type="dxa" w:w="1584"/>
             <w:tcBorders>
               <w:top w:val="single" w:color="BBBBBB" w:sz="1"/>
               <w:left w:val="single" w:color="BBBBBB" w:sz="1"/>
@@ -9093,7 +9093,7 @@
         </w:tc>
         <w:tc>
           <w:tcPr>
-            <w:tcW w:type="dxa" w:w="2520"/>
+            <w:tcW w:type="dxa" w:w="3105"/>
             <w:tcBorders>
               <w:top w:val="single" w:color="BBBBBB" w:sz="1"/>
               <w:left w:val="single" w:color="BBBBBB" w:sz="1"/>
@@ -9120,7 +9120,7 @@
         </w:trPr>
         <w:tc>
           <w:tcPr>
-            <w:tcW w:type="dxa" w:w="1138"/>
+            <w:tcW w:type="dxa" w:w="1031"/>
             <w:tcBorders>
               <w:top w:val="single" w:color="BBBBBB" w:sz="1"/>
               <w:left w:val="single" w:color="BBBBBB" w:sz="1"/>
@@ -9164,7 +9164,7 @@
         </w:tc>
         <w:tc>
           <w:tcPr>
-            <w:tcW w:type="dxa" w:w="1600"/>
+            <w:tcW w:type="dxa" w:w="1446"/>
             <w:tcBorders>
               <w:top w:val="single" w:color="BBBBBB" w:sz="1"/>
               <w:left w:val="single" w:color="BBBBBB" w:sz="1"/>
@@ -9186,7 +9186,7 @@
         </w:tc>
         <w:tc>
           <w:tcPr>
-            <w:tcW w:type="dxa" w:w="1600"/>
+            <w:tcW w:type="dxa" w:w="1446"/>
             <w:tcBorders>
               <w:top w:val="single" w:color="BBBBBB" w:sz="1"/>
               <w:left w:val="single" w:color="BBBBBB" w:sz="1"/>
@@ -9208,7 +9208,7 @@
         </w:tc>
         <w:tc>
           <w:tcPr>
-            <w:tcW w:type="dxa" w:w="1754"/>
+            <w:tcW w:type="dxa" w:w="1584"/>
             <w:tcBorders>
               <w:top w:val="single" w:color="BBBBBB" w:sz="1"/>
               <w:left w:val="single" w:color="BBBBBB" w:sz="1"/>
@@ -9230,7 +9230,7 @@
         </w:tc>
         <w:tc>
           <w:tcPr>
-            <w:tcW w:type="dxa" w:w="2520"/>
+            <w:tcW w:type="dxa" w:w="3105"/>
             <w:tcBorders>
               <w:top w:val="single" w:color="BBBBBB" w:sz="1"/>
               <w:left w:val="single" w:color="BBBBBB" w:sz="1"/>
@@ -9257,7 +9257,7 @@
         </w:trPr>
         <w:tc>
           <w:tcPr>
-            <w:tcW w:type="dxa" w:w="1138"/>
+            <w:tcW w:type="dxa" w:w="1031"/>
             <w:tcBorders>
               <w:top w:val="single" w:color="BBBBBB" w:sz="1"/>
               <w:left w:val="single" w:color="BBBBBB" w:sz="1"/>
@@ -9301,7 +9301,7 @@
         </w:tc>
         <w:tc>
           <w:tcPr>
-            <w:tcW w:type="dxa" w:w="1600"/>
+            <w:tcW w:type="dxa" w:w="1446"/>
             <w:tcBorders>
               <w:top w:val="single" w:color="BBBBBB" w:sz="1"/>
               <w:left w:val="single" w:color="BBBBBB" w:sz="1"/>
@@ -9323,7 +9323,7 @@
         </w:tc>
         <w:tc>
           <w:tcPr>
-            <w:tcW w:type="dxa" w:w="1600"/>
+            <w:tcW w:type="dxa" w:w="1446"/>
             <w:tcBorders>
               <w:top w:val="single" w:color="BBBBBB" w:sz="1"/>
               <w:left w:val="single" w:color="BBBBBB" w:sz="1"/>
@@ -9345,7 +9345,7 @@
         </w:tc>
         <w:tc>
           <w:tcPr>
-            <w:tcW w:type="dxa" w:w="1754"/>
+            <w:tcW w:type="dxa" w:w="1584"/>
             <w:tcBorders>
               <w:top w:val="single" w:color="BBBBBB" w:sz="1"/>
               <w:left w:val="single" w:color="BBBBBB" w:sz="1"/>
@@ -9367,7 +9367,7 @@
         </w:tc>
         <w:tc>
           <w:tcPr>
-            <w:tcW w:type="dxa" w:w="2520"/>
+            <w:tcW w:type="dxa" w:w="3105"/>
             <w:tcBorders>
               <w:top w:val="single" w:color="BBBBBB" w:sz="1"/>
               <w:left w:val="single" w:color="BBBBBB" w:sz="1"/>
@@ -9394,7 +9394,7 @@
         </w:trPr>
         <w:tc>
           <w:tcPr>
-            <w:tcW w:type="dxa" w:w="1138"/>
+            <w:tcW w:type="dxa" w:w="1031"/>
             <w:tcBorders>
               <w:top w:val="single" w:color="BBBBBB" w:sz="1"/>
               <w:left w:val="single" w:color="BBBBBB" w:sz="1"/>
@@ -9438,7 +9438,7 @@
         </w:tc>
         <w:tc>
           <w:tcPr>
-            <w:tcW w:type="dxa" w:w="1600"/>
+            <w:tcW w:type="dxa" w:w="1446"/>
             <w:tcBorders>
               <w:top w:val="single" w:color="BBBBBB" w:sz="1"/>
               <w:left w:val="single" w:color="BBBBBB" w:sz="1"/>
@@ -9460,7 +9460,7 @@
         </w:tc>
         <w:tc>
           <w:tcPr>
-            <w:tcW w:type="dxa" w:w="1600"/>
+            <w:tcW w:type="dxa" w:w="1446"/>
             <w:tcBorders>
               <w:top w:val="single" w:color="BBBBBB" w:sz="1"/>
               <w:left w:val="single" w:color="BBBBBB" w:sz="1"/>
@@ -9482,7 +9482,7 @@
         </w:tc>
         <w:tc>
           <w:tcPr>
-            <w:tcW w:type="dxa" w:w="1754"/>
+            <w:tcW w:type="dxa" w:w="1584"/>
             <w:tcBorders>
               <w:top w:val="single" w:color="BBBBBB" w:sz="1"/>
               <w:left w:val="single" w:color="BBBBBB" w:sz="1"/>
@@ -9504,7 +9504,7 @@
         </w:tc>
         <w:tc>
           <w:tcPr>
-            <w:tcW w:type="dxa" w:w="2520"/>
+            <w:tcW w:type="dxa" w:w="3105"/>
             <w:tcBorders>
               <w:top w:val="single" w:color="BBBBBB" w:sz="1"/>
               <w:left w:val="single" w:color="BBBBBB" w:sz="1"/>
@@ -9531,7 +9531,7 @@
         </w:trPr>
         <w:tc>
           <w:tcPr>
-            <w:tcW w:type="dxa" w:w="1138"/>
+            <w:tcW w:type="dxa" w:w="1031"/>
             <w:tcBorders>
               <w:top w:val="single" w:color="BBBBBB" w:sz="1"/>
               <w:left w:val="single" w:color="BBBBBB" w:sz="1"/>
@@ -9575,7 +9575,7 @@
         </w:tc>
         <w:tc>
           <w:tcPr>
-            <w:tcW w:type="dxa" w:w="1600"/>
+            <w:tcW w:type="dxa" w:w="1446"/>
             <w:tcBorders>
               <w:top w:val="single" w:color="BBBBBB" w:sz="1"/>
               <w:left w:val="single" w:color="BBBBBB" w:sz="1"/>
@@ -9597,7 +9597,7 @@
         </w:tc>
         <w:tc>
           <w:tcPr>
-            <w:tcW w:type="dxa" w:w="1600"/>
+            <w:tcW w:type="dxa" w:w="1446"/>
             <w:tcBorders>
               <w:top w:val="single" w:color="BBBBBB" w:sz="1"/>
               <w:left w:val="single" w:color="BBBBBB" w:sz="1"/>
@@ -9619,7 +9619,7 @@
         </w:tc>
         <w:tc>
           <w:tcPr>
-            <w:tcW w:type="dxa" w:w="1754"/>
+            <w:tcW w:type="dxa" w:w="1584"/>
             <w:tcBorders>
               <w:top w:val="single" w:color="BBBBBB" w:sz="1"/>
               <w:left w:val="single" w:color="BBBBBB" w:sz="1"/>
@@ -9641,7 +9641,7 @@
         </w:tc>
         <w:tc>
           <w:tcPr>
-            <w:tcW w:type="dxa" w:w="2520"/>
+            <w:tcW w:type="dxa" w:w="3105"/>
             <w:tcBorders>
               <w:top w:val="single" w:color="BBBBBB" w:sz="1"/>
               <w:left w:val="single" w:color="BBBBBB" w:sz="1"/>
@@ -9668,7 +9668,7 @@
         </w:trPr>
         <w:tc>
           <w:tcPr>
-            <w:tcW w:type="dxa" w:w="1138"/>
+            <w:tcW w:type="dxa" w:w="1031"/>
             <w:tcBorders>
               <w:top w:val="single" w:color="BBBBBB" w:sz="1"/>
               <w:left w:val="single" w:color="BBBBBB" w:sz="1"/>
@@ -9712,7 +9712,7 @@
         </w:tc>
         <w:tc>
           <w:tcPr>
-            <w:tcW w:type="dxa" w:w="1600"/>
+            <w:tcW w:type="dxa" w:w="1446"/>
             <w:tcBorders>
               <w:top w:val="single" w:color="BBBBBB" w:sz="1"/>
               <w:left w:val="single" w:color="BBBBBB" w:sz="1"/>
@@ -9734,7 +9734,7 @@
         </w:tc>
         <w:tc>
           <w:tcPr>
-            <w:tcW w:type="dxa" w:w="1600"/>
+            <w:tcW w:type="dxa" w:w="1446"/>
             <w:tcBorders>
               <w:top w:val="single" w:color="BBBBBB" w:sz="1"/>
               <w:left w:val="single" w:color="BBBBBB" w:sz="1"/>
@@ -9756,7 +9756,7 @@
         </w:tc>
         <w:tc>
           <w:tcPr>
-            <w:tcW w:type="dxa" w:w="1754"/>
+            <w:tcW w:type="dxa" w:w="1584"/>
             <w:tcBorders>
               <w:top w:val="single" w:color="BBBBBB" w:sz="1"/>
               <w:left w:val="single" w:color="BBBBBB" w:sz="1"/>
@@ -9778,7 +9778,7 @@
         </w:tc>
         <w:tc>
           <w:tcPr>
-            <w:tcW w:type="dxa" w:w="2520"/>
+            <w:tcW w:type="dxa" w:w="3105"/>
             <w:tcBorders>
               <w:top w:val="single" w:color="BBBBBB" w:sz="1"/>
               <w:left w:val="single" w:color="BBBBBB" w:sz="1"/>
@@ -9805,7 +9805,7 @@
         </w:trPr>
         <w:tc>
           <w:tcPr>
-            <w:tcW w:type="dxa" w:w="1138"/>
+            <w:tcW w:type="dxa" w:w="1031"/>
             <w:tcBorders>
               <w:top w:val="single" w:color="BBBBBB" w:sz="1"/>
               <w:left w:val="single" w:color="BBBBBB" w:sz="1"/>
@@ -9849,7 +9849,7 @@
         </w:tc>
         <w:tc>
           <w:tcPr>
-            <w:tcW w:type="dxa" w:w="1600"/>
+            <w:tcW w:type="dxa" w:w="1446"/>
             <w:tcBorders>
               <w:top w:val="single" w:color="BBBBBB" w:sz="1"/>
               <w:left w:val="single" w:color="BBBBBB" w:sz="1"/>
@@ -9871,7 +9871,7 @@
         </w:tc>
         <w:tc>
           <w:tcPr>
-            <w:tcW w:type="dxa" w:w="1600"/>
+            <w:tcW w:type="dxa" w:w="1446"/>
             <w:tcBorders>
               <w:top w:val="single" w:color="BBBBBB" w:sz="1"/>
               <w:left w:val="single" w:color="BBBBBB" w:sz="1"/>
@@ -9893,7 +9893,7 @@
         </w:tc>
         <w:tc>
           <w:tcPr>
-            <w:tcW w:type="dxa" w:w="1754"/>
+            <w:tcW w:type="dxa" w:w="1584"/>
             <w:tcBorders>
               <w:top w:val="single" w:color="BBBBBB" w:sz="1"/>
               <w:left w:val="single" w:color="BBBBBB" w:sz="1"/>
@@ -9915,7 +9915,7 @@
         </w:tc>
         <w:tc>
           <w:tcPr>
-            <w:tcW w:type="dxa" w:w="2520"/>
+            <w:tcW w:type="dxa" w:w="3105"/>
             <w:tcBorders>
               <w:top w:val="single" w:color="BBBBBB" w:sz="1"/>
               <w:left w:val="single" w:color="BBBBBB" w:sz="1"/>
@@ -9942,7 +9942,7 @@
         </w:trPr>
         <w:tc>
           <w:tcPr>
-            <w:tcW w:type="dxa" w:w="1138"/>
+            <w:tcW w:type="dxa" w:w="1031"/>
             <w:tcBorders>
               <w:top w:val="single" w:color="BBBBBB" w:sz="1"/>
               <w:left w:val="single" w:color="BBBBBB" w:sz="1"/>
@@ -9986,7 +9986,7 @@
         </w:tc>
         <w:tc>
           <w:tcPr>
-            <w:tcW w:type="dxa" w:w="1600"/>
+            <w:tcW w:type="dxa" w:w="1446"/>
             <w:tcBorders>
               <w:top w:val="single" w:color="BBBBBB" w:sz="1"/>
               <w:left w:val="single" w:color="BBBBBB" w:sz="1"/>
@@ -10008,7 +10008,7 @@
         </w:tc>
         <w:tc>
           <w:tcPr>
-            <w:tcW w:type="dxa" w:w="1600"/>
+            <w:tcW w:type="dxa" w:w="1446"/>
             <w:tcBorders>
               <w:top w:val="single" w:color="BBBBBB" w:sz="1"/>
               <w:left w:val="single" w:color="BBBBBB" w:sz="1"/>
@@ -10030,7 +10030,7 @@
         </w:tc>
         <w:tc>
           <w:tcPr>
-            <w:tcW w:type="dxa" w:w="1754"/>
+            <w:tcW w:type="dxa" w:w="1584"/>
             <w:tcBorders>
               <w:top w:val="single" w:color="BBBBBB" w:sz="1"/>
               <w:left w:val="single" w:color="BBBBBB" w:sz="1"/>
@@ -10052,7 +10052,7 @@
         </w:tc>
         <w:tc>
           <w:tcPr>
-            <w:tcW w:type="dxa" w:w="2520"/>
+            <w:tcW w:type="dxa" w:w="3105"/>
             <w:tcBorders>
               <w:top w:val="single" w:color="BBBBBB" w:sz="1"/>
               <w:left w:val="single" w:color="BBBBBB" w:sz="1"/>
@@ -10079,7 +10079,7 @@
         </w:trPr>
         <w:tc>
           <w:tcPr>
-            <w:tcW w:type="dxa" w:w="1138"/>
+            <w:tcW w:type="dxa" w:w="1031"/>
             <w:tcBorders>
               <w:top w:val="single" w:color="BBBBBB" w:sz="1"/>
               <w:left w:val="single" w:color="BBBBBB" w:sz="1"/>
@@ -10123,7 +10123,7 @@
         </w:tc>
         <w:tc>
           <w:tcPr>
-            <w:tcW w:type="dxa" w:w="1600"/>
+            <w:tcW w:type="dxa" w:w="1446"/>
             <w:tcBorders>
               <w:top w:val="single" w:color="BBBBBB" w:sz="1"/>
               <w:left w:val="single" w:color="BBBBBB" w:sz="1"/>
@@ -10145,7 +10145,7 @@
         </w:tc>
         <w:tc>
           <w:tcPr>
-            <w:tcW w:type="dxa" w:w="1600"/>
+            <w:tcW w:type="dxa" w:w="1446"/>
             <w:tcBorders>
               <w:top w:val="single" w:color="BBBBBB" w:sz="1"/>
               <w:left w:val="single" w:color="BBBBBB" w:sz="1"/>
@@ -10167,7 +10167,7 @@
         </w:tc>
         <w:tc>
           <w:tcPr>
-            <w:tcW w:type="dxa" w:w="1754"/>
+            <w:tcW w:type="dxa" w:w="1584"/>
             <w:tcBorders>
               <w:top w:val="single" w:color="BBBBBB" w:sz="1"/>
               <w:left w:val="single" w:color="BBBBBB" w:sz="1"/>
@@ -10189,7 +10189,7 @@
         </w:tc>
         <w:tc>
           <w:tcPr>
-            <w:tcW w:type="dxa" w:w="2520"/>
+            <w:tcW w:type="dxa" w:w="3105"/>
             <w:tcBorders>
               <w:top w:val="single" w:color="BBBBBB" w:sz="1"/>
               <w:left w:val="single" w:color="BBBBBB" w:sz="1"/>
@@ -10216,7 +10216,7 @@
         </w:trPr>
         <w:tc>
           <w:tcPr>
-            <w:tcW w:type="dxa" w:w="1138"/>
+            <w:tcW w:type="dxa" w:w="1031"/>
             <w:tcBorders>
               <w:top w:val="single" w:color="BBBBBB" w:sz="1"/>
               <w:left w:val="single" w:color="BBBBBB" w:sz="1"/>
@@ -10260,7 +10260,7 @@
         </w:tc>
         <w:tc>
           <w:tcPr>
-            <w:tcW w:type="dxa" w:w="1600"/>
+            <w:tcW w:type="dxa" w:w="1446"/>
             <w:tcBorders>
               <w:top w:val="single" w:color="BBBBBB" w:sz="1"/>
               <w:left w:val="single" w:color="BBBBBB" w:sz="1"/>
@@ -10282,7 +10282,7 @@
         </w:tc>
         <w:tc>
           <w:tcPr>
-            <w:tcW w:type="dxa" w:w="1600"/>
+            <w:tcW w:type="dxa" w:w="1446"/>
             <w:tcBorders>
               <w:top w:val="single" w:color="BBBBBB" w:sz="1"/>
               <w:left w:val="single" w:color="BBBBBB" w:sz="1"/>
@@ -10304,7 +10304,7 @@
         </w:tc>
         <w:tc>
           <w:tcPr>
-            <w:tcW w:type="dxa" w:w="1754"/>
+            <w:tcW w:type="dxa" w:w="1584"/>
             <w:tcBorders>
               <w:top w:val="single" w:color="BBBBBB" w:sz="1"/>
               <w:left w:val="single" w:color="BBBBBB" w:sz="1"/>
@@ -10326,7 +10326,7 @@
         </w:tc>
         <w:tc>
           <w:tcPr>
-            <w:tcW w:type="dxa" w:w="2520"/>
+            <w:tcW w:type="dxa" w:w="3105"/>
             <w:tcBorders>
               <w:top w:val="single" w:color="BBBBBB" w:sz="1"/>
               <w:left w:val="single" w:color="BBBBBB" w:sz="1"/>
@@ -10353,7 +10353,7 @@
         </w:trPr>
         <w:tc>
           <w:tcPr>
-            <w:tcW w:type="dxa" w:w="1138"/>
+            <w:tcW w:type="dxa" w:w="1031"/>
             <w:tcBorders>
               <w:top w:val="single" w:color="BBBBBB" w:sz="1"/>
               <w:left w:val="single" w:color="BBBBBB" w:sz="1"/>
@@ -10397,7 +10397,7 @@
         </w:tc>
         <w:tc>
           <w:tcPr>
-            <w:tcW w:type="dxa" w:w="1600"/>
+            <w:tcW w:type="dxa" w:w="1446"/>
             <w:tcBorders>
               <w:top w:val="single" w:color="BBBBBB" w:sz="1"/>
               <w:left w:val="single" w:color="BBBBBB" w:sz="1"/>
@@ -10419,7 +10419,7 @@
         </w:tc>
         <w:tc>
           <w:tcPr>
-            <w:tcW w:type="dxa" w:w="1600"/>
+            <w:tcW w:type="dxa" w:w="1446"/>
             <w:tcBorders>
               <w:top w:val="single" w:color="BBBBBB" w:sz="1"/>
               <w:left w:val="single" w:color="BBBBBB" w:sz="1"/>
@@ -10441,7 +10441,7 @@
         </w:tc>
         <w:tc>
           <w:tcPr>
-            <w:tcW w:type="dxa" w:w="1754"/>
+            <w:tcW w:type="dxa" w:w="1584"/>
             <w:tcBorders>
               <w:top w:val="single" w:color="BBBBBB" w:sz="1"/>
               <w:left w:val="single" w:color="BBBBBB" w:sz="1"/>
@@ -10463,7 +10463,7 @@
         </w:tc>
         <w:tc>
           <w:tcPr>
-            <w:tcW w:type="dxa" w:w="2520"/>
+            <w:tcW w:type="dxa" w:w="3105"/>
             <w:tcBorders>
               <w:top w:val="single" w:color="BBBBBB" w:sz="1"/>
               <w:left w:val="single" w:color="BBBBBB" w:sz="1"/>
@@ -10490,7 +10490,7 @@
         </w:trPr>
         <w:tc>
           <w:tcPr>
-            <w:tcW w:type="dxa" w:w="1138"/>
+            <w:tcW w:type="dxa" w:w="1031"/>
             <w:tcBorders>
               <w:top w:val="single" w:color="BBBBBB" w:sz="1"/>
               <w:left w:val="single" w:color="BBBBBB" w:sz="1"/>
@@ -10534,7 +10534,7 @@
         </w:tc>
         <w:tc>
           <w:tcPr>
-            <w:tcW w:type="dxa" w:w="1600"/>
+            <w:tcW w:type="dxa" w:w="1446"/>
             <w:tcBorders>
               <w:top w:val="single" w:color="BBBBBB" w:sz="1"/>
               <w:left w:val="single" w:color="BBBBBB" w:sz="1"/>
@@ -10556,7 +10556,7 @@
         </w:tc>
         <w:tc>
           <w:tcPr>
-            <w:tcW w:type="dxa" w:w="1600"/>
+            <w:tcW w:type="dxa" w:w="1446"/>
             <w:tcBorders>
               <w:top w:val="single" w:color="BBBBBB" w:sz="1"/>
               <w:left w:val="single" w:color="BBBBBB" w:sz="1"/>
@@ -10578,7 +10578,7 @@
         </w:tc>
         <w:tc>
           <w:tcPr>
-            <w:tcW w:type="dxa" w:w="1754"/>
+            <w:tcW w:type="dxa" w:w="1584"/>
             <w:tcBorders>
               <w:top w:val="single" w:color="BBBBBB" w:sz="1"/>
               <w:left w:val="single" w:color="BBBBBB" w:sz="1"/>
@@ -10600,7 +10600,7 @@
         </w:tc>
         <w:tc>
           <w:tcPr>
-            <w:tcW w:type="dxa" w:w="2520"/>
+            <w:tcW w:type="dxa" w:w="3105"/>
             <w:tcBorders>
               <w:top w:val="single" w:color="BBBBBB" w:sz="1"/>
               <w:left w:val="single" w:color="BBBBBB" w:sz="1"/>
@@ -10627,7 +10627,7 @@
         </w:trPr>
         <w:tc>
           <w:tcPr>
-            <w:tcW w:type="dxa" w:w="1138"/>
+            <w:tcW w:type="dxa" w:w="1031"/>
             <w:tcBorders>
               <w:top w:val="single" w:color="BBBBBB" w:sz="1"/>
               <w:left w:val="single" w:color="BBBBBB" w:sz="1"/>
@@ -10671,7 +10671,7 @@
         </w:tc>
         <w:tc>
           <w:tcPr>
-            <w:tcW w:type="dxa" w:w="1600"/>
+            <w:tcW w:type="dxa" w:w="1446"/>
             <w:tcBorders>
               <w:top w:val="single" w:color="BBBBBB" w:sz="1"/>
               <w:left w:val="single" w:color="BBBBBB" w:sz="1"/>
@@ -10693,7 +10693,7 @@
         </w:tc>
         <w:tc>
           <w:tcPr>
-            <w:tcW w:type="dxa" w:w="1600"/>
+            <w:tcW w:type="dxa" w:w="1446"/>
             <w:tcBorders>
               <w:top w:val="single" w:color="BBBBBB" w:sz="1"/>
               <w:left w:val="single" w:color="BBBBBB" w:sz="1"/>
@@ -10715,7 +10715,7 @@
         </w:tc>
         <w:tc>
           <w:tcPr>
-            <w:tcW w:type="dxa" w:w="1754"/>
+            <w:tcW w:type="dxa" w:w="1584"/>
             <w:tcBorders>
               <w:top w:val="single" w:color="BBBBBB" w:sz="1"/>
               <w:left w:val="single" w:color="BBBBBB" w:sz="1"/>
@@ -10737,7 +10737,7 @@
         </w:tc>
         <w:tc>
           <w:tcPr>
-            <w:tcW w:type="dxa" w:w="2520"/>
+            <w:tcW w:type="dxa" w:w="3105"/>
             <w:tcBorders>
               <w:top w:val="single" w:color="BBBBBB" w:sz="1"/>
               <w:left w:val="single" w:color="BBBBBB" w:sz="1"/>
@@ -10764,7 +10764,7 @@
         </w:trPr>
         <w:tc>
           <w:tcPr>
-            <w:tcW w:type="dxa" w:w="1138"/>
+            <w:tcW w:type="dxa" w:w="1031"/>
             <w:tcBorders>
               <w:top w:val="single" w:color="BBBBBB" w:sz="1"/>
               <w:left w:val="single" w:color="BBBBBB" w:sz="1"/>
@@ -10808,7 +10808,7 @@
         </w:tc>
         <w:tc>
           <w:tcPr>
-            <w:tcW w:type="dxa" w:w="1600"/>
+            <w:tcW w:type="dxa" w:w="1446"/>
             <w:tcBorders>
               <w:top w:val="single" w:color="BBBBBB" w:sz="1"/>
               <w:left w:val="single" w:color="BBBBBB" w:sz="1"/>
@@ -10830,7 +10830,7 @@
         </w:tc>
         <w:tc>
           <w:tcPr>
-            <w:tcW w:type="dxa" w:w="1600"/>
+            <w:tcW w:type="dxa" w:w="1446"/>
             <w:tcBorders>
               <w:top w:val="single" w:color="BBBBBB" w:sz="1"/>
               <w:left w:val="single" w:color="BBBBBB" w:sz="1"/>
@@ -10852,7 +10852,7 @@
         </w:tc>
         <w:tc>
           <w:tcPr>
-            <w:tcW w:type="dxa" w:w="1754"/>
+            <w:tcW w:type="dxa" w:w="1584"/>
             <w:tcBorders>
               <w:top w:val="single" w:color="BBBBBB" w:sz="1"/>
               <w:left w:val="single" w:color="BBBBBB" w:sz="1"/>
@@ -10874,7 +10874,7 @@
         </w:tc>
         <w:tc>
           <w:tcPr>
-            <w:tcW w:type="dxa" w:w="2520"/>
+            <w:tcW w:type="dxa" w:w="3105"/>
             <w:tcBorders>
               <w:top w:val="single" w:color="BBBBBB" w:sz="1"/>
               <w:left w:val="single" w:color="BBBBBB" w:sz="1"/>
@@ -10901,7 +10901,7 @@
         </w:trPr>
         <w:tc>
           <w:tcPr>
-            <w:tcW w:type="dxa" w:w="1138"/>
+            <w:tcW w:type="dxa" w:w="1031"/>
             <w:tcBorders>
               <w:top w:val="single" w:color="BBBBBB" w:sz="1"/>
               <w:left w:val="single" w:color="BBBBBB" w:sz="1"/>
@@ -10945,7 +10945,7 @@
         </w:tc>
         <w:tc>
           <w:tcPr>
-            <w:tcW w:type="dxa" w:w="1600"/>
+            <w:tcW w:type="dxa" w:w="1446"/>
             <w:tcBorders>
               <w:top w:val="single" w:color="BBBBBB" w:sz="1"/>
               <w:left w:val="single" w:color="BBBBBB" w:sz="1"/>
@@ -10967,7 +10967,7 @@
         </w:tc>
         <w:tc>
           <w:tcPr>
-            <w:tcW w:type="dxa" w:w="1600"/>
+            <w:tcW w:type="dxa" w:w="1446"/>
             <w:tcBorders>
               <w:top w:val="single" w:color="BBBBBB" w:sz="1"/>
               <w:left w:val="single" w:color="BBBBBB" w:sz="1"/>
@@ -10989,7 +10989,7 @@
         </w:tc>
         <w:tc>
           <w:tcPr>
-            <w:tcW w:type="dxa" w:w="1754"/>
+            <w:tcW w:type="dxa" w:w="1584"/>
             <w:tcBorders>
               <w:top w:val="single" w:color="BBBBBB" w:sz="1"/>
               <w:left w:val="single" w:color="BBBBBB" w:sz="1"/>
@@ -11011,7 +11011,7 @@
         </w:tc>
         <w:tc>
           <w:tcPr>
-            <w:tcW w:type="dxa" w:w="2520"/>
+            <w:tcW w:type="dxa" w:w="3105"/>
             <w:tcBorders>
               <w:top w:val="single" w:color="BBBBBB" w:sz="1"/>
               <w:left w:val="single" w:color="BBBBBB" w:sz="1"/>
@@ -11038,7 +11038,7 @@
         </w:trPr>
         <w:tc>
           <w:tcPr>
-            <w:tcW w:type="dxa" w:w="1138"/>
+            <w:tcW w:type="dxa" w:w="1031"/>
             <w:tcBorders>
               <w:top w:val="single" w:color="BBBBBB" w:sz="1"/>
               <w:left w:val="single" w:color="BBBBBB" w:sz="1"/>
@@ -11082,7 +11082,7 @@
         </w:tc>
         <w:tc>
           <w:tcPr>
-            <w:tcW w:type="dxa" w:w="1600"/>
+            <w:tcW w:type="dxa" w:w="1446"/>
             <w:tcBorders>
               <w:top w:val="single" w:color="BBBBBB" w:sz="1"/>
               <w:left w:val="single" w:color="BBBBBB" w:sz="1"/>
@@ -11104,7 +11104,7 @@
         </w:tc>
         <w:tc>
           <w:tcPr>
-            <w:tcW w:type="dxa" w:w="1600"/>
+            <w:tcW w:type="dxa" w:w="1446"/>
             <w:tcBorders>
               <w:top w:val="single" w:color="BBBBBB" w:sz="1"/>
               <w:left w:val="single" w:color="BBBBBB" w:sz="1"/>
@@ -11126,7 +11126,7 @@
         </w:tc>
         <w:tc>
           <w:tcPr>
-            <w:tcW w:type="dxa" w:w="1754"/>
+            <w:tcW w:type="dxa" w:w="1584"/>
             <w:tcBorders>
               <w:top w:val="single" w:color="BBBBBB" w:sz="1"/>
               <w:left w:val="single" w:color="BBBBBB" w:sz="1"/>
@@ -11148,23 +11148,23 @@
         </w:tc>
         <w:tc>
           <w:tcPr>
-            <w:tcW w:type="dxa" w:w="2520"/>
-            <w:tcBorders>
-              <w:top w:val="single" w:color="BBBBBB" w:sz="1"/>
-              <w:left w:val="single" w:color="BBBBBB" w:sz="1"/>
-              <w:bottom w:val="single" w:color="BBBBBB" w:sz="1"/>
-              <w:right w:val="single" w:color="BBBBBB" w:sz="1"/>
-            </w:tcBorders>
-            <w:tcMar>
-              <w:top w:type="dxa" w:w="60"/>
-              <w:left w:type="dxa" w:w="100"/>
-              <w:bottom w:type="dxa" w:w="60"/>
-              <w:right w:type="dxa" w:w="100"/>
-            </w:tcMar>
-          </w:tcPr>
-          <w:p>
-            <w:r>
-              <w:t xml:space="preserve">未启动</w:t>
+            <w:tcW w:type="dxa" w:w="3105"/>
+            <w:tcBorders>
+              <w:top w:val="single" w:color="BBBBBB" w:sz="1"/>
+              <w:left w:val="single" w:color="BBBBBB" w:sz="1"/>
+              <w:bottom w:val="single" w:color="BBBBBB" w:sz="1"/>
+              <w:right w:val="single" w:color="BBBBBB" w:sz="1"/>
+            </w:tcBorders>
+            <w:tcMar>
+              <w:top w:type="dxa" w:w="60"/>
+              <w:left w:type="dxa" w:w="100"/>
+              <w:bottom w:type="dxa" w:w="60"/>
+              <w:right w:type="dxa" w:w="100"/>
+            </w:tcMar>
+          </w:tcPr>
+          <w:p>
+            <w:r>
+              <w:t xml:space="preserve">已关闭（夹具 15 项断言 + CI 常驻）</w:t>
             </w:r>
           </w:p>
         </w:tc>
@@ -11175,7 +11175,7 @@
         </w:trPr>
         <w:tc>
           <w:tcPr>
-            <w:tcW w:type="dxa" w:w="1138"/>
+            <w:tcW w:type="dxa" w:w="1031"/>
             <w:tcBorders>
               <w:top w:val="single" w:color="BBBBBB" w:sz="1"/>
               <w:left w:val="single" w:color="BBBBBB" w:sz="1"/>
@@ -11219,7 +11219,7 @@
         </w:tc>
         <w:tc>
           <w:tcPr>
-            <w:tcW w:type="dxa" w:w="1600"/>
+            <w:tcW w:type="dxa" w:w="1446"/>
             <w:tcBorders>
               <w:top w:val="single" w:color="BBBBBB" w:sz="1"/>
               <w:left w:val="single" w:color="BBBBBB" w:sz="1"/>
@@ -11241,7 +11241,7 @@
         </w:tc>
         <w:tc>
           <w:tcPr>
-            <w:tcW w:type="dxa" w:w="1600"/>
+            <w:tcW w:type="dxa" w:w="1446"/>
             <w:tcBorders>
               <w:top w:val="single" w:color="BBBBBB" w:sz="1"/>
               <w:left w:val="single" w:color="BBBBBB" w:sz="1"/>
@@ -11263,7 +11263,7 @@
         </w:tc>
         <w:tc>
           <w:tcPr>
-            <w:tcW w:type="dxa" w:w="1754"/>
+            <w:tcW w:type="dxa" w:w="1584"/>
             <w:tcBorders>
               <w:top w:val="single" w:color="BBBBBB" w:sz="1"/>
               <w:left w:val="single" w:color="BBBBBB" w:sz="1"/>
@@ -11285,7 +11285,7 @@
         </w:tc>
         <w:tc>
           <w:tcPr>
-            <w:tcW w:type="dxa" w:w="2520"/>
+            <w:tcW w:type="dxa" w:w="3105"/>
             <w:tcBorders>
               <w:top w:val="single" w:color="BBBBBB" w:sz="1"/>
               <w:left w:val="single" w:color="BBBBBB" w:sz="1"/>
@@ -11312,7 +11312,7 @@
         </w:trPr>
         <w:tc>
           <w:tcPr>
-            <w:tcW w:type="dxa" w:w="1138"/>
+            <w:tcW w:type="dxa" w:w="1031"/>
             <w:tcBorders>
               <w:top w:val="single" w:color="BBBBBB" w:sz="1"/>
               <w:left w:val="single" w:color="BBBBBB" w:sz="1"/>
@@ -11356,7 +11356,7 @@
         </w:tc>
         <w:tc>
           <w:tcPr>
-            <w:tcW w:type="dxa" w:w="1600"/>
+            <w:tcW w:type="dxa" w:w="1446"/>
             <w:tcBorders>
               <w:top w:val="single" w:color="BBBBBB" w:sz="1"/>
               <w:left w:val="single" w:color="BBBBBB" w:sz="1"/>
@@ -11378,7 +11378,7 @@
         </w:tc>
         <w:tc>
           <w:tcPr>
-            <w:tcW w:type="dxa" w:w="1600"/>
+            <w:tcW w:type="dxa" w:w="1446"/>
             <w:tcBorders>
               <w:top w:val="single" w:color="BBBBBB" w:sz="1"/>
               <w:left w:val="single" w:color="BBBBBB" w:sz="1"/>
@@ -11400,7 +11400,7 @@
         </w:tc>
         <w:tc>
           <w:tcPr>
-            <w:tcW w:type="dxa" w:w="1754"/>
+            <w:tcW w:type="dxa" w:w="1584"/>
             <w:tcBorders>
               <w:top w:val="single" w:color="BBBBBB" w:sz="1"/>
               <w:left w:val="single" w:color="BBBBBB" w:sz="1"/>
@@ -11422,7 +11422,7 @@
         </w:tc>
         <w:tc>
           <w:tcPr>
-            <w:tcW w:type="dxa" w:w="2520"/>
+            <w:tcW w:type="dxa" w:w="3105"/>
             <w:tcBorders>
               <w:top w:val="single" w:color="BBBBBB" w:sz="1"/>
               <w:left w:val="single" w:color="BBBBBB" w:sz="1"/>

</xml_diff>

<commit_message>
feat: E1 groundwork — link-health warnings + ledger backup (PR-P1-1/1-2/1-5)
Camp link health (all ends honest about silent failures):
- Android: BroadcastReceiver on ACTION_STATE_CHANGED shows an error
  status the moment Bluetooth turns off, auto-recovers on re-enable;
  sending with zero neighbors surfaces a delivery warning
- iOS: BleMeshDelegate gains bleMeshDidUpdateState; MeshBus exposes
  onState/btAvailable; Camp shows red bar-button when Bluetooth is off
  and appends a system line when sending with no neighbors/BT off

Ledger backup (G-LG-1):
- Android LedgerStore export/import JSON + 备份 dialog (share / paste)
- iOS LedgerStore exportJson/importJson + 备份 action sheet
- Web backup.ts (magic/version-validated) + store importState action +
  Groups export-download/import-file buttons

Fixture grows to 19 assertions: backup roundtrip deep-equality,
corrupt/missing-magic rejection, activeGroupId fallback.
</commit_message>
<xml_diff>
--- a/docs/requirements/TrailMate-Gap分析与演进规划-v1.0.docx
+++ b/docs/requirements/TrailMate-Gap分析与演进规划-v1.0.docx
@@ -8529,12 +8529,12 @@
         </w:tblBorders>
       </w:tblPr>
       <w:tblGrid>
-        <w:gridCol w:w="1031"/>
+        <w:gridCol w:w="753"/>
         <w:gridCol w:w="748"/>
-        <w:gridCol w:w="1446"/>
-        <w:gridCol w:w="1446"/>
-        <w:gridCol w:w="1584"/>
-        <w:gridCol w:w="3105"/>
+        <w:gridCol w:w="1043"/>
+        <w:gridCol w:w="1043"/>
+        <w:gridCol w:w="1141"/>
+        <w:gridCol w:w="4632"/>
       </w:tblGrid>
       <w:tr>
         <w:trPr>
@@ -8542,7 +8542,7 @@
         </w:trPr>
         <w:tc>
           <w:tcPr>
-            <w:tcW w:type="dxa" w:w="1031"/>
+            <w:tcW w:type="dxa" w:w="753"/>
             <w:tcBorders>
               <w:top w:val="single" w:color="BBBBBB" w:sz="1"/>
               <w:left w:val="single" w:color="BBBBBB" w:sz="1"/>
@@ -8596,7 +8596,7 @@
         </w:tc>
         <w:tc>
           <w:tcPr>
-            <w:tcW w:type="dxa" w:w="1446"/>
+            <w:tcW w:type="dxa" w:w="1043"/>
             <w:tcBorders>
               <w:top w:val="single" w:color="BBBBBB" w:sz="1"/>
               <w:left w:val="single" w:color="BBBBBB" w:sz="1"/>
@@ -8623,7 +8623,7 @@
         </w:tc>
         <w:tc>
           <w:tcPr>
-            <w:tcW w:type="dxa" w:w="1446"/>
+            <w:tcW w:type="dxa" w:w="1043"/>
             <w:tcBorders>
               <w:top w:val="single" w:color="BBBBBB" w:sz="1"/>
               <w:left w:val="single" w:color="BBBBBB" w:sz="1"/>
@@ -8650,7 +8650,7 @@
         </w:tc>
         <w:tc>
           <w:tcPr>
-            <w:tcW w:type="dxa" w:w="1584"/>
+            <w:tcW w:type="dxa" w:w="1141"/>
             <w:tcBorders>
               <w:top w:val="single" w:color="BBBBBB" w:sz="1"/>
               <w:left w:val="single" w:color="BBBBBB" w:sz="1"/>
@@ -8677,7 +8677,7 @@
         </w:tc>
         <w:tc>
           <w:tcPr>
-            <w:tcW w:type="dxa" w:w="3105"/>
+            <w:tcW w:type="dxa" w:w="4632"/>
             <w:tcBorders>
               <w:top w:val="single" w:color="BBBBBB" w:sz="1"/>
               <w:left w:val="single" w:color="BBBBBB" w:sz="1"/>
@@ -8709,7 +8709,7 @@
         </w:trPr>
         <w:tc>
           <w:tcPr>
-            <w:tcW w:type="dxa" w:w="1031"/>
+            <w:tcW w:type="dxa" w:w="753"/>
             <w:tcBorders>
               <w:top w:val="single" w:color="BBBBBB" w:sz="1"/>
               <w:left w:val="single" w:color="BBBBBB" w:sz="1"/>
@@ -8753,7 +8753,7 @@
         </w:tc>
         <w:tc>
           <w:tcPr>
-            <w:tcW w:type="dxa" w:w="1446"/>
+            <w:tcW w:type="dxa" w:w="1043"/>
             <w:tcBorders>
               <w:top w:val="single" w:color="BBBBBB" w:sz="1"/>
               <w:left w:val="single" w:color="BBBBBB" w:sz="1"/>
@@ -8775,7 +8775,7 @@
         </w:tc>
         <w:tc>
           <w:tcPr>
-            <w:tcW w:type="dxa" w:w="1446"/>
+            <w:tcW w:type="dxa" w:w="1043"/>
             <w:tcBorders>
               <w:top w:val="single" w:color="BBBBBB" w:sz="1"/>
               <w:left w:val="single" w:color="BBBBBB" w:sz="1"/>
@@ -8797,7 +8797,7 @@
         </w:tc>
         <w:tc>
           <w:tcPr>
-            <w:tcW w:type="dxa" w:w="1584"/>
+            <w:tcW w:type="dxa" w:w="1141"/>
             <w:tcBorders>
               <w:top w:val="single" w:color="BBBBBB" w:sz="1"/>
               <w:left w:val="single" w:color="BBBBBB" w:sz="1"/>
@@ -8819,7 +8819,7 @@
         </w:tc>
         <w:tc>
           <w:tcPr>
-            <w:tcW w:type="dxa" w:w="3105"/>
+            <w:tcW w:type="dxa" w:w="4632"/>
             <w:tcBorders>
               <w:top w:val="single" w:color="BBBBBB" w:sz="1"/>
               <w:left w:val="single" w:color="BBBBBB" w:sz="1"/>
@@ -8846,7 +8846,7 @@
         </w:trPr>
         <w:tc>
           <w:tcPr>
-            <w:tcW w:type="dxa" w:w="1031"/>
+            <w:tcW w:type="dxa" w:w="753"/>
             <w:tcBorders>
               <w:top w:val="single" w:color="BBBBBB" w:sz="1"/>
               <w:left w:val="single" w:color="BBBBBB" w:sz="1"/>
@@ -8890,7 +8890,7 @@
         </w:tc>
         <w:tc>
           <w:tcPr>
-            <w:tcW w:type="dxa" w:w="1446"/>
+            <w:tcW w:type="dxa" w:w="1043"/>
             <w:tcBorders>
               <w:top w:val="single" w:color="BBBBBB" w:sz="1"/>
               <w:left w:val="single" w:color="BBBBBB" w:sz="1"/>
@@ -8912,7 +8912,7 @@
         </w:tc>
         <w:tc>
           <w:tcPr>
-            <w:tcW w:type="dxa" w:w="1446"/>
+            <w:tcW w:type="dxa" w:w="1043"/>
             <w:tcBorders>
               <w:top w:val="single" w:color="BBBBBB" w:sz="1"/>
               <w:left w:val="single" w:color="BBBBBB" w:sz="1"/>
@@ -8934,7 +8934,7 @@
         </w:tc>
         <w:tc>
           <w:tcPr>
-            <w:tcW w:type="dxa" w:w="1584"/>
+            <w:tcW w:type="dxa" w:w="1141"/>
             <w:tcBorders>
               <w:top w:val="single" w:color="BBBBBB" w:sz="1"/>
               <w:left w:val="single" w:color="BBBBBB" w:sz="1"/>
@@ -8956,23 +8956,23 @@
         </w:tc>
         <w:tc>
           <w:tcPr>
-            <w:tcW w:type="dxa" w:w="3105"/>
-            <w:tcBorders>
-              <w:top w:val="single" w:color="BBBBBB" w:sz="1"/>
-              <w:left w:val="single" w:color="BBBBBB" w:sz="1"/>
-              <w:bottom w:val="single" w:color="BBBBBB" w:sz="1"/>
-              <w:right w:val="single" w:color="BBBBBB" w:sz="1"/>
-            </w:tcBorders>
-            <w:tcMar>
-              <w:top w:type="dxa" w:w="60"/>
-              <w:left w:type="dxa" w:w="100"/>
-              <w:bottom w:type="dxa" w:w="60"/>
-              <w:right w:type="dxa" w:w="100"/>
-            </w:tcMar>
-          </w:tcPr>
-          <w:p>
-            <w:r>
-              <w:t xml:space="preserve">未启动</w:t>
+            <w:tcW w:type="dxa" w:w="4632"/>
+            <w:tcBorders>
+              <w:top w:val="single" w:color="BBBBBB" w:sz="1"/>
+              <w:left w:val="single" w:color="BBBBBB" w:sz="1"/>
+              <w:bottom w:val="single" w:color="BBBBBB" w:sz="1"/>
+              <w:right w:val="single" w:color="BBBBBB" w:sz="1"/>
+            </w:tcBorders>
+            <w:tcMar>
+              <w:top w:type="dxa" w:w="60"/>
+              <w:left w:type="dxa" w:w="100"/>
+              <w:bottom w:type="dxa" w:w="60"/>
+              <w:right w:type="dxa" w:w="100"/>
+            </w:tcMar>
+          </w:tcPr>
+          <w:p>
+            <w:r>
+              <w:t xml:space="preserve">部分实现（无邻居/蓝牙关闭发送提示已上线三端；送达回执仍缺）</w:t>
             </w:r>
           </w:p>
         </w:tc>
@@ -8983,7 +8983,7 @@
         </w:trPr>
         <w:tc>
           <w:tcPr>
-            <w:tcW w:type="dxa" w:w="1031"/>
+            <w:tcW w:type="dxa" w:w="753"/>
             <w:tcBorders>
               <w:top w:val="single" w:color="BBBBBB" w:sz="1"/>
               <w:left w:val="single" w:color="BBBBBB" w:sz="1"/>
@@ -9027,7 +9027,7 @@
         </w:tc>
         <w:tc>
           <w:tcPr>
-            <w:tcW w:type="dxa" w:w="1446"/>
+            <w:tcW w:type="dxa" w:w="1043"/>
             <w:tcBorders>
               <w:top w:val="single" w:color="BBBBBB" w:sz="1"/>
               <w:left w:val="single" w:color="BBBBBB" w:sz="1"/>
@@ -9049,7 +9049,7 @@
         </w:tc>
         <w:tc>
           <w:tcPr>
-            <w:tcW w:type="dxa" w:w="1446"/>
+            <w:tcW w:type="dxa" w:w="1043"/>
             <w:tcBorders>
               <w:top w:val="single" w:color="BBBBBB" w:sz="1"/>
               <w:left w:val="single" w:color="BBBBBB" w:sz="1"/>
@@ -9071,7 +9071,7 @@
         </w:tc>
         <w:tc>
           <w:tcPr>
-            <w:tcW w:type="dxa" w:w="1584"/>
+            <w:tcW w:type="dxa" w:w="1141"/>
             <w:tcBorders>
               <w:top w:val="single" w:color="BBBBBB" w:sz="1"/>
               <w:left w:val="single" w:color="BBBBBB" w:sz="1"/>
@@ -9093,7 +9093,7 @@
         </w:tc>
         <w:tc>
           <w:tcPr>
-            <w:tcW w:type="dxa" w:w="3105"/>
+            <w:tcW w:type="dxa" w:w="4632"/>
             <w:tcBorders>
               <w:top w:val="single" w:color="BBBBBB" w:sz="1"/>
               <w:left w:val="single" w:color="BBBBBB" w:sz="1"/>
@@ -9120,7 +9120,7 @@
         </w:trPr>
         <w:tc>
           <w:tcPr>
-            <w:tcW w:type="dxa" w:w="1031"/>
+            <w:tcW w:type="dxa" w:w="753"/>
             <w:tcBorders>
               <w:top w:val="single" w:color="BBBBBB" w:sz="1"/>
               <w:left w:val="single" w:color="BBBBBB" w:sz="1"/>
@@ -9164,7 +9164,7 @@
         </w:tc>
         <w:tc>
           <w:tcPr>
-            <w:tcW w:type="dxa" w:w="1446"/>
+            <w:tcW w:type="dxa" w:w="1043"/>
             <w:tcBorders>
               <w:top w:val="single" w:color="BBBBBB" w:sz="1"/>
               <w:left w:val="single" w:color="BBBBBB" w:sz="1"/>
@@ -9186,7 +9186,7 @@
         </w:tc>
         <w:tc>
           <w:tcPr>
-            <w:tcW w:type="dxa" w:w="1446"/>
+            <w:tcW w:type="dxa" w:w="1043"/>
             <w:tcBorders>
               <w:top w:val="single" w:color="BBBBBB" w:sz="1"/>
               <w:left w:val="single" w:color="BBBBBB" w:sz="1"/>
@@ -9208,7 +9208,7 @@
         </w:tc>
         <w:tc>
           <w:tcPr>
-            <w:tcW w:type="dxa" w:w="1584"/>
+            <w:tcW w:type="dxa" w:w="1141"/>
             <w:tcBorders>
               <w:top w:val="single" w:color="BBBBBB" w:sz="1"/>
               <w:left w:val="single" w:color="BBBBBB" w:sz="1"/>
@@ -9230,7 +9230,7 @@
         </w:tc>
         <w:tc>
           <w:tcPr>
-            <w:tcW w:type="dxa" w:w="3105"/>
+            <w:tcW w:type="dxa" w:w="4632"/>
             <w:tcBorders>
               <w:top w:val="single" w:color="BBBBBB" w:sz="1"/>
               <w:left w:val="single" w:color="BBBBBB" w:sz="1"/>
@@ -9257,7 +9257,7 @@
         </w:trPr>
         <w:tc>
           <w:tcPr>
-            <w:tcW w:type="dxa" w:w="1031"/>
+            <w:tcW w:type="dxa" w:w="753"/>
             <w:tcBorders>
               <w:top w:val="single" w:color="BBBBBB" w:sz="1"/>
               <w:left w:val="single" w:color="BBBBBB" w:sz="1"/>
@@ -9301,7 +9301,7 @@
         </w:tc>
         <w:tc>
           <w:tcPr>
-            <w:tcW w:type="dxa" w:w="1446"/>
+            <w:tcW w:type="dxa" w:w="1043"/>
             <w:tcBorders>
               <w:top w:val="single" w:color="BBBBBB" w:sz="1"/>
               <w:left w:val="single" w:color="BBBBBB" w:sz="1"/>
@@ -9323,7 +9323,7 @@
         </w:tc>
         <w:tc>
           <w:tcPr>
-            <w:tcW w:type="dxa" w:w="1446"/>
+            <w:tcW w:type="dxa" w:w="1043"/>
             <w:tcBorders>
               <w:top w:val="single" w:color="BBBBBB" w:sz="1"/>
               <w:left w:val="single" w:color="BBBBBB" w:sz="1"/>
@@ -9345,7 +9345,7 @@
         </w:tc>
         <w:tc>
           <w:tcPr>
-            <w:tcW w:type="dxa" w:w="1584"/>
+            <w:tcW w:type="dxa" w:w="1141"/>
             <w:tcBorders>
               <w:top w:val="single" w:color="BBBBBB" w:sz="1"/>
               <w:left w:val="single" w:color="BBBBBB" w:sz="1"/>
@@ -9367,7 +9367,7 @@
         </w:tc>
         <w:tc>
           <w:tcPr>
-            <w:tcW w:type="dxa" w:w="3105"/>
+            <w:tcW w:type="dxa" w:w="4632"/>
             <w:tcBorders>
               <w:top w:val="single" w:color="BBBBBB" w:sz="1"/>
               <w:left w:val="single" w:color="BBBBBB" w:sz="1"/>
@@ -9394,7 +9394,7 @@
         </w:trPr>
         <w:tc>
           <w:tcPr>
-            <w:tcW w:type="dxa" w:w="1031"/>
+            <w:tcW w:type="dxa" w:w="753"/>
             <w:tcBorders>
               <w:top w:val="single" w:color="BBBBBB" w:sz="1"/>
               <w:left w:val="single" w:color="BBBBBB" w:sz="1"/>
@@ -9438,7 +9438,7 @@
         </w:tc>
         <w:tc>
           <w:tcPr>
-            <w:tcW w:type="dxa" w:w="1446"/>
+            <w:tcW w:type="dxa" w:w="1043"/>
             <w:tcBorders>
               <w:top w:val="single" w:color="BBBBBB" w:sz="1"/>
               <w:left w:val="single" w:color="BBBBBB" w:sz="1"/>
@@ -9460,7 +9460,7 @@
         </w:tc>
         <w:tc>
           <w:tcPr>
-            <w:tcW w:type="dxa" w:w="1446"/>
+            <w:tcW w:type="dxa" w:w="1043"/>
             <w:tcBorders>
               <w:top w:val="single" w:color="BBBBBB" w:sz="1"/>
               <w:left w:val="single" w:color="BBBBBB" w:sz="1"/>
@@ -9482,7 +9482,7 @@
         </w:tc>
         <w:tc>
           <w:tcPr>
-            <w:tcW w:type="dxa" w:w="1584"/>
+            <w:tcW w:type="dxa" w:w="1141"/>
             <w:tcBorders>
               <w:top w:val="single" w:color="BBBBBB" w:sz="1"/>
               <w:left w:val="single" w:color="BBBBBB" w:sz="1"/>
@@ -9504,7 +9504,7 @@
         </w:tc>
         <w:tc>
           <w:tcPr>
-            <w:tcW w:type="dxa" w:w="3105"/>
+            <w:tcW w:type="dxa" w:w="4632"/>
             <w:tcBorders>
               <w:top w:val="single" w:color="BBBBBB" w:sz="1"/>
               <w:left w:val="single" w:color="BBBBBB" w:sz="1"/>
@@ -9531,7 +9531,7 @@
         </w:trPr>
         <w:tc>
           <w:tcPr>
-            <w:tcW w:type="dxa" w:w="1031"/>
+            <w:tcW w:type="dxa" w:w="753"/>
             <w:tcBorders>
               <w:top w:val="single" w:color="BBBBBB" w:sz="1"/>
               <w:left w:val="single" w:color="BBBBBB" w:sz="1"/>
@@ -9575,7 +9575,7 @@
         </w:tc>
         <w:tc>
           <w:tcPr>
-            <w:tcW w:type="dxa" w:w="1446"/>
+            <w:tcW w:type="dxa" w:w="1043"/>
             <w:tcBorders>
               <w:top w:val="single" w:color="BBBBBB" w:sz="1"/>
               <w:left w:val="single" w:color="BBBBBB" w:sz="1"/>
@@ -9597,7 +9597,7 @@
         </w:tc>
         <w:tc>
           <w:tcPr>
-            <w:tcW w:type="dxa" w:w="1446"/>
+            <w:tcW w:type="dxa" w:w="1043"/>
             <w:tcBorders>
               <w:top w:val="single" w:color="BBBBBB" w:sz="1"/>
               <w:left w:val="single" w:color="BBBBBB" w:sz="1"/>
@@ -9619,7 +9619,7 @@
         </w:tc>
         <w:tc>
           <w:tcPr>
-            <w:tcW w:type="dxa" w:w="1584"/>
+            <w:tcW w:type="dxa" w:w="1141"/>
             <w:tcBorders>
               <w:top w:val="single" w:color="BBBBBB" w:sz="1"/>
               <w:left w:val="single" w:color="BBBBBB" w:sz="1"/>
@@ -9641,23 +9641,23 @@
         </w:tc>
         <w:tc>
           <w:tcPr>
-            <w:tcW w:type="dxa" w:w="3105"/>
-            <w:tcBorders>
-              <w:top w:val="single" w:color="BBBBBB" w:sz="1"/>
-              <w:left w:val="single" w:color="BBBBBB" w:sz="1"/>
-              <w:bottom w:val="single" w:color="BBBBBB" w:sz="1"/>
-              <w:right w:val="single" w:color="BBBBBB" w:sz="1"/>
-            </w:tcBorders>
-            <w:tcMar>
-              <w:top w:type="dxa" w:w="60"/>
-              <w:left w:type="dxa" w:w="100"/>
-              <w:bottom w:type="dxa" w:w="60"/>
-              <w:right w:type="dxa" w:w="100"/>
-            </w:tcMar>
-          </w:tcPr>
-          <w:p>
-            <w:r>
-              <w:t xml:space="preserve">未启动</w:t>
+            <w:tcW w:type="dxa" w:w="4632"/>
+            <w:tcBorders>
+              <w:top w:val="single" w:color="BBBBBB" w:sz="1"/>
+              <w:left w:val="single" w:color="BBBBBB" w:sz="1"/>
+              <w:bottom w:val="single" w:color="BBBBBB" w:sz="1"/>
+              <w:right w:val="single" w:color="BBBBBB" w:sz="1"/>
+            </w:tcBorders>
+            <w:tcMar>
+              <w:top w:type="dxa" w:w="60"/>
+              <w:left w:type="dxa" w:w="100"/>
+              <w:bottom w:type="dxa" w:w="60"/>
+              <w:right w:type="dxa" w:w="100"/>
+            </w:tcMar>
+          </w:tcPr>
+          <w:p>
+            <w:r>
+              <w:t xml:space="preserve">已实现（Web 往返验收通过；iOS/Android 分享导出+粘贴导入，待真机卸载重装验收）</w:t>
             </w:r>
           </w:p>
         </w:tc>
@@ -9668,7 +9668,7 @@
         </w:trPr>
         <w:tc>
           <w:tcPr>
-            <w:tcW w:type="dxa" w:w="1031"/>
+            <w:tcW w:type="dxa" w:w="753"/>
             <w:tcBorders>
               <w:top w:val="single" w:color="BBBBBB" w:sz="1"/>
               <w:left w:val="single" w:color="BBBBBB" w:sz="1"/>
@@ -9712,7 +9712,7 @@
         </w:tc>
         <w:tc>
           <w:tcPr>
-            <w:tcW w:type="dxa" w:w="1446"/>
+            <w:tcW w:type="dxa" w:w="1043"/>
             <w:tcBorders>
               <w:top w:val="single" w:color="BBBBBB" w:sz="1"/>
               <w:left w:val="single" w:color="BBBBBB" w:sz="1"/>
@@ -9734,7 +9734,7 @@
         </w:tc>
         <w:tc>
           <w:tcPr>
-            <w:tcW w:type="dxa" w:w="1446"/>
+            <w:tcW w:type="dxa" w:w="1043"/>
             <w:tcBorders>
               <w:top w:val="single" w:color="BBBBBB" w:sz="1"/>
               <w:left w:val="single" w:color="BBBBBB" w:sz="1"/>
@@ -9756,7 +9756,7 @@
         </w:tc>
         <w:tc>
           <w:tcPr>
-            <w:tcW w:type="dxa" w:w="1584"/>
+            <w:tcW w:type="dxa" w:w="1141"/>
             <w:tcBorders>
               <w:top w:val="single" w:color="BBBBBB" w:sz="1"/>
               <w:left w:val="single" w:color="BBBBBB" w:sz="1"/>
@@ -9778,7 +9778,7 @@
         </w:tc>
         <w:tc>
           <w:tcPr>
-            <w:tcW w:type="dxa" w:w="3105"/>
+            <w:tcW w:type="dxa" w:w="4632"/>
             <w:tcBorders>
               <w:top w:val="single" w:color="BBBBBB" w:sz="1"/>
               <w:left w:val="single" w:color="BBBBBB" w:sz="1"/>
@@ -9805,7 +9805,7 @@
         </w:trPr>
         <w:tc>
           <w:tcPr>
-            <w:tcW w:type="dxa" w:w="1031"/>
+            <w:tcW w:type="dxa" w:w="753"/>
             <w:tcBorders>
               <w:top w:val="single" w:color="BBBBBB" w:sz="1"/>
               <w:left w:val="single" w:color="BBBBBB" w:sz="1"/>
@@ -9849,7 +9849,7 @@
         </w:tc>
         <w:tc>
           <w:tcPr>
-            <w:tcW w:type="dxa" w:w="1446"/>
+            <w:tcW w:type="dxa" w:w="1043"/>
             <w:tcBorders>
               <w:top w:val="single" w:color="BBBBBB" w:sz="1"/>
               <w:left w:val="single" w:color="BBBBBB" w:sz="1"/>
@@ -9871,7 +9871,7 @@
         </w:tc>
         <w:tc>
           <w:tcPr>
-            <w:tcW w:type="dxa" w:w="1446"/>
+            <w:tcW w:type="dxa" w:w="1043"/>
             <w:tcBorders>
               <w:top w:val="single" w:color="BBBBBB" w:sz="1"/>
               <w:left w:val="single" w:color="BBBBBB" w:sz="1"/>
@@ -9893,7 +9893,7 @@
         </w:tc>
         <w:tc>
           <w:tcPr>
-            <w:tcW w:type="dxa" w:w="1584"/>
+            <w:tcW w:type="dxa" w:w="1141"/>
             <w:tcBorders>
               <w:top w:val="single" w:color="BBBBBB" w:sz="1"/>
               <w:left w:val="single" w:color="BBBBBB" w:sz="1"/>
@@ -9915,7 +9915,7 @@
         </w:tc>
         <w:tc>
           <w:tcPr>
-            <w:tcW w:type="dxa" w:w="3105"/>
+            <w:tcW w:type="dxa" w:w="4632"/>
             <w:tcBorders>
               <w:top w:val="single" w:color="BBBBBB" w:sz="1"/>
               <w:left w:val="single" w:color="BBBBBB" w:sz="1"/>
@@ -9942,7 +9942,7 @@
         </w:trPr>
         <w:tc>
           <w:tcPr>
-            <w:tcW w:type="dxa" w:w="1031"/>
+            <w:tcW w:type="dxa" w:w="753"/>
             <w:tcBorders>
               <w:top w:val="single" w:color="BBBBBB" w:sz="1"/>
               <w:left w:val="single" w:color="BBBBBB" w:sz="1"/>
@@ -9986,7 +9986,7 @@
         </w:tc>
         <w:tc>
           <w:tcPr>
-            <w:tcW w:type="dxa" w:w="1446"/>
+            <w:tcW w:type="dxa" w:w="1043"/>
             <w:tcBorders>
               <w:top w:val="single" w:color="BBBBBB" w:sz="1"/>
               <w:left w:val="single" w:color="BBBBBB" w:sz="1"/>
@@ -10008,7 +10008,7 @@
         </w:tc>
         <w:tc>
           <w:tcPr>
-            <w:tcW w:type="dxa" w:w="1446"/>
+            <w:tcW w:type="dxa" w:w="1043"/>
             <w:tcBorders>
               <w:top w:val="single" w:color="BBBBBB" w:sz="1"/>
               <w:left w:val="single" w:color="BBBBBB" w:sz="1"/>
@@ -10030,7 +10030,7 @@
         </w:tc>
         <w:tc>
           <w:tcPr>
-            <w:tcW w:type="dxa" w:w="1584"/>
+            <w:tcW w:type="dxa" w:w="1141"/>
             <w:tcBorders>
               <w:top w:val="single" w:color="BBBBBB" w:sz="1"/>
               <w:left w:val="single" w:color="BBBBBB" w:sz="1"/>
@@ -10052,7 +10052,7 @@
         </w:tc>
         <w:tc>
           <w:tcPr>
-            <w:tcW w:type="dxa" w:w="3105"/>
+            <w:tcW w:type="dxa" w:w="4632"/>
             <w:tcBorders>
               <w:top w:val="single" w:color="BBBBBB" w:sz="1"/>
               <w:left w:val="single" w:color="BBBBBB" w:sz="1"/>
@@ -10079,7 +10079,7 @@
         </w:trPr>
         <w:tc>
           <w:tcPr>
-            <w:tcW w:type="dxa" w:w="1031"/>
+            <w:tcW w:type="dxa" w:w="753"/>
             <w:tcBorders>
               <w:top w:val="single" w:color="BBBBBB" w:sz="1"/>
               <w:left w:val="single" w:color="BBBBBB" w:sz="1"/>
@@ -10123,7 +10123,7 @@
         </w:tc>
         <w:tc>
           <w:tcPr>
-            <w:tcW w:type="dxa" w:w="1446"/>
+            <w:tcW w:type="dxa" w:w="1043"/>
             <w:tcBorders>
               <w:top w:val="single" w:color="BBBBBB" w:sz="1"/>
               <w:left w:val="single" w:color="BBBBBB" w:sz="1"/>
@@ -10145,7 +10145,7 @@
         </w:tc>
         <w:tc>
           <w:tcPr>
-            <w:tcW w:type="dxa" w:w="1446"/>
+            <w:tcW w:type="dxa" w:w="1043"/>
             <w:tcBorders>
               <w:top w:val="single" w:color="BBBBBB" w:sz="1"/>
               <w:left w:val="single" w:color="BBBBBB" w:sz="1"/>
@@ -10167,7 +10167,7 @@
         </w:tc>
         <w:tc>
           <w:tcPr>
-            <w:tcW w:type="dxa" w:w="1584"/>
+            <w:tcW w:type="dxa" w:w="1141"/>
             <w:tcBorders>
               <w:top w:val="single" w:color="BBBBBB" w:sz="1"/>
               <w:left w:val="single" w:color="BBBBBB" w:sz="1"/>
@@ -10189,7 +10189,7 @@
         </w:tc>
         <w:tc>
           <w:tcPr>
-            <w:tcW w:type="dxa" w:w="3105"/>
+            <w:tcW w:type="dxa" w:w="4632"/>
             <w:tcBorders>
               <w:top w:val="single" w:color="BBBBBB" w:sz="1"/>
               <w:left w:val="single" w:color="BBBBBB" w:sz="1"/>
@@ -10216,7 +10216,7 @@
         </w:trPr>
         <w:tc>
           <w:tcPr>
-            <w:tcW w:type="dxa" w:w="1031"/>
+            <w:tcW w:type="dxa" w:w="753"/>
             <w:tcBorders>
               <w:top w:val="single" w:color="BBBBBB" w:sz="1"/>
               <w:left w:val="single" w:color="BBBBBB" w:sz="1"/>
@@ -10260,7 +10260,7 @@
         </w:tc>
         <w:tc>
           <w:tcPr>
-            <w:tcW w:type="dxa" w:w="1446"/>
+            <w:tcW w:type="dxa" w:w="1043"/>
             <w:tcBorders>
               <w:top w:val="single" w:color="BBBBBB" w:sz="1"/>
               <w:left w:val="single" w:color="BBBBBB" w:sz="1"/>
@@ -10282,7 +10282,7 @@
         </w:tc>
         <w:tc>
           <w:tcPr>
-            <w:tcW w:type="dxa" w:w="1446"/>
+            <w:tcW w:type="dxa" w:w="1043"/>
             <w:tcBorders>
               <w:top w:val="single" w:color="BBBBBB" w:sz="1"/>
               <w:left w:val="single" w:color="BBBBBB" w:sz="1"/>
@@ -10304,7 +10304,7 @@
         </w:tc>
         <w:tc>
           <w:tcPr>
-            <w:tcW w:type="dxa" w:w="1584"/>
+            <w:tcW w:type="dxa" w:w="1141"/>
             <w:tcBorders>
               <w:top w:val="single" w:color="BBBBBB" w:sz="1"/>
               <w:left w:val="single" w:color="BBBBBB" w:sz="1"/>
@@ -10326,7 +10326,7 @@
         </w:tc>
         <w:tc>
           <w:tcPr>
-            <w:tcW w:type="dxa" w:w="3105"/>
+            <w:tcW w:type="dxa" w:w="4632"/>
             <w:tcBorders>
               <w:top w:val="single" w:color="BBBBBB" w:sz="1"/>
               <w:left w:val="single" w:color="BBBBBB" w:sz="1"/>
@@ -10353,7 +10353,7 @@
         </w:trPr>
         <w:tc>
           <w:tcPr>
-            <w:tcW w:type="dxa" w:w="1031"/>
+            <w:tcW w:type="dxa" w:w="753"/>
             <w:tcBorders>
               <w:top w:val="single" w:color="BBBBBB" w:sz="1"/>
               <w:left w:val="single" w:color="BBBBBB" w:sz="1"/>
@@ -10397,7 +10397,7 @@
         </w:tc>
         <w:tc>
           <w:tcPr>
-            <w:tcW w:type="dxa" w:w="1446"/>
+            <w:tcW w:type="dxa" w:w="1043"/>
             <w:tcBorders>
               <w:top w:val="single" w:color="BBBBBB" w:sz="1"/>
               <w:left w:val="single" w:color="BBBBBB" w:sz="1"/>
@@ -10419,7 +10419,7 @@
         </w:tc>
         <w:tc>
           <w:tcPr>
-            <w:tcW w:type="dxa" w:w="1446"/>
+            <w:tcW w:type="dxa" w:w="1043"/>
             <w:tcBorders>
               <w:top w:val="single" w:color="BBBBBB" w:sz="1"/>
               <w:left w:val="single" w:color="BBBBBB" w:sz="1"/>
@@ -10441,7 +10441,7 @@
         </w:tc>
         <w:tc>
           <w:tcPr>
-            <w:tcW w:type="dxa" w:w="1584"/>
+            <w:tcW w:type="dxa" w:w="1141"/>
             <w:tcBorders>
               <w:top w:val="single" w:color="BBBBBB" w:sz="1"/>
               <w:left w:val="single" w:color="BBBBBB" w:sz="1"/>
@@ -10463,7 +10463,7 @@
         </w:tc>
         <w:tc>
           <w:tcPr>
-            <w:tcW w:type="dxa" w:w="3105"/>
+            <w:tcW w:type="dxa" w:w="4632"/>
             <w:tcBorders>
               <w:top w:val="single" w:color="BBBBBB" w:sz="1"/>
               <w:left w:val="single" w:color="BBBBBB" w:sz="1"/>
@@ -10490,7 +10490,7 @@
         </w:trPr>
         <w:tc>
           <w:tcPr>
-            <w:tcW w:type="dxa" w:w="1031"/>
+            <w:tcW w:type="dxa" w:w="753"/>
             <w:tcBorders>
               <w:top w:val="single" w:color="BBBBBB" w:sz="1"/>
               <w:left w:val="single" w:color="BBBBBB" w:sz="1"/>
@@ -10534,7 +10534,7 @@
         </w:tc>
         <w:tc>
           <w:tcPr>
-            <w:tcW w:type="dxa" w:w="1446"/>
+            <w:tcW w:type="dxa" w:w="1043"/>
             <w:tcBorders>
               <w:top w:val="single" w:color="BBBBBB" w:sz="1"/>
               <w:left w:val="single" w:color="BBBBBB" w:sz="1"/>
@@ -10556,7 +10556,7 @@
         </w:tc>
         <w:tc>
           <w:tcPr>
-            <w:tcW w:type="dxa" w:w="1446"/>
+            <w:tcW w:type="dxa" w:w="1043"/>
             <w:tcBorders>
               <w:top w:val="single" w:color="BBBBBB" w:sz="1"/>
               <w:left w:val="single" w:color="BBBBBB" w:sz="1"/>
@@ -10578,7 +10578,7 @@
         </w:tc>
         <w:tc>
           <w:tcPr>
-            <w:tcW w:type="dxa" w:w="1584"/>
+            <w:tcW w:type="dxa" w:w="1141"/>
             <w:tcBorders>
               <w:top w:val="single" w:color="BBBBBB" w:sz="1"/>
               <w:left w:val="single" w:color="BBBBBB" w:sz="1"/>
@@ -10600,7 +10600,7 @@
         </w:tc>
         <w:tc>
           <w:tcPr>
-            <w:tcW w:type="dxa" w:w="3105"/>
+            <w:tcW w:type="dxa" w:w="4632"/>
             <w:tcBorders>
               <w:top w:val="single" w:color="BBBBBB" w:sz="1"/>
               <w:left w:val="single" w:color="BBBBBB" w:sz="1"/>
@@ -10627,7 +10627,7 @@
         </w:trPr>
         <w:tc>
           <w:tcPr>
-            <w:tcW w:type="dxa" w:w="1031"/>
+            <w:tcW w:type="dxa" w:w="753"/>
             <w:tcBorders>
               <w:top w:val="single" w:color="BBBBBB" w:sz="1"/>
               <w:left w:val="single" w:color="BBBBBB" w:sz="1"/>
@@ -10671,7 +10671,7 @@
         </w:tc>
         <w:tc>
           <w:tcPr>
-            <w:tcW w:type="dxa" w:w="1446"/>
+            <w:tcW w:type="dxa" w:w="1043"/>
             <w:tcBorders>
               <w:top w:val="single" w:color="BBBBBB" w:sz="1"/>
               <w:left w:val="single" w:color="BBBBBB" w:sz="1"/>
@@ -10693,7 +10693,7 @@
         </w:tc>
         <w:tc>
           <w:tcPr>
-            <w:tcW w:type="dxa" w:w="1446"/>
+            <w:tcW w:type="dxa" w:w="1043"/>
             <w:tcBorders>
               <w:top w:val="single" w:color="BBBBBB" w:sz="1"/>
               <w:left w:val="single" w:color="BBBBBB" w:sz="1"/>
@@ -10715,7 +10715,7 @@
         </w:tc>
         <w:tc>
           <w:tcPr>
-            <w:tcW w:type="dxa" w:w="1584"/>
+            <w:tcW w:type="dxa" w:w="1141"/>
             <w:tcBorders>
               <w:top w:val="single" w:color="BBBBBB" w:sz="1"/>
               <w:left w:val="single" w:color="BBBBBB" w:sz="1"/>
@@ -10737,7 +10737,7 @@
         </w:tc>
         <w:tc>
           <w:tcPr>
-            <w:tcW w:type="dxa" w:w="3105"/>
+            <w:tcW w:type="dxa" w:w="4632"/>
             <w:tcBorders>
               <w:top w:val="single" w:color="BBBBBB" w:sz="1"/>
               <w:left w:val="single" w:color="BBBBBB" w:sz="1"/>
@@ -10764,7 +10764,7 @@
         </w:trPr>
         <w:tc>
           <w:tcPr>
-            <w:tcW w:type="dxa" w:w="1031"/>
+            <w:tcW w:type="dxa" w:w="753"/>
             <w:tcBorders>
               <w:top w:val="single" w:color="BBBBBB" w:sz="1"/>
               <w:left w:val="single" w:color="BBBBBB" w:sz="1"/>
@@ -10808,7 +10808,7 @@
         </w:tc>
         <w:tc>
           <w:tcPr>
-            <w:tcW w:type="dxa" w:w="1446"/>
+            <w:tcW w:type="dxa" w:w="1043"/>
             <w:tcBorders>
               <w:top w:val="single" w:color="BBBBBB" w:sz="1"/>
               <w:left w:val="single" w:color="BBBBBB" w:sz="1"/>
@@ -10830,7 +10830,7 @@
         </w:tc>
         <w:tc>
           <w:tcPr>
-            <w:tcW w:type="dxa" w:w="1446"/>
+            <w:tcW w:type="dxa" w:w="1043"/>
             <w:tcBorders>
               <w:top w:val="single" w:color="BBBBBB" w:sz="1"/>
               <w:left w:val="single" w:color="BBBBBB" w:sz="1"/>
@@ -10852,7 +10852,7 @@
         </w:tc>
         <w:tc>
           <w:tcPr>
-            <w:tcW w:type="dxa" w:w="1584"/>
+            <w:tcW w:type="dxa" w:w="1141"/>
             <w:tcBorders>
               <w:top w:val="single" w:color="BBBBBB" w:sz="1"/>
               <w:left w:val="single" w:color="BBBBBB" w:sz="1"/>
@@ -10874,7 +10874,7 @@
         </w:tc>
         <w:tc>
           <w:tcPr>
-            <w:tcW w:type="dxa" w:w="3105"/>
+            <w:tcW w:type="dxa" w:w="4632"/>
             <w:tcBorders>
               <w:top w:val="single" w:color="BBBBBB" w:sz="1"/>
               <w:left w:val="single" w:color="BBBBBB" w:sz="1"/>
@@ -10901,7 +10901,7 @@
         </w:trPr>
         <w:tc>
           <w:tcPr>
-            <w:tcW w:type="dxa" w:w="1031"/>
+            <w:tcW w:type="dxa" w:w="753"/>
             <w:tcBorders>
               <w:top w:val="single" w:color="BBBBBB" w:sz="1"/>
               <w:left w:val="single" w:color="BBBBBB" w:sz="1"/>
@@ -10945,7 +10945,7 @@
         </w:tc>
         <w:tc>
           <w:tcPr>
-            <w:tcW w:type="dxa" w:w="1446"/>
+            <w:tcW w:type="dxa" w:w="1043"/>
             <w:tcBorders>
               <w:top w:val="single" w:color="BBBBBB" w:sz="1"/>
               <w:left w:val="single" w:color="BBBBBB" w:sz="1"/>
@@ -10967,7 +10967,7 @@
         </w:tc>
         <w:tc>
           <w:tcPr>
-            <w:tcW w:type="dxa" w:w="1446"/>
+            <w:tcW w:type="dxa" w:w="1043"/>
             <w:tcBorders>
               <w:top w:val="single" w:color="BBBBBB" w:sz="1"/>
               <w:left w:val="single" w:color="BBBBBB" w:sz="1"/>
@@ -10989,7 +10989,7 @@
         </w:tc>
         <w:tc>
           <w:tcPr>
-            <w:tcW w:type="dxa" w:w="1584"/>
+            <w:tcW w:type="dxa" w:w="1141"/>
             <w:tcBorders>
               <w:top w:val="single" w:color="BBBBBB" w:sz="1"/>
               <w:left w:val="single" w:color="BBBBBB" w:sz="1"/>
@@ -11011,7 +11011,7 @@
         </w:tc>
         <w:tc>
           <w:tcPr>
-            <w:tcW w:type="dxa" w:w="3105"/>
+            <w:tcW w:type="dxa" w:w="4632"/>
             <w:tcBorders>
               <w:top w:val="single" w:color="BBBBBB" w:sz="1"/>
               <w:left w:val="single" w:color="BBBBBB" w:sz="1"/>
@@ -11038,7 +11038,7 @@
         </w:trPr>
         <w:tc>
           <w:tcPr>
-            <w:tcW w:type="dxa" w:w="1031"/>
+            <w:tcW w:type="dxa" w:w="753"/>
             <w:tcBorders>
               <w:top w:val="single" w:color="BBBBBB" w:sz="1"/>
               <w:left w:val="single" w:color="BBBBBB" w:sz="1"/>
@@ -11082,7 +11082,7 @@
         </w:tc>
         <w:tc>
           <w:tcPr>
-            <w:tcW w:type="dxa" w:w="1446"/>
+            <w:tcW w:type="dxa" w:w="1043"/>
             <w:tcBorders>
               <w:top w:val="single" w:color="BBBBBB" w:sz="1"/>
               <w:left w:val="single" w:color="BBBBBB" w:sz="1"/>
@@ -11104,7 +11104,7 @@
         </w:tc>
         <w:tc>
           <w:tcPr>
-            <w:tcW w:type="dxa" w:w="1446"/>
+            <w:tcW w:type="dxa" w:w="1043"/>
             <w:tcBorders>
               <w:top w:val="single" w:color="BBBBBB" w:sz="1"/>
               <w:left w:val="single" w:color="BBBBBB" w:sz="1"/>
@@ -11126,7 +11126,7 @@
         </w:tc>
         <w:tc>
           <w:tcPr>
-            <w:tcW w:type="dxa" w:w="1584"/>
+            <w:tcW w:type="dxa" w:w="1141"/>
             <w:tcBorders>
               <w:top w:val="single" w:color="BBBBBB" w:sz="1"/>
               <w:left w:val="single" w:color="BBBBBB" w:sz="1"/>
@@ -11148,7 +11148,7 @@
         </w:tc>
         <w:tc>
           <w:tcPr>
-            <w:tcW w:type="dxa" w:w="3105"/>
+            <w:tcW w:type="dxa" w:w="4632"/>
             <w:tcBorders>
               <w:top w:val="single" w:color="BBBBBB" w:sz="1"/>
               <w:left w:val="single" w:color="BBBBBB" w:sz="1"/>
@@ -11175,7 +11175,7 @@
         </w:trPr>
         <w:tc>
           <w:tcPr>
-            <w:tcW w:type="dxa" w:w="1031"/>
+            <w:tcW w:type="dxa" w:w="753"/>
             <w:tcBorders>
               <w:top w:val="single" w:color="BBBBBB" w:sz="1"/>
               <w:left w:val="single" w:color="BBBBBB" w:sz="1"/>
@@ -11219,7 +11219,7 @@
         </w:tc>
         <w:tc>
           <w:tcPr>
-            <w:tcW w:type="dxa" w:w="1446"/>
+            <w:tcW w:type="dxa" w:w="1043"/>
             <w:tcBorders>
               <w:top w:val="single" w:color="BBBBBB" w:sz="1"/>
               <w:left w:val="single" w:color="BBBBBB" w:sz="1"/>
@@ -11241,7 +11241,7 @@
         </w:tc>
         <w:tc>
           <w:tcPr>
-            <w:tcW w:type="dxa" w:w="1446"/>
+            <w:tcW w:type="dxa" w:w="1043"/>
             <w:tcBorders>
               <w:top w:val="single" w:color="BBBBBB" w:sz="1"/>
               <w:left w:val="single" w:color="BBBBBB" w:sz="1"/>
@@ -11263,7 +11263,7 @@
         </w:tc>
         <w:tc>
           <w:tcPr>
-            <w:tcW w:type="dxa" w:w="1584"/>
+            <w:tcW w:type="dxa" w:w="1141"/>
             <w:tcBorders>
               <w:top w:val="single" w:color="BBBBBB" w:sz="1"/>
               <w:left w:val="single" w:color="BBBBBB" w:sz="1"/>
@@ -11285,7 +11285,7 @@
         </w:tc>
         <w:tc>
           <w:tcPr>
-            <w:tcW w:type="dxa" w:w="3105"/>
+            <w:tcW w:type="dxa" w:w="4632"/>
             <w:tcBorders>
               <w:top w:val="single" w:color="BBBBBB" w:sz="1"/>
               <w:left w:val="single" w:color="BBBBBB" w:sz="1"/>
@@ -11312,7 +11312,7 @@
         </w:trPr>
         <w:tc>
           <w:tcPr>
-            <w:tcW w:type="dxa" w:w="1031"/>
+            <w:tcW w:type="dxa" w:w="753"/>
             <w:tcBorders>
               <w:top w:val="single" w:color="BBBBBB" w:sz="1"/>
               <w:left w:val="single" w:color="BBBBBB" w:sz="1"/>
@@ -11356,7 +11356,7 @@
         </w:tc>
         <w:tc>
           <w:tcPr>
-            <w:tcW w:type="dxa" w:w="1446"/>
+            <w:tcW w:type="dxa" w:w="1043"/>
             <w:tcBorders>
               <w:top w:val="single" w:color="BBBBBB" w:sz="1"/>
               <w:left w:val="single" w:color="BBBBBB" w:sz="1"/>
@@ -11378,7 +11378,7 @@
         </w:tc>
         <w:tc>
           <w:tcPr>
-            <w:tcW w:type="dxa" w:w="1446"/>
+            <w:tcW w:type="dxa" w:w="1043"/>
             <w:tcBorders>
               <w:top w:val="single" w:color="BBBBBB" w:sz="1"/>
               <w:left w:val="single" w:color="BBBBBB" w:sz="1"/>
@@ -11400,7 +11400,7 @@
         </w:tc>
         <w:tc>
           <w:tcPr>
-            <w:tcW w:type="dxa" w:w="1584"/>
+            <w:tcW w:type="dxa" w:w="1141"/>
             <w:tcBorders>
               <w:top w:val="single" w:color="BBBBBB" w:sz="1"/>
               <w:left w:val="single" w:color="BBBBBB" w:sz="1"/>
@@ -11422,7 +11422,7 @@
         </w:tc>
         <w:tc>
           <w:tcPr>
-            <w:tcW w:type="dxa" w:w="3105"/>
+            <w:tcW w:type="dxa" w:w="4632"/>
             <w:tcBorders>
               <w:top w:val="single" w:color="BBBBBB" w:sz="1"/>
               <w:left w:val="single" w:color="BBBBBB" w:sz="1"/>

</xml_diff>

<commit_message>
feat: E1 round 2 — signaling hardening + convoy link-health (G-SEC-1, G-DR-1)
Signaling server (G-SEC-1): optional SIGNAL_TOKEN auth on join (4003
on mismatch), 80 msgs/10s per-connection rate limit (4008), 64KB
message cap (4002), 32-connection per-IP cap (4001), and unjoined
connections can no longer relay signals. Web client sends
VITE_SIGNAL_TOKEN; .env.example documents both plus the wss
reverse-proxy requirement.

Convoy link health (G-DR-1): both native ends now show an amber banner
when Bluetooth is off (位置无法共享) or no mesh neighbors are in range
(同伴暂看不到你的位置) — Android refreshes on the 3s broadcast tick,
iOS reacts to MeshBus onState/onPeers.

Fixture grows to 23 assertions: spawns the real signaling server and
verifies bad-token rejection, authed join, unauthed-relay block, and
flood-triggered rate limiting.
</commit_message>
<xml_diff>
--- a/docs/requirements/TrailMate-Gap分析与演进规划-v1.0.docx
+++ b/docs/requirements/TrailMate-Gap分析与演进规划-v1.0.docx
@@ -8529,12 +8529,12 @@
         </w:tblBorders>
       </w:tblPr>
       <w:tblGrid>
-        <w:gridCol w:w="753"/>
         <w:gridCol w:w="748"/>
-        <w:gridCol w:w="1043"/>
-        <w:gridCol w:w="1043"/>
-        <w:gridCol w:w="1141"/>
-        <w:gridCol w:w="4632"/>
+        <w:gridCol w:w="748"/>
+        <w:gridCol w:w="922"/>
+        <w:gridCol w:w="922"/>
+        <w:gridCol w:w="1006"/>
+        <w:gridCol w:w="5014"/>
       </w:tblGrid>
       <w:tr>
         <w:trPr>
@@ -8542,7 +8542,7 @@
         </w:trPr>
         <w:tc>
           <w:tcPr>
-            <w:tcW w:type="dxa" w:w="753"/>
+            <w:tcW w:type="dxa" w:w="748"/>
             <w:tcBorders>
               <w:top w:val="single" w:color="BBBBBB" w:sz="1"/>
               <w:left w:val="single" w:color="BBBBBB" w:sz="1"/>
@@ -8596,7 +8596,7 @@
         </w:tc>
         <w:tc>
           <w:tcPr>
-            <w:tcW w:type="dxa" w:w="1043"/>
+            <w:tcW w:type="dxa" w:w="922"/>
             <w:tcBorders>
               <w:top w:val="single" w:color="BBBBBB" w:sz="1"/>
               <w:left w:val="single" w:color="BBBBBB" w:sz="1"/>
@@ -8623,7 +8623,7 @@
         </w:tc>
         <w:tc>
           <w:tcPr>
-            <w:tcW w:type="dxa" w:w="1043"/>
+            <w:tcW w:type="dxa" w:w="922"/>
             <w:tcBorders>
               <w:top w:val="single" w:color="BBBBBB" w:sz="1"/>
               <w:left w:val="single" w:color="BBBBBB" w:sz="1"/>
@@ -8650,7 +8650,7 @@
         </w:tc>
         <w:tc>
           <w:tcPr>
-            <w:tcW w:type="dxa" w:w="1141"/>
+            <w:tcW w:type="dxa" w:w="1006"/>
             <w:tcBorders>
               <w:top w:val="single" w:color="BBBBBB" w:sz="1"/>
               <w:left w:val="single" w:color="BBBBBB" w:sz="1"/>
@@ -8677,7 +8677,7 @@
         </w:tc>
         <w:tc>
           <w:tcPr>
-            <w:tcW w:type="dxa" w:w="4632"/>
+            <w:tcW w:type="dxa" w:w="5014"/>
             <w:tcBorders>
               <w:top w:val="single" w:color="BBBBBB" w:sz="1"/>
               <w:left w:val="single" w:color="BBBBBB" w:sz="1"/>
@@ -8709,7 +8709,7 @@
         </w:trPr>
         <w:tc>
           <w:tcPr>
-            <w:tcW w:type="dxa" w:w="753"/>
+            <w:tcW w:type="dxa" w:w="748"/>
             <w:tcBorders>
               <w:top w:val="single" w:color="BBBBBB" w:sz="1"/>
               <w:left w:val="single" w:color="BBBBBB" w:sz="1"/>
@@ -8753,7 +8753,7 @@
         </w:tc>
         <w:tc>
           <w:tcPr>
-            <w:tcW w:type="dxa" w:w="1043"/>
+            <w:tcW w:type="dxa" w:w="922"/>
             <w:tcBorders>
               <w:top w:val="single" w:color="BBBBBB" w:sz="1"/>
               <w:left w:val="single" w:color="BBBBBB" w:sz="1"/>
@@ -8775,7 +8775,7 @@
         </w:tc>
         <w:tc>
           <w:tcPr>
-            <w:tcW w:type="dxa" w:w="1043"/>
+            <w:tcW w:type="dxa" w:w="922"/>
             <w:tcBorders>
               <w:top w:val="single" w:color="BBBBBB" w:sz="1"/>
               <w:left w:val="single" w:color="BBBBBB" w:sz="1"/>
@@ -8797,7 +8797,7 @@
         </w:tc>
         <w:tc>
           <w:tcPr>
-            <w:tcW w:type="dxa" w:w="1141"/>
+            <w:tcW w:type="dxa" w:w="1006"/>
             <w:tcBorders>
               <w:top w:val="single" w:color="BBBBBB" w:sz="1"/>
               <w:left w:val="single" w:color="BBBBBB" w:sz="1"/>
@@ -8819,7 +8819,7 @@
         </w:tc>
         <w:tc>
           <w:tcPr>
-            <w:tcW w:type="dxa" w:w="4632"/>
+            <w:tcW w:type="dxa" w:w="5014"/>
             <w:tcBorders>
               <w:top w:val="single" w:color="BBBBBB" w:sz="1"/>
               <w:left w:val="single" w:color="BBBBBB" w:sz="1"/>
@@ -8846,7 +8846,7 @@
         </w:trPr>
         <w:tc>
           <w:tcPr>
-            <w:tcW w:type="dxa" w:w="753"/>
+            <w:tcW w:type="dxa" w:w="748"/>
             <w:tcBorders>
               <w:top w:val="single" w:color="BBBBBB" w:sz="1"/>
               <w:left w:val="single" w:color="BBBBBB" w:sz="1"/>
@@ -8890,7 +8890,7 @@
         </w:tc>
         <w:tc>
           <w:tcPr>
-            <w:tcW w:type="dxa" w:w="1043"/>
+            <w:tcW w:type="dxa" w:w="922"/>
             <w:tcBorders>
               <w:top w:val="single" w:color="BBBBBB" w:sz="1"/>
               <w:left w:val="single" w:color="BBBBBB" w:sz="1"/>
@@ -8912,7 +8912,7 @@
         </w:tc>
         <w:tc>
           <w:tcPr>
-            <w:tcW w:type="dxa" w:w="1043"/>
+            <w:tcW w:type="dxa" w:w="922"/>
             <w:tcBorders>
               <w:top w:val="single" w:color="BBBBBB" w:sz="1"/>
               <w:left w:val="single" w:color="BBBBBB" w:sz="1"/>
@@ -8934,7 +8934,7 @@
         </w:tc>
         <w:tc>
           <w:tcPr>
-            <w:tcW w:type="dxa" w:w="1141"/>
+            <w:tcW w:type="dxa" w:w="1006"/>
             <w:tcBorders>
               <w:top w:val="single" w:color="BBBBBB" w:sz="1"/>
               <w:left w:val="single" w:color="BBBBBB" w:sz="1"/>
@@ -8956,7 +8956,7 @@
         </w:tc>
         <w:tc>
           <w:tcPr>
-            <w:tcW w:type="dxa" w:w="4632"/>
+            <w:tcW w:type="dxa" w:w="5014"/>
             <w:tcBorders>
               <w:top w:val="single" w:color="BBBBBB" w:sz="1"/>
               <w:left w:val="single" w:color="BBBBBB" w:sz="1"/>
@@ -8983,7 +8983,7 @@
         </w:trPr>
         <w:tc>
           <w:tcPr>
-            <w:tcW w:type="dxa" w:w="753"/>
+            <w:tcW w:type="dxa" w:w="748"/>
             <w:tcBorders>
               <w:top w:val="single" w:color="BBBBBB" w:sz="1"/>
               <w:left w:val="single" w:color="BBBBBB" w:sz="1"/>
@@ -9027,7 +9027,7 @@
         </w:tc>
         <w:tc>
           <w:tcPr>
-            <w:tcW w:type="dxa" w:w="1043"/>
+            <w:tcW w:type="dxa" w:w="922"/>
             <w:tcBorders>
               <w:top w:val="single" w:color="BBBBBB" w:sz="1"/>
               <w:left w:val="single" w:color="BBBBBB" w:sz="1"/>
@@ -9049,7 +9049,7 @@
         </w:tc>
         <w:tc>
           <w:tcPr>
-            <w:tcW w:type="dxa" w:w="1043"/>
+            <w:tcW w:type="dxa" w:w="922"/>
             <w:tcBorders>
               <w:top w:val="single" w:color="BBBBBB" w:sz="1"/>
               <w:left w:val="single" w:color="BBBBBB" w:sz="1"/>
@@ -9071,7 +9071,7 @@
         </w:tc>
         <w:tc>
           <w:tcPr>
-            <w:tcW w:type="dxa" w:w="1141"/>
+            <w:tcW w:type="dxa" w:w="1006"/>
             <w:tcBorders>
               <w:top w:val="single" w:color="BBBBBB" w:sz="1"/>
               <w:left w:val="single" w:color="BBBBBB" w:sz="1"/>
@@ -9093,7 +9093,7 @@
         </w:tc>
         <w:tc>
           <w:tcPr>
-            <w:tcW w:type="dxa" w:w="4632"/>
+            <w:tcW w:type="dxa" w:w="5014"/>
             <w:tcBorders>
               <w:top w:val="single" w:color="BBBBBB" w:sz="1"/>
               <w:left w:val="single" w:color="BBBBBB" w:sz="1"/>
@@ -9120,7 +9120,7 @@
         </w:trPr>
         <w:tc>
           <w:tcPr>
-            <w:tcW w:type="dxa" w:w="753"/>
+            <w:tcW w:type="dxa" w:w="748"/>
             <w:tcBorders>
               <w:top w:val="single" w:color="BBBBBB" w:sz="1"/>
               <w:left w:val="single" w:color="BBBBBB" w:sz="1"/>
@@ -9164,7 +9164,7 @@
         </w:tc>
         <w:tc>
           <w:tcPr>
-            <w:tcW w:type="dxa" w:w="1043"/>
+            <w:tcW w:type="dxa" w:w="922"/>
             <w:tcBorders>
               <w:top w:val="single" w:color="BBBBBB" w:sz="1"/>
               <w:left w:val="single" w:color="BBBBBB" w:sz="1"/>
@@ -9186,7 +9186,7 @@
         </w:tc>
         <w:tc>
           <w:tcPr>
-            <w:tcW w:type="dxa" w:w="1043"/>
+            <w:tcW w:type="dxa" w:w="922"/>
             <w:tcBorders>
               <w:top w:val="single" w:color="BBBBBB" w:sz="1"/>
               <w:left w:val="single" w:color="BBBBBB" w:sz="1"/>
@@ -9208,7 +9208,7 @@
         </w:tc>
         <w:tc>
           <w:tcPr>
-            <w:tcW w:type="dxa" w:w="1141"/>
+            <w:tcW w:type="dxa" w:w="1006"/>
             <w:tcBorders>
               <w:top w:val="single" w:color="BBBBBB" w:sz="1"/>
               <w:left w:val="single" w:color="BBBBBB" w:sz="1"/>
@@ -9230,23 +9230,23 @@
         </w:tc>
         <w:tc>
           <w:tcPr>
-            <w:tcW w:type="dxa" w:w="4632"/>
-            <w:tcBorders>
-              <w:top w:val="single" w:color="BBBBBB" w:sz="1"/>
-              <w:left w:val="single" w:color="BBBBBB" w:sz="1"/>
-              <w:bottom w:val="single" w:color="BBBBBB" w:sz="1"/>
-              <w:right w:val="single" w:color="BBBBBB" w:sz="1"/>
-            </w:tcBorders>
-            <w:tcMar>
-              <w:top w:type="dxa" w:w="60"/>
-              <w:left w:type="dxa" w:w="100"/>
-              <w:bottom w:type="dxa" w:w="60"/>
-              <w:right w:type="dxa" w:w="100"/>
-            </w:tcMar>
-          </w:tcPr>
-          <w:p>
-            <w:r>
-              <w:t xml:space="preserve">未启动</w:t>
+            <w:tcW w:type="dxa" w:w="5014"/>
+            <w:tcBorders>
+              <w:top w:val="single" w:color="BBBBBB" w:sz="1"/>
+              <w:left w:val="single" w:color="BBBBBB" w:sz="1"/>
+              <w:bottom w:val="single" w:color="BBBBBB" w:sz="1"/>
+              <w:right w:val="single" w:color="BBBBBB" w:sz="1"/>
+            </w:tcBorders>
+            <w:tcMar>
+              <w:top w:type="dxa" w:w="60"/>
+              <w:left w:type="dxa" w:w="100"/>
+              <w:bottom w:type="dxa" w:w="60"/>
+              <w:right w:type="dxa" w:w="100"/>
+            </w:tcMar>
+          </w:tcPr>
+          <w:p>
+            <w:r>
+              <w:t xml:space="preserve">已实现（iOS/Android 跟车页蓝牙关/无邻居横幅，待真机关蓝牙验收）</w:t>
             </w:r>
           </w:p>
         </w:tc>
@@ -9257,7 +9257,7 @@
         </w:trPr>
         <w:tc>
           <w:tcPr>
-            <w:tcW w:type="dxa" w:w="753"/>
+            <w:tcW w:type="dxa" w:w="748"/>
             <w:tcBorders>
               <w:top w:val="single" w:color="BBBBBB" w:sz="1"/>
               <w:left w:val="single" w:color="BBBBBB" w:sz="1"/>
@@ -9301,7 +9301,7 @@
         </w:tc>
         <w:tc>
           <w:tcPr>
-            <w:tcW w:type="dxa" w:w="1043"/>
+            <w:tcW w:type="dxa" w:w="922"/>
             <w:tcBorders>
               <w:top w:val="single" w:color="BBBBBB" w:sz="1"/>
               <w:left w:val="single" w:color="BBBBBB" w:sz="1"/>
@@ -9323,7 +9323,7 @@
         </w:tc>
         <w:tc>
           <w:tcPr>
-            <w:tcW w:type="dxa" w:w="1043"/>
+            <w:tcW w:type="dxa" w:w="922"/>
             <w:tcBorders>
               <w:top w:val="single" w:color="BBBBBB" w:sz="1"/>
               <w:left w:val="single" w:color="BBBBBB" w:sz="1"/>
@@ -9345,7 +9345,7 @@
         </w:tc>
         <w:tc>
           <w:tcPr>
-            <w:tcW w:type="dxa" w:w="1141"/>
+            <w:tcW w:type="dxa" w:w="1006"/>
             <w:tcBorders>
               <w:top w:val="single" w:color="BBBBBB" w:sz="1"/>
               <w:left w:val="single" w:color="BBBBBB" w:sz="1"/>
@@ -9367,7 +9367,7 @@
         </w:tc>
         <w:tc>
           <w:tcPr>
-            <w:tcW w:type="dxa" w:w="4632"/>
+            <w:tcW w:type="dxa" w:w="5014"/>
             <w:tcBorders>
               <w:top w:val="single" w:color="BBBBBB" w:sz="1"/>
               <w:left w:val="single" w:color="BBBBBB" w:sz="1"/>
@@ -9394,7 +9394,7 @@
         </w:trPr>
         <w:tc>
           <w:tcPr>
-            <w:tcW w:type="dxa" w:w="753"/>
+            <w:tcW w:type="dxa" w:w="748"/>
             <w:tcBorders>
               <w:top w:val="single" w:color="BBBBBB" w:sz="1"/>
               <w:left w:val="single" w:color="BBBBBB" w:sz="1"/>
@@ -9438,7 +9438,7 @@
         </w:tc>
         <w:tc>
           <w:tcPr>
-            <w:tcW w:type="dxa" w:w="1043"/>
+            <w:tcW w:type="dxa" w:w="922"/>
             <w:tcBorders>
               <w:top w:val="single" w:color="BBBBBB" w:sz="1"/>
               <w:left w:val="single" w:color="BBBBBB" w:sz="1"/>
@@ -9460,7 +9460,7 @@
         </w:tc>
         <w:tc>
           <w:tcPr>
-            <w:tcW w:type="dxa" w:w="1043"/>
+            <w:tcW w:type="dxa" w:w="922"/>
             <w:tcBorders>
               <w:top w:val="single" w:color="BBBBBB" w:sz="1"/>
               <w:left w:val="single" w:color="BBBBBB" w:sz="1"/>
@@ -9482,7 +9482,7 @@
         </w:tc>
         <w:tc>
           <w:tcPr>
-            <w:tcW w:type="dxa" w:w="1141"/>
+            <w:tcW w:type="dxa" w:w="1006"/>
             <w:tcBorders>
               <w:top w:val="single" w:color="BBBBBB" w:sz="1"/>
               <w:left w:val="single" w:color="BBBBBB" w:sz="1"/>
@@ -9504,7 +9504,7 @@
         </w:tc>
         <w:tc>
           <w:tcPr>
-            <w:tcW w:type="dxa" w:w="4632"/>
+            <w:tcW w:type="dxa" w:w="5014"/>
             <w:tcBorders>
               <w:top w:val="single" w:color="BBBBBB" w:sz="1"/>
               <w:left w:val="single" w:color="BBBBBB" w:sz="1"/>
@@ -9531,7 +9531,7 @@
         </w:trPr>
         <w:tc>
           <w:tcPr>
-            <w:tcW w:type="dxa" w:w="753"/>
+            <w:tcW w:type="dxa" w:w="748"/>
             <w:tcBorders>
               <w:top w:val="single" w:color="BBBBBB" w:sz="1"/>
               <w:left w:val="single" w:color="BBBBBB" w:sz="1"/>
@@ -9575,7 +9575,7 @@
         </w:tc>
         <w:tc>
           <w:tcPr>
-            <w:tcW w:type="dxa" w:w="1043"/>
+            <w:tcW w:type="dxa" w:w="922"/>
             <w:tcBorders>
               <w:top w:val="single" w:color="BBBBBB" w:sz="1"/>
               <w:left w:val="single" w:color="BBBBBB" w:sz="1"/>
@@ -9597,7 +9597,7 @@
         </w:tc>
         <w:tc>
           <w:tcPr>
-            <w:tcW w:type="dxa" w:w="1043"/>
+            <w:tcW w:type="dxa" w:w="922"/>
             <w:tcBorders>
               <w:top w:val="single" w:color="BBBBBB" w:sz="1"/>
               <w:left w:val="single" w:color="BBBBBB" w:sz="1"/>
@@ -9619,7 +9619,7 @@
         </w:tc>
         <w:tc>
           <w:tcPr>
-            <w:tcW w:type="dxa" w:w="1141"/>
+            <w:tcW w:type="dxa" w:w="1006"/>
             <w:tcBorders>
               <w:top w:val="single" w:color="BBBBBB" w:sz="1"/>
               <w:left w:val="single" w:color="BBBBBB" w:sz="1"/>
@@ -9641,7 +9641,7 @@
         </w:tc>
         <w:tc>
           <w:tcPr>
-            <w:tcW w:type="dxa" w:w="4632"/>
+            <w:tcW w:type="dxa" w:w="5014"/>
             <w:tcBorders>
               <w:top w:val="single" w:color="BBBBBB" w:sz="1"/>
               <w:left w:val="single" w:color="BBBBBB" w:sz="1"/>
@@ -9668,7 +9668,7 @@
         </w:trPr>
         <w:tc>
           <w:tcPr>
-            <w:tcW w:type="dxa" w:w="753"/>
+            <w:tcW w:type="dxa" w:w="748"/>
             <w:tcBorders>
               <w:top w:val="single" w:color="BBBBBB" w:sz="1"/>
               <w:left w:val="single" w:color="BBBBBB" w:sz="1"/>
@@ -9712,7 +9712,7 @@
         </w:tc>
         <w:tc>
           <w:tcPr>
-            <w:tcW w:type="dxa" w:w="1043"/>
+            <w:tcW w:type="dxa" w:w="922"/>
             <w:tcBorders>
               <w:top w:val="single" w:color="BBBBBB" w:sz="1"/>
               <w:left w:val="single" w:color="BBBBBB" w:sz="1"/>
@@ -9734,7 +9734,7 @@
         </w:tc>
         <w:tc>
           <w:tcPr>
-            <w:tcW w:type="dxa" w:w="1043"/>
+            <w:tcW w:type="dxa" w:w="922"/>
             <w:tcBorders>
               <w:top w:val="single" w:color="BBBBBB" w:sz="1"/>
               <w:left w:val="single" w:color="BBBBBB" w:sz="1"/>
@@ -9756,7 +9756,7 @@
         </w:tc>
         <w:tc>
           <w:tcPr>
-            <w:tcW w:type="dxa" w:w="1141"/>
+            <w:tcW w:type="dxa" w:w="1006"/>
             <w:tcBorders>
               <w:top w:val="single" w:color="BBBBBB" w:sz="1"/>
               <w:left w:val="single" w:color="BBBBBB" w:sz="1"/>
@@ -9778,7 +9778,7 @@
         </w:tc>
         <w:tc>
           <w:tcPr>
-            <w:tcW w:type="dxa" w:w="4632"/>
+            <w:tcW w:type="dxa" w:w="5014"/>
             <w:tcBorders>
               <w:top w:val="single" w:color="BBBBBB" w:sz="1"/>
               <w:left w:val="single" w:color="BBBBBB" w:sz="1"/>
@@ -9805,7 +9805,7 @@
         </w:trPr>
         <w:tc>
           <w:tcPr>
-            <w:tcW w:type="dxa" w:w="753"/>
+            <w:tcW w:type="dxa" w:w="748"/>
             <w:tcBorders>
               <w:top w:val="single" w:color="BBBBBB" w:sz="1"/>
               <w:left w:val="single" w:color="BBBBBB" w:sz="1"/>
@@ -9849,7 +9849,7 @@
         </w:tc>
         <w:tc>
           <w:tcPr>
-            <w:tcW w:type="dxa" w:w="1043"/>
+            <w:tcW w:type="dxa" w:w="922"/>
             <w:tcBorders>
               <w:top w:val="single" w:color="BBBBBB" w:sz="1"/>
               <w:left w:val="single" w:color="BBBBBB" w:sz="1"/>
@@ -9871,7 +9871,7 @@
         </w:tc>
         <w:tc>
           <w:tcPr>
-            <w:tcW w:type="dxa" w:w="1043"/>
+            <w:tcW w:type="dxa" w:w="922"/>
             <w:tcBorders>
               <w:top w:val="single" w:color="BBBBBB" w:sz="1"/>
               <w:left w:val="single" w:color="BBBBBB" w:sz="1"/>
@@ -9893,7 +9893,7 @@
         </w:tc>
         <w:tc>
           <w:tcPr>
-            <w:tcW w:type="dxa" w:w="1141"/>
+            <w:tcW w:type="dxa" w:w="1006"/>
             <w:tcBorders>
               <w:top w:val="single" w:color="BBBBBB" w:sz="1"/>
               <w:left w:val="single" w:color="BBBBBB" w:sz="1"/>
@@ -9915,7 +9915,7 @@
         </w:tc>
         <w:tc>
           <w:tcPr>
-            <w:tcW w:type="dxa" w:w="4632"/>
+            <w:tcW w:type="dxa" w:w="5014"/>
             <w:tcBorders>
               <w:top w:val="single" w:color="BBBBBB" w:sz="1"/>
               <w:left w:val="single" w:color="BBBBBB" w:sz="1"/>
@@ -9942,7 +9942,7 @@
         </w:trPr>
         <w:tc>
           <w:tcPr>
-            <w:tcW w:type="dxa" w:w="753"/>
+            <w:tcW w:type="dxa" w:w="748"/>
             <w:tcBorders>
               <w:top w:val="single" w:color="BBBBBB" w:sz="1"/>
               <w:left w:val="single" w:color="BBBBBB" w:sz="1"/>
@@ -9986,7 +9986,7 @@
         </w:tc>
         <w:tc>
           <w:tcPr>
-            <w:tcW w:type="dxa" w:w="1043"/>
+            <w:tcW w:type="dxa" w:w="922"/>
             <w:tcBorders>
               <w:top w:val="single" w:color="BBBBBB" w:sz="1"/>
               <w:left w:val="single" w:color="BBBBBB" w:sz="1"/>
@@ -10008,7 +10008,7 @@
         </w:tc>
         <w:tc>
           <w:tcPr>
-            <w:tcW w:type="dxa" w:w="1043"/>
+            <w:tcW w:type="dxa" w:w="922"/>
             <w:tcBorders>
               <w:top w:val="single" w:color="BBBBBB" w:sz="1"/>
               <w:left w:val="single" w:color="BBBBBB" w:sz="1"/>
@@ -10030,7 +10030,7 @@
         </w:tc>
         <w:tc>
           <w:tcPr>
-            <w:tcW w:type="dxa" w:w="1141"/>
+            <w:tcW w:type="dxa" w:w="1006"/>
             <w:tcBorders>
               <w:top w:val="single" w:color="BBBBBB" w:sz="1"/>
               <w:left w:val="single" w:color="BBBBBB" w:sz="1"/>
@@ -10052,7 +10052,7 @@
         </w:tc>
         <w:tc>
           <w:tcPr>
-            <w:tcW w:type="dxa" w:w="4632"/>
+            <w:tcW w:type="dxa" w:w="5014"/>
             <w:tcBorders>
               <w:top w:val="single" w:color="BBBBBB" w:sz="1"/>
               <w:left w:val="single" w:color="BBBBBB" w:sz="1"/>
@@ -10079,7 +10079,7 @@
         </w:trPr>
         <w:tc>
           <w:tcPr>
-            <w:tcW w:type="dxa" w:w="753"/>
+            <w:tcW w:type="dxa" w:w="748"/>
             <w:tcBorders>
               <w:top w:val="single" w:color="BBBBBB" w:sz="1"/>
               <w:left w:val="single" w:color="BBBBBB" w:sz="1"/>
@@ -10123,7 +10123,7 @@
         </w:tc>
         <w:tc>
           <w:tcPr>
-            <w:tcW w:type="dxa" w:w="1043"/>
+            <w:tcW w:type="dxa" w:w="922"/>
             <w:tcBorders>
               <w:top w:val="single" w:color="BBBBBB" w:sz="1"/>
               <w:left w:val="single" w:color="BBBBBB" w:sz="1"/>
@@ -10145,7 +10145,7 @@
         </w:tc>
         <w:tc>
           <w:tcPr>
-            <w:tcW w:type="dxa" w:w="1043"/>
+            <w:tcW w:type="dxa" w:w="922"/>
             <w:tcBorders>
               <w:top w:val="single" w:color="BBBBBB" w:sz="1"/>
               <w:left w:val="single" w:color="BBBBBB" w:sz="1"/>
@@ -10167,7 +10167,7 @@
         </w:tc>
         <w:tc>
           <w:tcPr>
-            <w:tcW w:type="dxa" w:w="1141"/>
+            <w:tcW w:type="dxa" w:w="1006"/>
             <w:tcBorders>
               <w:top w:val="single" w:color="BBBBBB" w:sz="1"/>
               <w:left w:val="single" w:color="BBBBBB" w:sz="1"/>
@@ -10189,7 +10189,7 @@
         </w:tc>
         <w:tc>
           <w:tcPr>
-            <w:tcW w:type="dxa" w:w="4632"/>
+            <w:tcW w:type="dxa" w:w="5014"/>
             <w:tcBorders>
               <w:top w:val="single" w:color="BBBBBB" w:sz="1"/>
               <w:left w:val="single" w:color="BBBBBB" w:sz="1"/>
@@ -10216,7 +10216,7 @@
         </w:trPr>
         <w:tc>
           <w:tcPr>
-            <w:tcW w:type="dxa" w:w="753"/>
+            <w:tcW w:type="dxa" w:w="748"/>
             <w:tcBorders>
               <w:top w:val="single" w:color="BBBBBB" w:sz="1"/>
               <w:left w:val="single" w:color="BBBBBB" w:sz="1"/>
@@ -10260,7 +10260,7 @@
         </w:tc>
         <w:tc>
           <w:tcPr>
-            <w:tcW w:type="dxa" w:w="1043"/>
+            <w:tcW w:type="dxa" w:w="922"/>
             <w:tcBorders>
               <w:top w:val="single" w:color="BBBBBB" w:sz="1"/>
               <w:left w:val="single" w:color="BBBBBB" w:sz="1"/>
@@ -10282,7 +10282,7 @@
         </w:tc>
         <w:tc>
           <w:tcPr>
-            <w:tcW w:type="dxa" w:w="1043"/>
+            <w:tcW w:type="dxa" w:w="922"/>
             <w:tcBorders>
               <w:top w:val="single" w:color="BBBBBB" w:sz="1"/>
               <w:left w:val="single" w:color="BBBBBB" w:sz="1"/>
@@ -10304,7 +10304,7 @@
         </w:tc>
         <w:tc>
           <w:tcPr>
-            <w:tcW w:type="dxa" w:w="1141"/>
+            <w:tcW w:type="dxa" w:w="1006"/>
             <w:tcBorders>
               <w:top w:val="single" w:color="BBBBBB" w:sz="1"/>
               <w:left w:val="single" w:color="BBBBBB" w:sz="1"/>
@@ -10326,7 +10326,7 @@
         </w:tc>
         <w:tc>
           <w:tcPr>
-            <w:tcW w:type="dxa" w:w="4632"/>
+            <w:tcW w:type="dxa" w:w="5014"/>
             <w:tcBorders>
               <w:top w:val="single" w:color="BBBBBB" w:sz="1"/>
               <w:left w:val="single" w:color="BBBBBB" w:sz="1"/>
@@ -10353,7 +10353,7 @@
         </w:trPr>
         <w:tc>
           <w:tcPr>
-            <w:tcW w:type="dxa" w:w="753"/>
+            <w:tcW w:type="dxa" w:w="748"/>
             <w:tcBorders>
               <w:top w:val="single" w:color="BBBBBB" w:sz="1"/>
               <w:left w:val="single" w:color="BBBBBB" w:sz="1"/>
@@ -10397,7 +10397,7 @@
         </w:tc>
         <w:tc>
           <w:tcPr>
-            <w:tcW w:type="dxa" w:w="1043"/>
+            <w:tcW w:type="dxa" w:w="922"/>
             <w:tcBorders>
               <w:top w:val="single" w:color="BBBBBB" w:sz="1"/>
               <w:left w:val="single" w:color="BBBBBB" w:sz="1"/>
@@ -10419,7 +10419,7 @@
         </w:tc>
         <w:tc>
           <w:tcPr>
-            <w:tcW w:type="dxa" w:w="1043"/>
+            <w:tcW w:type="dxa" w:w="922"/>
             <w:tcBorders>
               <w:top w:val="single" w:color="BBBBBB" w:sz="1"/>
               <w:left w:val="single" w:color="BBBBBB" w:sz="1"/>
@@ -10441,7 +10441,7 @@
         </w:tc>
         <w:tc>
           <w:tcPr>
-            <w:tcW w:type="dxa" w:w="1141"/>
+            <w:tcW w:type="dxa" w:w="1006"/>
             <w:tcBorders>
               <w:top w:val="single" w:color="BBBBBB" w:sz="1"/>
               <w:left w:val="single" w:color="BBBBBB" w:sz="1"/>
@@ -10463,7 +10463,7 @@
         </w:tc>
         <w:tc>
           <w:tcPr>
-            <w:tcW w:type="dxa" w:w="4632"/>
+            <w:tcW w:type="dxa" w:w="5014"/>
             <w:tcBorders>
               <w:top w:val="single" w:color="BBBBBB" w:sz="1"/>
               <w:left w:val="single" w:color="BBBBBB" w:sz="1"/>
@@ -10490,7 +10490,7 @@
         </w:trPr>
         <w:tc>
           <w:tcPr>
-            <w:tcW w:type="dxa" w:w="753"/>
+            <w:tcW w:type="dxa" w:w="748"/>
             <w:tcBorders>
               <w:top w:val="single" w:color="BBBBBB" w:sz="1"/>
               <w:left w:val="single" w:color="BBBBBB" w:sz="1"/>
@@ -10534,7 +10534,7 @@
         </w:tc>
         <w:tc>
           <w:tcPr>
-            <w:tcW w:type="dxa" w:w="1043"/>
+            <w:tcW w:type="dxa" w:w="922"/>
             <w:tcBorders>
               <w:top w:val="single" w:color="BBBBBB" w:sz="1"/>
               <w:left w:val="single" w:color="BBBBBB" w:sz="1"/>
@@ -10556,7 +10556,7 @@
         </w:tc>
         <w:tc>
           <w:tcPr>
-            <w:tcW w:type="dxa" w:w="1043"/>
+            <w:tcW w:type="dxa" w:w="922"/>
             <w:tcBorders>
               <w:top w:val="single" w:color="BBBBBB" w:sz="1"/>
               <w:left w:val="single" w:color="BBBBBB" w:sz="1"/>
@@ -10578,7 +10578,7 @@
         </w:tc>
         <w:tc>
           <w:tcPr>
-            <w:tcW w:type="dxa" w:w="1141"/>
+            <w:tcW w:type="dxa" w:w="1006"/>
             <w:tcBorders>
               <w:top w:val="single" w:color="BBBBBB" w:sz="1"/>
               <w:left w:val="single" w:color="BBBBBB" w:sz="1"/>
@@ -10600,7 +10600,7 @@
         </w:tc>
         <w:tc>
           <w:tcPr>
-            <w:tcW w:type="dxa" w:w="4632"/>
+            <w:tcW w:type="dxa" w:w="5014"/>
             <w:tcBorders>
               <w:top w:val="single" w:color="BBBBBB" w:sz="1"/>
               <w:left w:val="single" w:color="BBBBBB" w:sz="1"/>
@@ -10627,7 +10627,7 @@
         </w:trPr>
         <w:tc>
           <w:tcPr>
-            <w:tcW w:type="dxa" w:w="753"/>
+            <w:tcW w:type="dxa" w:w="748"/>
             <w:tcBorders>
               <w:top w:val="single" w:color="BBBBBB" w:sz="1"/>
               <w:left w:val="single" w:color="BBBBBB" w:sz="1"/>
@@ -10671,7 +10671,7 @@
         </w:tc>
         <w:tc>
           <w:tcPr>
-            <w:tcW w:type="dxa" w:w="1043"/>
+            <w:tcW w:type="dxa" w:w="922"/>
             <w:tcBorders>
               <w:top w:val="single" w:color="BBBBBB" w:sz="1"/>
               <w:left w:val="single" w:color="BBBBBB" w:sz="1"/>
@@ -10693,7 +10693,7 @@
         </w:tc>
         <w:tc>
           <w:tcPr>
-            <w:tcW w:type="dxa" w:w="1043"/>
+            <w:tcW w:type="dxa" w:w="922"/>
             <w:tcBorders>
               <w:top w:val="single" w:color="BBBBBB" w:sz="1"/>
               <w:left w:val="single" w:color="BBBBBB" w:sz="1"/>
@@ -10715,7 +10715,7 @@
         </w:tc>
         <w:tc>
           <w:tcPr>
-            <w:tcW w:type="dxa" w:w="1141"/>
+            <w:tcW w:type="dxa" w:w="1006"/>
             <w:tcBorders>
               <w:top w:val="single" w:color="BBBBBB" w:sz="1"/>
               <w:left w:val="single" w:color="BBBBBB" w:sz="1"/>
@@ -10737,7 +10737,7 @@
         </w:tc>
         <w:tc>
           <w:tcPr>
-            <w:tcW w:type="dxa" w:w="4632"/>
+            <w:tcW w:type="dxa" w:w="5014"/>
             <w:tcBorders>
               <w:top w:val="single" w:color="BBBBBB" w:sz="1"/>
               <w:left w:val="single" w:color="BBBBBB" w:sz="1"/>
@@ -10764,7 +10764,7 @@
         </w:trPr>
         <w:tc>
           <w:tcPr>
-            <w:tcW w:type="dxa" w:w="753"/>
+            <w:tcW w:type="dxa" w:w="748"/>
             <w:tcBorders>
               <w:top w:val="single" w:color="BBBBBB" w:sz="1"/>
               <w:left w:val="single" w:color="BBBBBB" w:sz="1"/>
@@ -10808,7 +10808,7 @@
         </w:tc>
         <w:tc>
           <w:tcPr>
-            <w:tcW w:type="dxa" w:w="1043"/>
+            <w:tcW w:type="dxa" w:w="922"/>
             <w:tcBorders>
               <w:top w:val="single" w:color="BBBBBB" w:sz="1"/>
               <w:left w:val="single" w:color="BBBBBB" w:sz="1"/>
@@ -10830,7 +10830,7 @@
         </w:tc>
         <w:tc>
           <w:tcPr>
-            <w:tcW w:type="dxa" w:w="1043"/>
+            <w:tcW w:type="dxa" w:w="922"/>
             <w:tcBorders>
               <w:top w:val="single" w:color="BBBBBB" w:sz="1"/>
               <w:left w:val="single" w:color="BBBBBB" w:sz="1"/>
@@ -10852,7 +10852,7 @@
         </w:tc>
         <w:tc>
           <w:tcPr>
-            <w:tcW w:type="dxa" w:w="1141"/>
+            <w:tcW w:type="dxa" w:w="1006"/>
             <w:tcBorders>
               <w:top w:val="single" w:color="BBBBBB" w:sz="1"/>
               <w:left w:val="single" w:color="BBBBBB" w:sz="1"/>
@@ -10874,23 +10874,23 @@
         </w:tc>
         <w:tc>
           <w:tcPr>
-            <w:tcW w:type="dxa" w:w="4632"/>
-            <w:tcBorders>
-              <w:top w:val="single" w:color="BBBBBB" w:sz="1"/>
-              <w:left w:val="single" w:color="BBBBBB" w:sz="1"/>
-              <w:bottom w:val="single" w:color="BBBBBB" w:sz="1"/>
-              <w:right w:val="single" w:color="BBBBBB" w:sz="1"/>
-            </w:tcBorders>
-            <w:tcMar>
-              <w:top w:type="dxa" w:w="60"/>
-              <w:left w:type="dxa" w:w="100"/>
-              <w:bottom w:type="dxa" w:w="60"/>
-              <w:right w:type="dxa" w:w="100"/>
-            </w:tcMar>
-          </w:tcPr>
-          <w:p>
-            <w:r>
-              <w:t xml:space="preserve">未启动</w:t>
+            <w:tcW w:type="dxa" w:w="5014"/>
+            <w:tcBorders>
+              <w:top w:val="single" w:color="BBBBBB" w:sz="1"/>
+              <w:left w:val="single" w:color="BBBBBB" w:sz="1"/>
+              <w:bottom w:val="single" w:color="BBBBBB" w:sz="1"/>
+              <w:right w:val="single" w:color="BBBBBB" w:sz="1"/>
+            </w:tcBorders>
+            <w:tcMar>
+              <w:top w:type="dxa" w:w="60"/>
+              <w:left w:type="dxa" w:w="100"/>
+              <w:bottom w:type="dxa" w:w="60"/>
+              <w:right w:type="dxa" w:w="100"/>
+            </w:tcMar>
+          </w:tcPr>
+          <w:p>
+            <w:r>
+              <w:t xml:space="preserve">已实现（token 鉴权+限流+大小/IP 上限，4 项破坏性验收进 CI；TLS=反代部署要求已写入 env 说明）</w:t>
             </w:r>
           </w:p>
         </w:tc>
@@ -10901,7 +10901,7 @@
         </w:trPr>
         <w:tc>
           <w:tcPr>
-            <w:tcW w:type="dxa" w:w="753"/>
+            <w:tcW w:type="dxa" w:w="748"/>
             <w:tcBorders>
               <w:top w:val="single" w:color="BBBBBB" w:sz="1"/>
               <w:left w:val="single" w:color="BBBBBB" w:sz="1"/>
@@ -10945,7 +10945,7 @@
         </w:tc>
         <w:tc>
           <w:tcPr>
-            <w:tcW w:type="dxa" w:w="1043"/>
+            <w:tcW w:type="dxa" w:w="922"/>
             <w:tcBorders>
               <w:top w:val="single" w:color="BBBBBB" w:sz="1"/>
               <w:left w:val="single" w:color="BBBBBB" w:sz="1"/>
@@ -10967,7 +10967,7 @@
         </w:tc>
         <w:tc>
           <w:tcPr>
-            <w:tcW w:type="dxa" w:w="1043"/>
+            <w:tcW w:type="dxa" w:w="922"/>
             <w:tcBorders>
               <w:top w:val="single" w:color="BBBBBB" w:sz="1"/>
               <w:left w:val="single" w:color="BBBBBB" w:sz="1"/>
@@ -10989,7 +10989,7 @@
         </w:tc>
         <w:tc>
           <w:tcPr>
-            <w:tcW w:type="dxa" w:w="1141"/>
+            <w:tcW w:type="dxa" w:w="1006"/>
             <w:tcBorders>
               <w:top w:val="single" w:color="BBBBBB" w:sz="1"/>
               <w:left w:val="single" w:color="BBBBBB" w:sz="1"/>
@@ -11011,7 +11011,7 @@
         </w:tc>
         <w:tc>
           <w:tcPr>
-            <w:tcW w:type="dxa" w:w="4632"/>
+            <w:tcW w:type="dxa" w:w="5014"/>
             <w:tcBorders>
               <w:top w:val="single" w:color="BBBBBB" w:sz="1"/>
               <w:left w:val="single" w:color="BBBBBB" w:sz="1"/>
@@ -11038,7 +11038,7 @@
         </w:trPr>
         <w:tc>
           <w:tcPr>
-            <w:tcW w:type="dxa" w:w="753"/>
+            <w:tcW w:type="dxa" w:w="748"/>
             <w:tcBorders>
               <w:top w:val="single" w:color="BBBBBB" w:sz="1"/>
               <w:left w:val="single" w:color="BBBBBB" w:sz="1"/>
@@ -11082,7 +11082,7 @@
         </w:tc>
         <w:tc>
           <w:tcPr>
-            <w:tcW w:type="dxa" w:w="1043"/>
+            <w:tcW w:type="dxa" w:w="922"/>
             <w:tcBorders>
               <w:top w:val="single" w:color="BBBBBB" w:sz="1"/>
               <w:left w:val="single" w:color="BBBBBB" w:sz="1"/>
@@ -11104,7 +11104,7 @@
         </w:tc>
         <w:tc>
           <w:tcPr>
-            <w:tcW w:type="dxa" w:w="1043"/>
+            <w:tcW w:type="dxa" w:w="922"/>
             <w:tcBorders>
               <w:top w:val="single" w:color="BBBBBB" w:sz="1"/>
               <w:left w:val="single" w:color="BBBBBB" w:sz="1"/>
@@ -11126,7 +11126,7 @@
         </w:tc>
         <w:tc>
           <w:tcPr>
-            <w:tcW w:type="dxa" w:w="1141"/>
+            <w:tcW w:type="dxa" w:w="1006"/>
             <w:tcBorders>
               <w:top w:val="single" w:color="BBBBBB" w:sz="1"/>
               <w:left w:val="single" w:color="BBBBBB" w:sz="1"/>
@@ -11148,7 +11148,7 @@
         </w:tc>
         <w:tc>
           <w:tcPr>
-            <w:tcW w:type="dxa" w:w="4632"/>
+            <w:tcW w:type="dxa" w:w="5014"/>
             <w:tcBorders>
               <w:top w:val="single" w:color="BBBBBB" w:sz="1"/>
               <w:left w:val="single" w:color="BBBBBB" w:sz="1"/>
@@ -11175,7 +11175,7 @@
         </w:trPr>
         <w:tc>
           <w:tcPr>
-            <w:tcW w:type="dxa" w:w="753"/>
+            <w:tcW w:type="dxa" w:w="748"/>
             <w:tcBorders>
               <w:top w:val="single" w:color="BBBBBB" w:sz="1"/>
               <w:left w:val="single" w:color="BBBBBB" w:sz="1"/>
@@ -11219,7 +11219,7 @@
         </w:tc>
         <w:tc>
           <w:tcPr>
-            <w:tcW w:type="dxa" w:w="1043"/>
+            <w:tcW w:type="dxa" w:w="922"/>
             <w:tcBorders>
               <w:top w:val="single" w:color="BBBBBB" w:sz="1"/>
               <w:left w:val="single" w:color="BBBBBB" w:sz="1"/>
@@ -11241,7 +11241,7 @@
         </w:tc>
         <w:tc>
           <w:tcPr>
-            <w:tcW w:type="dxa" w:w="1043"/>
+            <w:tcW w:type="dxa" w:w="922"/>
             <w:tcBorders>
               <w:top w:val="single" w:color="BBBBBB" w:sz="1"/>
               <w:left w:val="single" w:color="BBBBBB" w:sz="1"/>
@@ -11263,7 +11263,7 @@
         </w:tc>
         <w:tc>
           <w:tcPr>
-            <w:tcW w:type="dxa" w:w="1141"/>
+            <w:tcW w:type="dxa" w:w="1006"/>
             <w:tcBorders>
               <w:top w:val="single" w:color="BBBBBB" w:sz="1"/>
               <w:left w:val="single" w:color="BBBBBB" w:sz="1"/>
@@ -11285,7 +11285,7 @@
         </w:tc>
         <w:tc>
           <w:tcPr>
-            <w:tcW w:type="dxa" w:w="4632"/>
+            <w:tcW w:type="dxa" w:w="5014"/>
             <w:tcBorders>
               <w:top w:val="single" w:color="BBBBBB" w:sz="1"/>
               <w:left w:val="single" w:color="BBBBBB" w:sz="1"/>
@@ -11312,7 +11312,7 @@
         </w:trPr>
         <w:tc>
           <w:tcPr>
-            <w:tcW w:type="dxa" w:w="753"/>
+            <w:tcW w:type="dxa" w:w="748"/>
             <w:tcBorders>
               <w:top w:val="single" w:color="BBBBBB" w:sz="1"/>
               <w:left w:val="single" w:color="BBBBBB" w:sz="1"/>
@@ -11356,7 +11356,7 @@
         </w:tc>
         <w:tc>
           <w:tcPr>
-            <w:tcW w:type="dxa" w:w="1043"/>
+            <w:tcW w:type="dxa" w:w="922"/>
             <w:tcBorders>
               <w:top w:val="single" w:color="BBBBBB" w:sz="1"/>
               <w:left w:val="single" w:color="BBBBBB" w:sz="1"/>
@@ -11378,7 +11378,7 @@
         </w:tc>
         <w:tc>
           <w:tcPr>
-            <w:tcW w:type="dxa" w:w="1043"/>
+            <w:tcW w:type="dxa" w:w="922"/>
             <w:tcBorders>
               <w:top w:val="single" w:color="BBBBBB" w:sz="1"/>
               <w:left w:val="single" w:color="BBBBBB" w:sz="1"/>
@@ -11400,7 +11400,7 @@
         </w:tc>
         <w:tc>
           <w:tcPr>
-            <w:tcW w:type="dxa" w:w="1141"/>
+            <w:tcW w:type="dxa" w:w="1006"/>
             <w:tcBorders>
               <w:top w:val="single" w:color="BBBBBB" w:sz="1"/>
               <w:left w:val="single" w:color="BBBBBB" w:sz="1"/>
@@ -11422,7 +11422,7 @@
         </w:tc>
         <w:tc>
           <w:tcPr>
-            <w:tcW w:type="dxa" w:w="4632"/>
+            <w:tcW w:type="dxa" w:w="5014"/>
             <w:tcBorders>
               <w:top w:val="single" w:color="BBBBBB" w:sz="1"/>
               <w:left w:val="single" w:color="BBBBBB" w:sz="1"/>

</xml_diff>

<commit_message>
feat: end-to-end encryption for mesh payloads (closes G-CM-3 impl, E1 complete)
MeshBus payloads are now sealed with AES-256-CBC + HMAC-SHA256
(encrypt-then-MAC, 16B truncated tag); keys derived from the team code
via PBKDF2-HMAC-SHA256 (salt trailmate-mesh-v1, 10000 iters, cached
per team). Envelope team stays cleartext for room filtering only;
wrong-team, tampered, and legacy-plaintext blobs are all dropped.

Byte-identical implementations: iOS MeshCrypto.swift (CommonCrypto —
PBKDF2WithHmacSHA256 unavailable pre-API26, so) Android MeshCrypto.kt
hand-rolls RFC2898 PBKDF2 over HmacSHA256; JS reference
meshcrypto.mjs. A fixed cross-platform test vector is asserted in CI
and embedded in both native sources for on-device comparison.

Fixture grows to 33 assertions (roundtrip, wrong-team reject,
1-byte-tamper reject, version reject, plaintext reject, 100B-chat
still single-chunk, fixed vector, 3-way constant drift checks).
Requirements docs' security sections updated accordingly.
</commit_message>
<xml_diff>
--- a/docs/requirements/TrailMate-Gap分析与演进规划-v1.0.docx
+++ b/docs/requirements/TrailMate-Gap分析与演进规划-v1.0.docx
@@ -8531,10 +8531,10 @@
       <w:tblGrid>
         <w:gridCol w:w="748"/>
         <w:gridCol w:w="748"/>
-        <w:gridCol w:w="922"/>
-        <w:gridCol w:w="922"/>
-        <w:gridCol w:w="1006"/>
-        <w:gridCol w:w="5014"/>
+        <w:gridCol w:w="914"/>
+        <w:gridCol w:w="914"/>
+        <w:gridCol w:w="996"/>
+        <w:gridCol w:w="5040"/>
       </w:tblGrid>
       <w:tr>
         <w:trPr>
@@ -8596,7 +8596,7 @@
         </w:tc>
         <w:tc>
           <w:tcPr>
-            <w:tcW w:type="dxa" w:w="922"/>
+            <w:tcW w:type="dxa" w:w="914"/>
             <w:tcBorders>
               <w:top w:val="single" w:color="BBBBBB" w:sz="1"/>
               <w:left w:val="single" w:color="BBBBBB" w:sz="1"/>
@@ -8623,7 +8623,7 @@
         </w:tc>
         <w:tc>
           <w:tcPr>
-            <w:tcW w:type="dxa" w:w="922"/>
+            <w:tcW w:type="dxa" w:w="914"/>
             <w:tcBorders>
               <w:top w:val="single" w:color="BBBBBB" w:sz="1"/>
               <w:left w:val="single" w:color="BBBBBB" w:sz="1"/>
@@ -8650,7 +8650,7 @@
         </w:tc>
         <w:tc>
           <w:tcPr>
-            <w:tcW w:type="dxa" w:w="1006"/>
+            <w:tcW w:type="dxa" w:w="996"/>
             <w:tcBorders>
               <w:top w:val="single" w:color="BBBBBB" w:sz="1"/>
               <w:left w:val="single" w:color="BBBBBB" w:sz="1"/>
@@ -8677,7 +8677,7 @@
         </w:tc>
         <w:tc>
           <w:tcPr>
-            <w:tcW w:type="dxa" w:w="5014"/>
+            <w:tcW w:type="dxa" w:w="5040"/>
             <w:tcBorders>
               <w:top w:val="single" w:color="BBBBBB" w:sz="1"/>
               <w:left w:val="single" w:color="BBBBBB" w:sz="1"/>
@@ -8753,7 +8753,7 @@
         </w:tc>
         <w:tc>
           <w:tcPr>
-            <w:tcW w:type="dxa" w:w="922"/>
+            <w:tcW w:type="dxa" w:w="914"/>
             <w:tcBorders>
               <w:top w:val="single" w:color="BBBBBB" w:sz="1"/>
               <w:left w:val="single" w:color="BBBBBB" w:sz="1"/>
@@ -8775,7 +8775,7 @@
         </w:tc>
         <w:tc>
           <w:tcPr>
-            <w:tcW w:type="dxa" w:w="922"/>
+            <w:tcW w:type="dxa" w:w="914"/>
             <w:tcBorders>
               <w:top w:val="single" w:color="BBBBBB" w:sz="1"/>
               <w:left w:val="single" w:color="BBBBBB" w:sz="1"/>
@@ -8797,7 +8797,7 @@
         </w:tc>
         <w:tc>
           <w:tcPr>
-            <w:tcW w:type="dxa" w:w="1006"/>
+            <w:tcW w:type="dxa" w:w="996"/>
             <w:tcBorders>
               <w:top w:val="single" w:color="BBBBBB" w:sz="1"/>
               <w:left w:val="single" w:color="BBBBBB" w:sz="1"/>
@@ -8819,7 +8819,7 @@
         </w:tc>
         <w:tc>
           <w:tcPr>
-            <w:tcW w:type="dxa" w:w="5014"/>
+            <w:tcW w:type="dxa" w:w="5040"/>
             <w:tcBorders>
               <w:top w:val="single" w:color="BBBBBB" w:sz="1"/>
               <w:left w:val="single" w:color="BBBBBB" w:sz="1"/>
@@ -8890,7 +8890,7 @@
         </w:tc>
         <w:tc>
           <w:tcPr>
-            <w:tcW w:type="dxa" w:w="922"/>
+            <w:tcW w:type="dxa" w:w="914"/>
             <w:tcBorders>
               <w:top w:val="single" w:color="BBBBBB" w:sz="1"/>
               <w:left w:val="single" w:color="BBBBBB" w:sz="1"/>
@@ -8912,7 +8912,7 @@
         </w:tc>
         <w:tc>
           <w:tcPr>
-            <w:tcW w:type="dxa" w:w="922"/>
+            <w:tcW w:type="dxa" w:w="914"/>
             <w:tcBorders>
               <w:top w:val="single" w:color="BBBBBB" w:sz="1"/>
               <w:left w:val="single" w:color="BBBBBB" w:sz="1"/>
@@ -8934,7 +8934,7 @@
         </w:tc>
         <w:tc>
           <w:tcPr>
-            <w:tcW w:type="dxa" w:w="1006"/>
+            <w:tcW w:type="dxa" w:w="996"/>
             <w:tcBorders>
               <w:top w:val="single" w:color="BBBBBB" w:sz="1"/>
               <w:left w:val="single" w:color="BBBBBB" w:sz="1"/>
@@ -8956,7 +8956,7 @@
         </w:tc>
         <w:tc>
           <w:tcPr>
-            <w:tcW w:type="dxa" w:w="5014"/>
+            <w:tcW w:type="dxa" w:w="5040"/>
             <w:tcBorders>
               <w:top w:val="single" w:color="BBBBBB" w:sz="1"/>
               <w:left w:val="single" w:color="BBBBBB" w:sz="1"/>
@@ -9027,7 +9027,7 @@
         </w:tc>
         <w:tc>
           <w:tcPr>
-            <w:tcW w:type="dxa" w:w="922"/>
+            <w:tcW w:type="dxa" w:w="914"/>
             <w:tcBorders>
               <w:top w:val="single" w:color="BBBBBB" w:sz="1"/>
               <w:left w:val="single" w:color="BBBBBB" w:sz="1"/>
@@ -9049,7 +9049,7 @@
         </w:tc>
         <w:tc>
           <w:tcPr>
-            <w:tcW w:type="dxa" w:w="922"/>
+            <w:tcW w:type="dxa" w:w="914"/>
             <w:tcBorders>
               <w:top w:val="single" w:color="BBBBBB" w:sz="1"/>
               <w:left w:val="single" w:color="BBBBBB" w:sz="1"/>
@@ -9071,7 +9071,7 @@
         </w:tc>
         <w:tc>
           <w:tcPr>
-            <w:tcW w:type="dxa" w:w="1006"/>
+            <w:tcW w:type="dxa" w:w="996"/>
             <w:tcBorders>
               <w:top w:val="single" w:color="BBBBBB" w:sz="1"/>
               <w:left w:val="single" w:color="BBBBBB" w:sz="1"/>
@@ -9093,23 +9093,23 @@
         </w:tc>
         <w:tc>
           <w:tcPr>
-            <w:tcW w:type="dxa" w:w="5014"/>
-            <w:tcBorders>
-              <w:top w:val="single" w:color="BBBBBB" w:sz="1"/>
-              <w:left w:val="single" w:color="BBBBBB" w:sz="1"/>
-              <w:bottom w:val="single" w:color="BBBBBB" w:sz="1"/>
-              <w:right w:val="single" w:color="BBBBBB" w:sz="1"/>
-            </w:tcBorders>
-            <w:tcMar>
-              <w:top w:type="dxa" w:w="60"/>
-              <w:left w:type="dxa" w:w="100"/>
-              <w:bottom w:type="dxa" w:w="60"/>
-              <w:right w:type="dxa" w:w="100"/>
-            </w:tcMar>
-          </w:tcPr>
-          <w:p>
-            <w:r>
-              <w:t xml:space="preserve">未启动</w:t>
+            <w:tcW w:type="dxa" w:w="5040"/>
+            <w:tcBorders>
+              <w:top w:val="single" w:color="BBBBBB" w:sz="1"/>
+              <w:left w:val="single" w:color="BBBBBB" w:sz="1"/>
+              <w:bottom w:val="single" w:color="BBBBBB" w:sz="1"/>
+              <w:right w:val="single" w:color="BBBBBB" w:sz="1"/>
+            </w:tcBorders>
+            <w:tcMar>
+              <w:top w:type="dxa" w:w="60"/>
+              <w:left w:type="dxa" w:w="100"/>
+              <w:bottom w:type="dxa" w:w="60"/>
+              <w:right w:type="dxa" w:w="100"/>
+            </w:tcMar>
+          </w:tcPr>
+          <w:p>
+            <w:r>
+              <w:t xml:space="preserve">已实现（AES-256-CBC+HMAC，密钥自队伍码 PBKDF2 派生；往返/错队拒/篡改拒/固定向量 10 项验收进 CI；待两台真机互通复验）</w:t>
             </w:r>
           </w:p>
         </w:tc>
@@ -9164,7 +9164,7 @@
         </w:tc>
         <w:tc>
           <w:tcPr>
-            <w:tcW w:type="dxa" w:w="922"/>
+            <w:tcW w:type="dxa" w:w="914"/>
             <w:tcBorders>
               <w:top w:val="single" w:color="BBBBBB" w:sz="1"/>
               <w:left w:val="single" w:color="BBBBBB" w:sz="1"/>
@@ -9186,7 +9186,7 @@
         </w:tc>
         <w:tc>
           <w:tcPr>
-            <w:tcW w:type="dxa" w:w="922"/>
+            <w:tcW w:type="dxa" w:w="914"/>
             <w:tcBorders>
               <w:top w:val="single" w:color="BBBBBB" w:sz="1"/>
               <w:left w:val="single" w:color="BBBBBB" w:sz="1"/>
@@ -9208,7 +9208,7 @@
         </w:tc>
         <w:tc>
           <w:tcPr>
-            <w:tcW w:type="dxa" w:w="1006"/>
+            <w:tcW w:type="dxa" w:w="996"/>
             <w:tcBorders>
               <w:top w:val="single" w:color="BBBBBB" w:sz="1"/>
               <w:left w:val="single" w:color="BBBBBB" w:sz="1"/>
@@ -9230,7 +9230,7 @@
         </w:tc>
         <w:tc>
           <w:tcPr>
-            <w:tcW w:type="dxa" w:w="5014"/>
+            <w:tcW w:type="dxa" w:w="5040"/>
             <w:tcBorders>
               <w:top w:val="single" w:color="BBBBBB" w:sz="1"/>
               <w:left w:val="single" w:color="BBBBBB" w:sz="1"/>
@@ -9301,7 +9301,7 @@
         </w:tc>
         <w:tc>
           <w:tcPr>
-            <w:tcW w:type="dxa" w:w="922"/>
+            <w:tcW w:type="dxa" w:w="914"/>
             <w:tcBorders>
               <w:top w:val="single" w:color="BBBBBB" w:sz="1"/>
               <w:left w:val="single" w:color="BBBBBB" w:sz="1"/>
@@ -9323,7 +9323,7 @@
         </w:tc>
         <w:tc>
           <w:tcPr>
-            <w:tcW w:type="dxa" w:w="922"/>
+            <w:tcW w:type="dxa" w:w="914"/>
             <w:tcBorders>
               <w:top w:val="single" w:color="BBBBBB" w:sz="1"/>
               <w:left w:val="single" w:color="BBBBBB" w:sz="1"/>
@@ -9345,7 +9345,7 @@
         </w:tc>
         <w:tc>
           <w:tcPr>
-            <w:tcW w:type="dxa" w:w="1006"/>
+            <w:tcW w:type="dxa" w:w="996"/>
             <w:tcBorders>
               <w:top w:val="single" w:color="BBBBBB" w:sz="1"/>
               <w:left w:val="single" w:color="BBBBBB" w:sz="1"/>
@@ -9367,7 +9367,7 @@
         </w:tc>
         <w:tc>
           <w:tcPr>
-            <w:tcW w:type="dxa" w:w="5014"/>
+            <w:tcW w:type="dxa" w:w="5040"/>
             <w:tcBorders>
               <w:top w:val="single" w:color="BBBBBB" w:sz="1"/>
               <w:left w:val="single" w:color="BBBBBB" w:sz="1"/>
@@ -9438,7 +9438,7 @@
         </w:tc>
         <w:tc>
           <w:tcPr>
-            <w:tcW w:type="dxa" w:w="922"/>
+            <w:tcW w:type="dxa" w:w="914"/>
             <w:tcBorders>
               <w:top w:val="single" w:color="BBBBBB" w:sz="1"/>
               <w:left w:val="single" w:color="BBBBBB" w:sz="1"/>
@@ -9460,7 +9460,7 @@
         </w:tc>
         <w:tc>
           <w:tcPr>
-            <w:tcW w:type="dxa" w:w="922"/>
+            <w:tcW w:type="dxa" w:w="914"/>
             <w:tcBorders>
               <w:top w:val="single" w:color="BBBBBB" w:sz="1"/>
               <w:left w:val="single" w:color="BBBBBB" w:sz="1"/>
@@ -9482,7 +9482,7 @@
         </w:tc>
         <w:tc>
           <w:tcPr>
-            <w:tcW w:type="dxa" w:w="1006"/>
+            <w:tcW w:type="dxa" w:w="996"/>
             <w:tcBorders>
               <w:top w:val="single" w:color="BBBBBB" w:sz="1"/>
               <w:left w:val="single" w:color="BBBBBB" w:sz="1"/>
@@ -9504,7 +9504,7 @@
         </w:tc>
         <w:tc>
           <w:tcPr>
-            <w:tcW w:type="dxa" w:w="5014"/>
+            <w:tcW w:type="dxa" w:w="5040"/>
             <w:tcBorders>
               <w:top w:val="single" w:color="BBBBBB" w:sz="1"/>
               <w:left w:val="single" w:color="BBBBBB" w:sz="1"/>
@@ -9575,7 +9575,7 @@
         </w:tc>
         <w:tc>
           <w:tcPr>
-            <w:tcW w:type="dxa" w:w="922"/>
+            <w:tcW w:type="dxa" w:w="914"/>
             <w:tcBorders>
               <w:top w:val="single" w:color="BBBBBB" w:sz="1"/>
               <w:left w:val="single" w:color="BBBBBB" w:sz="1"/>
@@ -9597,7 +9597,7 @@
         </w:tc>
         <w:tc>
           <w:tcPr>
-            <w:tcW w:type="dxa" w:w="922"/>
+            <w:tcW w:type="dxa" w:w="914"/>
             <w:tcBorders>
               <w:top w:val="single" w:color="BBBBBB" w:sz="1"/>
               <w:left w:val="single" w:color="BBBBBB" w:sz="1"/>
@@ -9619,7 +9619,7 @@
         </w:tc>
         <w:tc>
           <w:tcPr>
-            <w:tcW w:type="dxa" w:w="1006"/>
+            <w:tcW w:type="dxa" w:w="996"/>
             <w:tcBorders>
               <w:top w:val="single" w:color="BBBBBB" w:sz="1"/>
               <w:left w:val="single" w:color="BBBBBB" w:sz="1"/>
@@ -9641,7 +9641,7 @@
         </w:tc>
         <w:tc>
           <w:tcPr>
-            <w:tcW w:type="dxa" w:w="5014"/>
+            <w:tcW w:type="dxa" w:w="5040"/>
             <w:tcBorders>
               <w:top w:val="single" w:color="BBBBBB" w:sz="1"/>
               <w:left w:val="single" w:color="BBBBBB" w:sz="1"/>
@@ -9712,7 +9712,7 @@
         </w:tc>
         <w:tc>
           <w:tcPr>
-            <w:tcW w:type="dxa" w:w="922"/>
+            <w:tcW w:type="dxa" w:w="914"/>
             <w:tcBorders>
               <w:top w:val="single" w:color="BBBBBB" w:sz="1"/>
               <w:left w:val="single" w:color="BBBBBB" w:sz="1"/>
@@ -9734,7 +9734,7 @@
         </w:tc>
         <w:tc>
           <w:tcPr>
-            <w:tcW w:type="dxa" w:w="922"/>
+            <w:tcW w:type="dxa" w:w="914"/>
             <w:tcBorders>
               <w:top w:val="single" w:color="BBBBBB" w:sz="1"/>
               <w:left w:val="single" w:color="BBBBBB" w:sz="1"/>
@@ -9756,7 +9756,7 @@
         </w:tc>
         <w:tc>
           <w:tcPr>
-            <w:tcW w:type="dxa" w:w="1006"/>
+            <w:tcW w:type="dxa" w:w="996"/>
             <w:tcBorders>
               <w:top w:val="single" w:color="BBBBBB" w:sz="1"/>
               <w:left w:val="single" w:color="BBBBBB" w:sz="1"/>
@@ -9778,7 +9778,7 @@
         </w:tc>
         <w:tc>
           <w:tcPr>
-            <w:tcW w:type="dxa" w:w="5014"/>
+            <w:tcW w:type="dxa" w:w="5040"/>
             <w:tcBorders>
               <w:top w:val="single" w:color="BBBBBB" w:sz="1"/>
               <w:left w:val="single" w:color="BBBBBB" w:sz="1"/>
@@ -9849,7 +9849,7 @@
         </w:tc>
         <w:tc>
           <w:tcPr>
-            <w:tcW w:type="dxa" w:w="922"/>
+            <w:tcW w:type="dxa" w:w="914"/>
             <w:tcBorders>
               <w:top w:val="single" w:color="BBBBBB" w:sz="1"/>
               <w:left w:val="single" w:color="BBBBBB" w:sz="1"/>
@@ -9871,7 +9871,7 @@
         </w:tc>
         <w:tc>
           <w:tcPr>
-            <w:tcW w:type="dxa" w:w="922"/>
+            <w:tcW w:type="dxa" w:w="914"/>
             <w:tcBorders>
               <w:top w:val="single" w:color="BBBBBB" w:sz="1"/>
               <w:left w:val="single" w:color="BBBBBB" w:sz="1"/>
@@ -9893,7 +9893,7 @@
         </w:tc>
         <w:tc>
           <w:tcPr>
-            <w:tcW w:type="dxa" w:w="1006"/>
+            <w:tcW w:type="dxa" w:w="996"/>
             <w:tcBorders>
               <w:top w:val="single" w:color="BBBBBB" w:sz="1"/>
               <w:left w:val="single" w:color="BBBBBB" w:sz="1"/>
@@ -9915,7 +9915,7 @@
         </w:tc>
         <w:tc>
           <w:tcPr>
-            <w:tcW w:type="dxa" w:w="5014"/>
+            <w:tcW w:type="dxa" w:w="5040"/>
             <w:tcBorders>
               <w:top w:val="single" w:color="BBBBBB" w:sz="1"/>
               <w:left w:val="single" w:color="BBBBBB" w:sz="1"/>
@@ -9986,7 +9986,7 @@
         </w:tc>
         <w:tc>
           <w:tcPr>
-            <w:tcW w:type="dxa" w:w="922"/>
+            <w:tcW w:type="dxa" w:w="914"/>
             <w:tcBorders>
               <w:top w:val="single" w:color="BBBBBB" w:sz="1"/>
               <w:left w:val="single" w:color="BBBBBB" w:sz="1"/>
@@ -10008,7 +10008,7 @@
         </w:tc>
         <w:tc>
           <w:tcPr>
-            <w:tcW w:type="dxa" w:w="922"/>
+            <w:tcW w:type="dxa" w:w="914"/>
             <w:tcBorders>
               <w:top w:val="single" w:color="BBBBBB" w:sz="1"/>
               <w:left w:val="single" w:color="BBBBBB" w:sz="1"/>
@@ -10030,7 +10030,7 @@
         </w:tc>
         <w:tc>
           <w:tcPr>
-            <w:tcW w:type="dxa" w:w="1006"/>
+            <w:tcW w:type="dxa" w:w="996"/>
             <w:tcBorders>
               <w:top w:val="single" w:color="BBBBBB" w:sz="1"/>
               <w:left w:val="single" w:color="BBBBBB" w:sz="1"/>
@@ -10052,7 +10052,7 @@
         </w:tc>
         <w:tc>
           <w:tcPr>
-            <w:tcW w:type="dxa" w:w="5014"/>
+            <w:tcW w:type="dxa" w:w="5040"/>
             <w:tcBorders>
               <w:top w:val="single" w:color="BBBBBB" w:sz="1"/>
               <w:left w:val="single" w:color="BBBBBB" w:sz="1"/>
@@ -10123,7 +10123,7 @@
         </w:tc>
         <w:tc>
           <w:tcPr>
-            <w:tcW w:type="dxa" w:w="922"/>
+            <w:tcW w:type="dxa" w:w="914"/>
             <w:tcBorders>
               <w:top w:val="single" w:color="BBBBBB" w:sz="1"/>
               <w:left w:val="single" w:color="BBBBBB" w:sz="1"/>
@@ -10145,7 +10145,7 @@
         </w:tc>
         <w:tc>
           <w:tcPr>
-            <w:tcW w:type="dxa" w:w="922"/>
+            <w:tcW w:type="dxa" w:w="914"/>
             <w:tcBorders>
               <w:top w:val="single" w:color="BBBBBB" w:sz="1"/>
               <w:left w:val="single" w:color="BBBBBB" w:sz="1"/>
@@ -10167,7 +10167,7 @@
         </w:tc>
         <w:tc>
           <w:tcPr>
-            <w:tcW w:type="dxa" w:w="1006"/>
+            <w:tcW w:type="dxa" w:w="996"/>
             <w:tcBorders>
               <w:top w:val="single" w:color="BBBBBB" w:sz="1"/>
               <w:left w:val="single" w:color="BBBBBB" w:sz="1"/>
@@ -10189,7 +10189,7 @@
         </w:tc>
         <w:tc>
           <w:tcPr>
-            <w:tcW w:type="dxa" w:w="5014"/>
+            <w:tcW w:type="dxa" w:w="5040"/>
             <w:tcBorders>
               <w:top w:val="single" w:color="BBBBBB" w:sz="1"/>
               <w:left w:val="single" w:color="BBBBBB" w:sz="1"/>
@@ -10260,7 +10260,7 @@
         </w:tc>
         <w:tc>
           <w:tcPr>
-            <w:tcW w:type="dxa" w:w="922"/>
+            <w:tcW w:type="dxa" w:w="914"/>
             <w:tcBorders>
               <w:top w:val="single" w:color="BBBBBB" w:sz="1"/>
               <w:left w:val="single" w:color="BBBBBB" w:sz="1"/>
@@ -10282,7 +10282,7 @@
         </w:tc>
         <w:tc>
           <w:tcPr>
-            <w:tcW w:type="dxa" w:w="922"/>
+            <w:tcW w:type="dxa" w:w="914"/>
             <w:tcBorders>
               <w:top w:val="single" w:color="BBBBBB" w:sz="1"/>
               <w:left w:val="single" w:color="BBBBBB" w:sz="1"/>
@@ -10304,7 +10304,7 @@
         </w:tc>
         <w:tc>
           <w:tcPr>
-            <w:tcW w:type="dxa" w:w="1006"/>
+            <w:tcW w:type="dxa" w:w="996"/>
             <w:tcBorders>
               <w:top w:val="single" w:color="BBBBBB" w:sz="1"/>
               <w:left w:val="single" w:color="BBBBBB" w:sz="1"/>
@@ -10326,7 +10326,7 @@
         </w:tc>
         <w:tc>
           <w:tcPr>
-            <w:tcW w:type="dxa" w:w="5014"/>
+            <w:tcW w:type="dxa" w:w="5040"/>
             <w:tcBorders>
               <w:top w:val="single" w:color="BBBBBB" w:sz="1"/>
               <w:left w:val="single" w:color="BBBBBB" w:sz="1"/>
@@ -10397,7 +10397,7 @@
         </w:tc>
         <w:tc>
           <w:tcPr>
-            <w:tcW w:type="dxa" w:w="922"/>
+            <w:tcW w:type="dxa" w:w="914"/>
             <w:tcBorders>
               <w:top w:val="single" w:color="BBBBBB" w:sz="1"/>
               <w:left w:val="single" w:color="BBBBBB" w:sz="1"/>
@@ -10419,7 +10419,7 @@
         </w:tc>
         <w:tc>
           <w:tcPr>
-            <w:tcW w:type="dxa" w:w="922"/>
+            <w:tcW w:type="dxa" w:w="914"/>
             <w:tcBorders>
               <w:top w:val="single" w:color="BBBBBB" w:sz="1"/>
               <w:left w:val="single" w:color="BBBBBB" w:sz="1"/>
@@ -10441,7 +10441,7 @@
         </w:tc>
         <w:tc>
           <w:tcPr>
-            <w:tcW w:type="dxa" w:w="1006"/>
+            <w:tcW w:type="dxa" w:w="996"/>
             <w:tcBorders>
               <w:top w:val="single" w:color="BBBBBB" w:sz="1"/>
               <w:left w:val="single" w:color="BBBBBB" w:sz="1"/>
@@ -10463,7 +10463,7 @@
         </w:tc>
         <w:tc>
           <w:tcPr>
-            <w:tcW w:type="dxa" w:w="5014"/>
+            <w:tcW w:type="dxa" w:w="5040"/>
             <w:tcBorders>
               <w:top w:val="single" w:color="BBBBBB" w:sz="1"/>
               <w:left w:val="single" w:color="BBBBBB" w:sz="1"/>
@@ -10534,7 +10534,7 @@
         </w:tc>
         <w:tc>
           <w:tcPr>
-            <w:tcW w:type="dxa" w:w="922"/>
+            <w:tcW w:type="dxa" w:w="914"/>
             <w:tcBorders>
               <w:top w:val="single" w:color="BBBBBB" w:sz="1"/>
               <w:left w:val="single" w:color="BBBBBB" w:sz="1"/>
@@ -10556,7 +10556,7 @@
         </w:tc>
         <w:tc>
           <w:tcPr>
-            <w:tcW w:type="dxa" w:w="922"/>
+            <w:tcW w:type="dxa" w:w="914"/>
             <w:tcBorders>
               <w:top w:val="single" w:color="BBBBBB" w:sz="1"/>
               <w:left w:val="single" w:color="BBBBBB" w:sz="1"/>
@@ -10578,7 +10578,7 @@
         </w:tc>
         <w:tc>
           <w:tcPr>
-            <w:tcW w:type="dxa" w:w="1006"/>
+            <w:tcW w:type="dxa" w:w="996"/>
             <w:tcBorders>
               <w:top w:val="single" w:color="BBBBBB" w:sz="1"/>
               <w:left w:val="single" w:color="BBBBBB" w:sz="1"/>
@@ -10600,7 +10600,7 @@
         </w:tc>
         <w:tc>
           <w:tcPr>
-            <w:tcW w:type="dxa" w:w="5014"/>
+            <w:tcW w:type="dxa" w:w="5040"/>
             <w:tcBorders>
               <w:top w:val="single" w:color="BBBBBB" w:sz="1"/>
               <w:left w:val="single" w:color="BBBBBB" w:sz="1"/>
@@ -10671,7 +10671,7 @@
         </w:tc>
         <w:tc>
           <w:tcPr>
-            <w:tcW w:type="dxa" w:w="922"/>
+            <w:tcW w:type="dxa" w:w="914"/>
             <w:tcBorders>
               <w:top w:val="single" w:color="BBBBBB" w:sz="1"/>
               <w:left w:val="single" w:color="BBBBBB" w:sz="1"/>
@@ -10693,7 +10693,7 @@
         </w:tc>
         <w:tc>
           <w:tcPr>
-            <w:tcW w:type="dxa" w:w="922"/>
+            <w:tcW w:type="dxa" w:w="914"/>
             <w:tcBorders>
               <w:top w:val="single" w:color="BBBBBB" w:sz="1"/>
               <w:left w:val="single" w:color="BBBBBB" w:sz="1"/>
@@ -10715,7 +10715,7 @@
         </w:tc>
         <w:tc>
           <w:tcPr>
-            <w:tcW w:type="dxa" w:w="1006"/>
+            <w:tcW w:type="dxa" w:w="996"/>
             <w:tcBorders>
               <w:top w:val="single" w:color="BBBBBB" w:sz="1"/>
               <w:left w:val="single" w:color="BBBBBB" w:sz="1"/>
@@ -10737,7 +10737,7 @@
         </w:tc>
         <w:tc>
           <w:tcPr>
-            <w:tcW w:type="dxa" w:w="5014"/>
+            <w:tcW w:type="dxa" w:w="5040"/>
             <w:tcBorders>
               <w:top w:val="single" w:color="BBBBBB" w:sz="1"/>
               <w:left w:val="single" w:color="BBBBBB" w:sz="1"/>
@@ -10808,7 +10808,7 @@
         </w:tc>
         <w:tc>
           <w:tcPr>
-            <w:tcW w:type="dxa" w:w="922"/>
+            <w:tcW w:type="dxa" w:w="914"/>
             <w:tcBorders>
               <w:top w:val="single" w:color="BBBBBB" w:sz="1"/>
               <w:left w:val="single" w:color="BBBBBB" w:sz="1"/>
@@ -10830,7 +10830,7 @@
         </w:tc>
         <w:tc>
           <w:tcPr>
-            <w:tcW w:type="dxa" w:w="922"/>
+            <w:tcW w:type="dxa" w:w="914"/>
             <w:tcBorders>
               <w:top w:val="single" w:color="BBBBBB" w:sz="1"/>
               <w:left w:val="single" w:color="BBBBBB" w:sz="1"/>
@@ -10852,7 +10852,7 @@
         </w:tc>
         <w:tc>
           <w:tcPr>
-            <w:tcW w:type="dxa" w:w="1006"/>
+            <w:tcW w:type="dxa" w:w="996"/>
             <w:tcBorders>
               <w:top w:val="single" w:color="BBBBBB" w:sz="1"/>
               <w:left w:val="single" w:color="BBBBBB" w:sz="1"/>
@@ -10874,7 +10874,7 @@
         </w:tc>
         <w:tc>
           <w:tcPr>
-            <w:tcW w:type="dxa" w:w="5014"/>
+            <w:tcW w:type="dxa" w:w="5040"/>
             <w:tcBorders>
               <w:top w:val="single" w:color="BBBBBB" w:sz="1"/>
               <w:left w:val="single" w:color="BBBBBB" w:sz="1"/>
@@ -10945,7 +10945,7 @@
         </w:tc>
         <w:tc>
           <w:tcPr>
-            <w:tcW w:type="dxa" w:w="922"/>
+            <w:tcW w:type="dxa" w:w="914"/>
             <w:tcBorders>
               <w:top w:val="single" w:color="BBBBBB" w:sz="1"/>
               <w:left w:val="single" w:color="BBBBBB" w:sz="1"/>
@@ -10967,7 +10967,7 @@
         </w:tc>
         <w:tc>
           <w:tcPr>
-            <w:tcW w:type="dxa" w:w="922"/>
+            <w:tcW w:type="dxa" w:w="914"/>
             <w:tcBorders>
               <w:top w:val="single" w:color="BBBBBB" w:sz="1"/>
               <w:left w:val="single" w:color="BBBBBB" w:sz="1"/>
@@ -10989,7 +10989,7 @@
         </w:tc>
         <w:tc>
           <w:tcPr>
-            <w:tcW w:type="dxa" w:w="1006"/>
+            <w:tcW w:type="dxa" w:w="996"/>
             <w:tcBorders>
               <w:top w:val="single" w:color="BBBBBB" w:sz="1"/>
               <w:left w:val="single" w:color="BBBBBB" w:sz="1"/>
@@ -11011,7 +11011,7 @@
         </w:tc>
         <w:tc>
           <w:tcPr>
-            <w:tcW w:type="dxa" w:w="5014"/>
+            <w:tcW w:type="dxa" w:w="5040"/>
             <w:tcBorders>
               <w:top w:val="single" w:color="BBBBBB" w:sz="1"/>
               <w:left w:val="single" w:color="BBBBBB" w:sz="1"/>
@@ -11082,7 +11082,7 @@
         </w:tc>
         <w:tc>
           <w:tcPr>
-            <w:tcW w:type="dxa" w:w="922"/>
+            <w:tcW w:type="dxa" w:w="914"/>
             <w:tcBorders>
               <w:top w:val="single" w:color="BBBBBB" w:sz="1"/>
               <w:left w:val="single" w:color="BBBBBB" w:sz="1"/>
@@ -11104,7 +11104,7 @@
         </w:tc>
         <w:tc>
           <w:tcPr>
-            <w:tcW w:type="dxa" w:w="922"/>
+            <w:tcW w:type="dxa" w:w="914"/>
             <w:tcBorders>
               <w:top w:val="single" w:color="BBBBBB" w:sz="1"/>
               <w:left w:val="single" w:color="BBBBBB" w:sz="1"/>
@@ -11126,7 +11126,7 @@
         </w:tc>
         <w:tc>
           <w:tcPr>
-            <w:tcW w:type="dxa" w:w="1006"/>
+            <w:tcW w:type="dxa" w:w="996"/>
             <w:tcBorders>
               <w:top w:val="single" w:color="BBBBBB" w:sz="1"/>
               <w:left w:val="single" w:color="BBBBBB" w:sz="1"/>
@@ -11148,7 +11148,7 @@
         </w:tc>
         <w:tc>
           <w:tcPr>
-            <w:tcW w:type="dxa" w:w="5014"/>
+            <w:tcW w:type="dxa" w:w="5040"/>
             <w:tcBorders>
               <w:top w:val="single" w:color="BBBBBB" w:sz="1"/>
               <w:left w:val="single" w:color="BBBBBB" w:sz="1"/>
@@ -11219,7 +11219,7 @@
         </w:tc>
         <w:tc>
           <w:tcPr>
-            <w:tcW w:type="dxa" w:w="922"/>
+            <w:tcW w:type="dxa" w:w="914"/>
             <w:tcBorders>
               <w:top w:val="single" w:color="BBBBBB" w:sz="1"/>
               <w:left w:val="single" w:color="BBBBBB" w:sz="1"/>
@@ -11241,7 +11241,7 @@
         </w:tc>
         <w:tc>
           <w:tcPr>
-            <w:tcW w:type="dxa" w:w="922"/>
+            <w:tcW w:type="dxa" w:w="914"/>
             <w:tcBorders>
               <w:top w:val="single" w:color="BBBBBB" w:sz="1"/>
               <w:left w:val="single" w:color="BBBBBB" w:sz="1"/>
@@ -11263,7 +11263,7 @@
         </w:tc>
         <w:tc>
           <w:tcPr>
-            <w:tcW w:type="dxa" w:w="1006"/>
+            <w:tcW w:type="dxa" w:w="996"/>
             <w:tcBorders>
               <w:top w:val="single" w:color="BBBBBB" w:sz="1"/>
               <w:left w:val="single" w:color="BBBBBB" w:sz="1"/>
@@ -11285,7 +11285,7 @@
         </w:tc>
         <w:tc>
           <w:tcPr>
-            <w:tcW w:type="dxa" w:w="5014"/>
+            <w:tcW w:type="dxa" w:w="5040"/>
             <w:tcBorders>
               <w:top w:val="single" w:color="BBBBBB" w:sz="1"/>
               <w:left w:val="single" w:color="BBBBBB" w:sz="1"/>
@@ -11356,7 +11356,7 @@
         </w:tc>
         <w:tc>
           <w:tcPr>
-            <w:tcW w:type="dxa" w:w="922"/>
+            <w:tcW w:type="dxa" w:w="914"/>
             <w:tcBorders>
               <w:top w:val="single" w:color="BBBBBB" w:sz="1"/>
               <w:left w:val="single" w:color="BBBBBB" w:sz="1"/>
@@ -11378,7 +11378,7 @@
         </w:tc>
         <w:tc>
           <w:tcPr>
-            <w:tcW w:type="dxa" w:w="922"/>
+            <w:tcW w:type="dxa" w:w="914"/>
             <w:tcBorders>
               <w:top w:val="single" w:color="BBBBBB" w:sz="1"/>
               <w:left w:val="single" w:color="BBBBBB" w:sz="1"/>
@@ -11400,7 +11400,7 @@
         </w:tc>
         <w:tc>
           <w:tcPr>
-            <w:tcW w:type="dxa" w:w="1006"/>
+            <w:tcW w:type="dxa" w:w="996"/>
             <w:tcBorders>
               <w:top w:val="single" w:color="BBBBBB" w:sz="1"/>
               <w:left w:val="single" w:color="BBBBBB" w:sz="1"/>
@@ -11422,7 +11422,7 @@
         </w:tc>
         <w:tc>
           <w:tcPr>
-            <w:tcW w:type="dxa" w:w="5014"/>
+            <w:tcW w:type="dxa" w:w="5040"/>
             <w:tcBorders>
               <w:top w:val="single" w:color="BBBBBB" w:sz="1"/>
               <w:left w:val="single" w:color="BBBBBB" w:sz="1"/>

</xml_diff>

<commit_message>
feat: E2 — BLE short-voice messages + Android voice presets (G-CM-1, G-VC-1)
Camp short voice (closes the L1 claim/implementation gap two ways):
- iOS & Android: hold 🎤 to record ≤10s AAC (16kHz mono 24kbps, ≤40KB
  guard), broadcast as KIND_VOICE=3 payload [u16 jsonLen][meta][m4a] —
  E2E-encrypted like all MeshBus traffic; receivers tap the message
  row to play. No-neighbor sends surface the same delivery warning.
- Video is now explicitly online-only: web camp copy narrowed.

Android voice changer: presets grow 6→9, aligned with iOS (adds 佩奇
1.7, 悟空 1.25, 机器人 via 40Hz PCM ring modulation).

Fixture grows to 37 assertions: voice payload format roundtrip, 9KB
(51-chunk) payload relayed intact through a middle node, kindVoice=3
dual-platform drift check.
</commit_message>
<xml_diff>
--- a/docs/requirements/TrailMate-Gap分析与演进规划-v1.0.docx
+++ b/docs/requirements/TrailMate-Gap分析与演进规划-v1.0.docx
@@ -8835,7 +8835,7 @@
           </w:tcPr>
           <w:p>
             <w:r>
-              <w:t xml:space="preserve">未启动</w:t>
+              <w:t xml:space="preserve">已实现（短语音 ≤10s over BLE 双端落地 + 视频收窄为仅在线；夹具 9KB 中继送达验收过，待真机录发验收）</w:t>
             </w:r>
           </w:p>
         </w:tc>
@@ -10068,7 +10068,7 @@
           </w:tcPr>
           <w:p>
             <w:r>
-              <w:t xml:space="preserve">未启动</w:t>
+              <w:t xml:space="preserve">已实现（Android 补齐佩奇/悟空/机器人，9 预设与 iOS 对齐；机器人=40Hz 环形调制）</w:t>
             </w:r>
           </w:p>
         </w:tc>

</xml_diff>

<commit_message>
feat: E2 complete — peer presence + Android receipt OCR (G-DR-2, G-LG-3)
Peer presence (both native ends): convoy markers fade to 45% alpha
after 15s without a location update and are removed after 60s —
Android checks on the 3s broadcast tick, iOS on a 5s timer; fresh
updates restore full opacity.

Android receipt OCR: 记一笔 gains a 选小票照片识别金额 button — ML Kit
text recognition (bundled model, fully offline, no GMS needed) parses
the photo and prefills the largest amount-looking number, mirroring
the iOS/web heuristic.
</commit_message>
<xml_diff>
--- a/docs/requirements/TrailMate-Gap分析与演进规划-v1.0.docx
+++ b/docs/requirements/TrailMate-Gap分析与演进规划-v1.0.docx
@@ -9383,7 +9383,7 @@
           </w:tcPr>
           <w:p>
             <w:r>
-              <w:t xml:space="preserve">未启动</w:t>
+              <w:t xml:space="preserve">已实现（双端：15s 未更新标记变淡、60s 移除；待真机拔电验收）</w:t>
             </w:r>
           </w:p>
         </w:tc>
@@ -9931,7 +9931,7 @@
           </w:tcPr>
           <w:p>
             <w:r>
-              <w:t xml:space="preserve">未启动</w:t>
+              <w:t xml:space="preserve">已实现（ML Kit 离线识别，选小票照片自动填最大金额；待真机拍票验收）</w:t>
             </w:r>
           </w:p>
         </w:tc>

</xml_diff>

<commit_message>
feat: E3 polish — ghost mode, duration-preserving voice, scan duty cycle, unified codes
- G-DR-3: 隐身 toggle on both convoy maps — stops broadcasting own
  location, amber banner states it; persisted flag
- G-VC-2: Android voice changer now pitch-shifts while preserving
  duration (linear resample + Hann-window OLA stretch back), matching
  the iOS TimePitch feel; ring-mod robot unchanged
- G-ENG-2: Android BLE scanner duty-cycles once ≥1 peer is connected
  (8s on / 16s off, continuous scan while alone) — roughly 1/3 scan
  power with new-neighbor discovery preserved
- G-PF-1: web joinCode now uses the native 6-char confusion-free
  charset; fixture asserts three-way charset parity (38 assertions)
</commit_message>
<xml_diff>
--- a/docs/requirements/TrailMate-Gap分析与演进规划-v1.0.docx
+++ b/docs/requirements/TrailMate-Gap分析与演进规划-v1.0.docx
@@ -9520,7 +9520,7 @@
           </w:tcPr>
           <w:p>
             <w:r>
-              <w:t xml:space="preserve">未启动</w:t>
+              <w:t xml:space="preserve">已实现（双端跟车页隐身开关，开启即停止广播并横幅提示）</w:t>
             </w:r>
           </w:p>
         </w:tc>
@@ -10205,7 +10205,7 @@
           </w:tcPr>
           <w:p>
             <w:r>
-              <w:t xml:space="preserve">未启动</w:t>
+              <w:t xml:space="preserve">已实现（重采样+OLA 保时长变调，与 iOS 听感对齐；待真机听感验收）</w:t>
             </w:r>
           </w:p>
         </w:tc>
@@ -10479,7 +10479,7 @@
           </w:tcPr>
           <w:p>
             <w:r>
-              <w:t xml:space="preserve">未启动</w:t>
+              <w:t xml:space="preserve">已实现（Web 群组码改用原生同字符集 6 位码，夹具三端防漂移）</w:t>
             </w:r>
           </w:p>
         </w:tc>
@@ -11301,7 +11301,7 @@
           </w:tcPr>
           <w:p>
             <w:r>
-              <w:t xml:space="preserve">未启动</w:t>
+              <w:t xml:space="preserve">已实现（Android 扫描占空比：无邻居持续扫、有连接 8s 扫/16s 停；iOS 由系统管理）</w:t>
             </w:r>
           </w:p>
         </w:tc>

</xml_diff>